<commit_message>
Turbo CREXX for Debian (crexx driver) and CMS (TURBO EXEC); CMS deck with Lisp, Smalltalk (lib folded to 80), PL/M; cmsrt cuts names to 8; guide revised; backlog: Docker, SMAPI, THE
Co-Authored-By: Claude Opus 5.5 <noreply@anthropic.com>
Claude-Session: https://claude.ai/code/session_01JBNU8KnKzXkgscse8vw6so
</commit_message>
<xml_diff>
--- a/arch/31bit/manual/VM370PLUS-Guide.docx
+++ b/arch/31bit/manual/VM370PLUS-Guide.docx
@@ -72,7 +72,7 @@
           <w:sz w:val="24"/>
           <w:szCs w:val="24"/>
         </w:rPr>
-        <w:t xml:space="preserve">Release 1  •  Kit Build 5</w:t>
+        <w:t xml:space="preserve">Release 1  •  Kit Build 5, updated 10 October 2026</w:t>
       </w:r>
     </w:p>
     <w:p>
@@ -125,7 +125,7 @@
           <w:sz w:val="24"/>
           <w:szCs w:val="24"/>
         </w:rPr>
-        <w:t xml:space="preserve">First Edition (October 2026)</w:t>
+        <w:t xml:space="preserve">First Edition, revised (October 2026)</w:t>
       </w:r>
     </w:p>
     <w:p>
@@ -450,7 +450,7 @@
           <w:sz w:val="20"/>
           <w:szCs w:val="20"/>
         </w:rPr>
-        <w:t xml:space="preserve">	4</w:t>
+        <w:t xml:space="preserve">	5</w:t>
       </w:r>
     </w:p>
     <w:p>
@@ -1096,6 +1096,64 @@
         <w:tabs>
           <w:tab w:val="right" w:pos="9638" w:leader="dot"/>
         </w:tabs>
+        <w:spacing w:after="20" w:before="20"/>
+        <w:ind w:left="400"/>
+      </w:pPr>
+      <w:r>
+        <w:rPr>
+          <w:rFonts w:ascii="Times New Roman" w:cs="Times New Roman" w:eastAsia="Times New Roman" w:hAnsi="Times New Roman"/>
+          <w:b w:val="false"/>
+          <w:bCs w:val="false"/>
+          <w:sz w:val="20"/>
+          <w:szCs w:val="20"/>
+        </w:rPr>
+        <w:t xml:space="preserve">Languages written in cREXX</w:t>
+      </w:r>
+      <w:r>
+        <w:rPr>
+          <w:rFonts w:ascii="Times New Roman" w:cs="Times New Roman" w:eastAsia="Times New Roman" w:hAnsi="Times New Roman"/>
+          <w:b w:val="false"/>
+          <w:bCs w:val="false"/>
+          <w:sz w:val="20"/>
+          <w:szCs w:val="20"/>
+        </w:rPr>
+        <w:t xml:space="preserve">	14</w:t>
+      </w:r>
+    </w:p>
+    <w:p>
+      <w:pPr>
+        <w:tabs>
+          <w:tab w:val="right" w:pos="9638" w:leader="dot"/>
+        </w:tabs>
+        <w:spacing w:after="20" w:before="20"/>
+        <w:ind w:left="400"/>
+      </w:pPr>
+      <w:r>
+        <w:rPr>
+          <w:rFonts w:ascii="Times New Roman" w:cs="Times New Roman" w:eastAsia="Times New Roman" w:hAnsi="Times New Roman"/>
+          <w:b w:val="false"/>
+          <w:bCs w:val="false"/>
+          <w:sz w:val="20"/>
+          <w:szCs w:val="20"/>
+        </w:rPr>
+        <w:t xml:space="preserve">Turbo CREXX</w:t>
+      </w:r>
+      <w:r>
+        <w:rPr>
+          <w:rFonts w:ascii="Times New Roman" w:cs="Times New Roman" w:eastAsia="Times New Roman" w:hAnsi="Times New Roman"/>
+          <w:b w:val="false"/>
+          <w:bCs w:val="false"/>
+          <w:sz w:val="20"/>
+          <w:szCs w:val="20"/>
+        </w:rPr>
+        <w:t xml:space="preserve">	14</w:t>
+      </w:r>
+    </w:p>
+    <w:p>
+      <w:pPr>
+        <w:tabs>
+          <w:tab w:val="right" w:pos="9638" w:leader="dot"/>
+        </w:tabs>
         <w:spacing w:after="20" w:before="160"/>
         <w:ind w:left="0"/>
       </w:pPr>
@@ -1117,7 +1175,7 @@
           <w:sz w:val="21"/>
           <w:szCs w:val="21"/>
         </w:rPr>
-        <w:t xml:space="preserve">	14</w:t>
+        <w:t xml:space="preserve">	16</w:t>
       </w:r>
     </w:p>
     <w:p>
@@ -1146,7 +1204,7 @@
           <w:sz w:val="21"/>
           <w:szCs w:val="21"/>
         </w:rPr>
-        <w:t xml:space="preserve">	15</w:t>
+        <w:t xml:space="preserve">	17</w:t>
       </w:r>
     </w:p>
     <w:p>
@@ -1175,7 +1233,7 @@
           <w:sz w:val="20"/>
           <w:szCs w:val="20"/>
         </w:rPr>
-        <w:t xml:space="preserve">	15</w:t>
+        <w:t xml:space="preserve">	17</w:t>
       </w:r>
     </w:p>
     <w:p>
@@ -1204,7 +1262,7 @@
           <w:sz w:val="20"/>
           <w:szCs w:val="20"/>
         </w:rPr>
-        <w:t xml:space="preserve">	15</w:t>
+        <w:t xml:space="preserve">	17</w:t>
       </w:r>
     </w:p>
     <w:p>
@@ -1233,7 +1291,7 @@
           <w:sz w:val="20"/>
           <w:szCs w:val="20"/>
         </w:rPr>
-        <w:t xml:space="preserve">	15</w:t>
+        <w:t xml:space="preserve">	17</w:t>
       </w:r>
     </w:p>
     <w:p>
@@ -1262,7 +1320,7 @@
           <w:sz w:val="21"/>
           <w:szCs w:val="21"/>
         </w:rPr>
-        <w:t xml:space="preserve">	16</w:t>
+        <w:t xml:space="preserve">	18</w:t>
       </w:r>
     </w:p>
     <w:p>
@@ -1291,7 +1349,7 @@
           <w:sz w:val="21"/>
           <w:szCs w:val="21"/>
         </w:rPr>
-        <w:t xml:space="preserve">	17</w:t>
+        <w:t xml:space="preserve">	19</w:t>
       </w:r>
     </w:p>
     <w:p>
@@ -1484,7 +1542,7 @@
         <w:rPr>
           <w:rFonts w:ascii="Times New Roman" w:cs="Times New Roman" w:eastAsia="Times New Roman" w:hAnsi="Times New Roman"/>
         </w:rPr>
-        <w:t xml:space="preserve">, describes the REXX compiler and virtual machine built for and on VM/370+.</w:t>
+        <w:t xml:space="preserve">, describes the REXX compiler and virtual machine built for and on VM/370+, the languages written in cREXX that run on CMS and on Linux, and Turbo CREXX.</w:t>
       </w:r>
     </w:p>
     <w:p>
@@ -1594,6 +1652,73 @@
           <w:rFonts w:ascii="Times New Roman" w:cs="Times New Roman" w:eastAsia="Times New Roman" w:hAnsi="Times New Roman"/>
         </w:rPr>
         <w:t xml:space="preserve">. In command descriptions, uppercase letters are typed as shown and lowercase words stand for values you supply. Examples of terminal sessions are shown in framed figures; lines you type are not marked separately because the context makes clear which they are.</w:t>
+      </w:r>
+    </w:p>
+    <w:p>
+      <w:pPr>
+        <w:pStyle w:val="Heading3"/>
+      </w:pPr>
+      <w:r>
+        <w:t xml:space="preserve">Summary of changes</w:t>
+      </w:r>
+    </w:p>
+    <w:p>
+      <w:pPr>
+        <w:spacing w:after="120"/>
+      </w:pPr>
+      <w:r>
+        <w:rPr>
+          <w:rFonts w:ascii="Times New Roman" w:cs="Times New Roman" w:eastAsia="Times New Roman" w:hAnsi="Times New Roman"/>
+        </w:rPr>
+        <w:t xml:space="preserve">This edition is kept up to date as VM/370+ grows; each change is listed here, newest first.</w:t>
+      </w:r>
+    </w:p>
+    <w:p>
+      <w:pPr>
+        <w:pStyle w:val="ListParagraph"/>
+        <w:numPr>
+          <w:ilvl w:val="0"/>
+          <w:numId w:val="2"/>
+        </w:numPr>
+        <w:spacing w:after="60"/>
+      </w:pPr>
+      <w:r>
+        <w:rPr>
+          <w:rFonts w:ascii="Times New Roman" w:cs="Times New Roman" w:eastAsia="Times New Roman" w:hAnsi="Times New Roman"/>
+          <w:b/>
+          <w:bCs/>
+        </w:rPr>
+        <w:t xml:space="preserve">10 October 2026.</w:t>
+      </w:r>
+      <w:r>
+        <w:rPr>
+          <w:rFonts w:ascii="Times New Roman" w:cs="Times New Roman" w:eastAsia="Times New Roman" w:hAnsi="Times New Roman"/>
+        </w:rPr>
+        <w:t xml:space="preserve"> Languages written in cREXX for CMS and Linux (BASIC, SNOBOL4, Pascal, Lisp, Smalltalk, PL/M, Prolog, LOGO); Turbo CREXX on both; four more minidisks for CMSUSER (196–199); the native build of the current cREXX (M8.2); Python and GNU C under Debian; milestones brought up to date.</w:t>
+      </w:r>
+    </w:p>
+    <w:p>
+      <w:pPr>
+        <w:pStyle w:val="ListParagraph"/>
+        <w:numPr>
+          <w:ilvl w:val="0"/>
+          <w:numId w:val="2"/>
+        </w:numPr>
+        <w:spacing w:after="60"/>
+      </w:pPr>
+      <w:r>
+        <w:rPr>
+          <w:rFonts w:ascii="Times New Roman" w:cs="Times New Roman" w:eastAsia="Times New Roman" w:hAnsi="Times New Roman"/>
+          <w:b/>
+          <w:bCs/>
+        </w:rPr>
+        <w:t xml:space="preserve">9 October 2026.</w:t>
+      </w:r>
+      <w:r>
+        <w:rPr>
+          <w:rFonts w:ascii="Times New Roman" w:cs="Times New Roman" w:eastAsia="Times New Roman" w:hAnsi="Times New Roman"/>
+        </w:rPr>
+        <w:t xml:space="preserve"> First edition, for kit build 5.</w:t>
       </w:r>
     </w:p>
     <w:p>
@@ -2667,7 +2792,7 @@
                 <w:sz w:val="19"/>
                 <w:szCs w:val="19"/>
               </w:rPr>
-              <w:t xml:space="preserve">M8</w:t>
+              <w:t xml:space="preserve">M7.10</w:t>
             </w:r>
           </w:p>
         </w:tc>
@@ -2688,7 +2813,7 @@
                 <w:sz w:val="19"/>
                 <w:szCs w:val="19"/>
               </w:rPr>
-              <w:t xml:space="preserve">cREXX: 2022 release built natively; current release cross-built</w:t>
+              <w:t xml:space="preserve">IPL of Linux from its disk (zipl) and a CP name LINUX</w:t>
             </w:r>
           </w:p>
         </w:tc>
@@ -2709,7 +2834,7 @@
                 <w:sz w:val="19"/>
                 <w:szCs w:val="19"/>
               </w:rPr>
-              <w:t xml:space="preserve">native build of the current release pending</w:t>
+              <w:t xml:space="preserve">next</w:t>
             </w:r>
           </w:p>
         </w:tc>
@@ -2736,6 +2861,144 @@
                 <w:sz w:val="19"/>
                 <w:szCs w:val="19"/>
               </w:rPr>
+              <w:t xml:space="preserve">M8</w:t>
+            </w:r>
+          </w:p>
+        </w:tc>
+        <w:tc>
+          <w:tcPr>
+            <w:tcW w:type="dxa" w:w="6038"/>
+            <w:tcMar>
+              <w:top w:type="dxa" w:w="60"/>
+              <w:left w:type="dxa" w:w="100"/>
+              <w:bottom w:type="dxa" w:w="60"/>
+              <w:right w:type="dxa" w:w="100"/>
+            </w:tcMar>
+          </w:tcPr>
+          <w:p>
+            <w:r>
+              <w:rPr>
+                <w:rFonts w:ascii="Times New Roman" w:cs="Times New Roman" w:eastAsia="Times New Roman" w:hAnsi="Times New Roman"/>
+                <w:sz w:val="19"/>
+                <w:szCs w:val="19"/>
+              </w:rPr>
+              <w:t xml:space="preserve">cREXX: the 2022 release built natively (M5); the current release cross-built (M8.1)</w:t>
+            </w:r>
+          </w:p>
+        </w:tc>
+        <w:tc>
+          <w:tcPr>
+            <w:tcW w:type="dxa" w:w="2200"/>
+            <w:tcMar>
+              <w:top w:type="dxa" w:w="60"/>
+              <w:left w:type="dxa" w:w="100"/>
+              <w:bottom w:type="dxa" w:w="60"/>
+              <w:right w:type="dxa" w:w="100"/>
+            </w:tcMar>
+          </w:tcPr>
+          <w:p>
+            <w:r>
+              <w:rPr>
+                <w:rFonts w:ascii="Times New Roman" w:cs="Times New Roman" w:eastAsia="Times New Roman" w:hAnsi="Times New Roman"/>
+                <w:sz w:val="19"/>
+                <w:szCs w:val="19"/>
+              </w:rPr>
+              <w:t xml:space="preserve">complete</w:t>
+            </w:r>
+          </w:p>
+        </w:tc>
+      </w:tr>
+      <w:tr>
+        <w:trPr>
+          <w:cantSplit/>
+          <w:tblHeader w:val="false"/>
+        </w:trPr>
+        <w:tc>
+          <w:tcPr>
+            <w:tcW w:type="dxa" w:w="1400"/>
+            <w:tcMar>
+              <w:top w:type="dxa" w:w="60"/>
+              <w:left w:type="dxa" w:w="100"/>
+              <w:bottom w:type="dxa" w:w="60"/>
+              <w:right w:type="dxa" w:w="100"/>
+            </w:tcMar>
+          </w:tcPr>
+          <w:p>
+            <w:r>
+              <w:rPr>
+                <w:rFonts w:ascii="Times New Roman" w:cs="Times New Roman" w:eastAsia="Times New Roman" w:hAnsi="Times New Roman"/>
+                <w:sz w:val="19"/>
+                <w:szCs w:val="19"/>
+              </w:rPr>
+              <w:t xml:space="preserve">M8.2</w:t>
+            </w:r>
+          </w:p>
+        </w:tc>
+        <w:tc>
+          <w:tcPr>
+            <w:tcW w:type="dxa" w:w="6038"/>
+            <w:tcMar>
+              <w:top w:type="dxa" w:w="60"/>
+              <w:left w:type="dxa" w:w="100"/>
+              <w:bottom w:type="dxa" w:w="60"/>
+              <w:right w:type="dxa" w:w="100"/>
+            </w:tcMar>
+          </w:tcPr>
+          <w:p>
+            <w:r>
+              <w:rPr>
+                <w:rFonts w:ascii="Times New Roman" w:cs="Times New Roman" w:eastAsia="Times New Roman" w:hAnsi="Times New Roman"/>
+                <w:sz w:val="19"/>
+                <w:szCs w:val="19"/>
+              </w:rPr>
+              <w:t xml:space="preserve">the current cREXX built natively with GCC380</w:t>
+            </w:r>
+          </w:p>
+        </w:tc>
+        <w:tc>
+          <w:tcPr>
+            <w:tcW w:type="dxa" w:w="2200"/>
+            <w:tcMar>
+              <w:top w:type="dxa" w:w="60"/>
+              <w:left w:type="dxa" w:w="100"/>
+              <w:bottom w:type="dxa" w:w="60"/>
+              <w:right w:type="dxa" w:w="100"/>
+            </w:tcMar>
+          </w:tcPr>
+          <w:p>
+            <w:r>
+              <w:rPr>
+                <w:rFonts w:ascii="Times New Roman" w:cs="Times New Roman" w:eastAsia="Times New Roman" w:hAnsi="Times New Roman"/>
+                <w:sz w:val="19"/>
+                <w:szCs w:val="19"/>
+              </w:rPr>
+              <w:t xml:space="preserve">compiler, assembler and VM work; the library does not build yet</w:t>
+            </w:r>
+          </w:p>
+        </w:tc>
+      </w:tr>
+      <w:tr>
+        <w:trPr>
+          <w:cantSplit/>
+          <w:tblHeader w:val="false"/>
+        </w:trPr>
+        <w:tc>
+          <w:tcPr>
+            <w:tcW w:type="dxa" w:w="1400"/>
+            <w:tcMar>
+              <w:top w:type="dxa" w:w="60"/>
+              <w:left w:type="dxa" w:w="100"/>
+              <w:bottom w:type="dxa" w:w="60"/>
+              <w:right w:type="dxa" w:w="100"/>
+            </w:tcMar>
+          </w:tcPr>
+          <w:p>
+            <w:r>
+              <w:rPr>
+                <w:rFonts w:ascii="Times New Roman" w:cs="Times New Roman" w:eastAsia="Times New Roman" w:hAnsi="Times New Roman"/>
+                <w:sz w:val="19"/>
+                <w:szCs w:val="19"/>
+              </w:rPr>
               <w:t xml:space="preserve">—</w:t>
             </w:r>
           </w:p>
@@ -2757,7 +3020,7 @@
                 <w:sz w:val="19"/>
                 <w:szCs w:val="19"/>
               </w:rPr>
-              <w:t xml:space="preserve">GNU C under Debian (development packages)</w:t>
+              <w:t xml:space="preserve">languages in cREXX for CMS and Linux; Turbo CREXX</w:t>
             </w:r>
           </w:p>
         </w:tc>
@@ -2778,7 +3041,76 @@
                 <w:sz w:val="19"/>
                 <w:szCs w:val="19"/>
               </w:rPr>
-              <w:t xml:space="preserve">planned</w:t>
+              <w:t xml:space="preserve">in the Linux bundle; CMS deck being tested</w:t>
+            </w:r>
+          </w:p>
+        </w:tc>
+      </w:tr>
+      <w:tr>
+        <w:trPr>
+          <w:cantSplit/>
+          <w:tblHeader w:val="false"/>
+        </w:trPr>
+        <w:tc>
+          <w:tcPr>
+            <w:tcW w:type="dxa" w:w="1400"/>
+            <w:tcMar>
+              <w:top w:type="dxa" w:w="60"/>
+              <w:left w:type="dxa" w:w="100"/>
+              <w:bottom w:type="dxa" w:w="60"/>
+              <w:right w:type="dxa" w:w="100"/>
+            </w:tcMar>
+          </w:tcPr>
+          <w:p>
+            <w:r>
+              <w:rPr>
+                <w:rFonts w:ascii="Times New Roman" w:cs="Times New Roman" w:eastAsia="Times New Roman" w:hAnsi="Times New Roman"/>
+                <w:sz w:val="19"/>
+                <w:szCs w:val="19"/>
+              </w:rPr>
+              <w:t xml:space="preserve">—</w:t>
+            </w:r>
+          </w:p>
+        </w:tc>
+        <w:tc>
+          <w:tcPr>
+            <w:tcW w:type="dxa" w:w="6038"/>
+            <w:tcMar>
+              <w:top w:type="dxa" w:w="60"/>
+              <w:left w:type="dxa" w:w="100"/>
+              <w:bottom w:type="dxa" w:w="60"/>
+              <w:right w:type="dxa" w:w="100"/>
+            </w:tcMar>
+          </w:tcPr>
+          <w:p>
+            <w:r>
+              <w:rPr>
+                <w:rFonts w:ascii="Times New Roman" w:cs="Times New Roman" w:eastAsia="Times New Roman" w:hAnsi="Times New Roman"/>
+                <w:sz w:val="19"/>
+                <w:szCs w:val="19"/>
+              </w:rPr>
+              <w:t xml:space="preserve">GNU C 4.6, Python 2.7 and 3.2 under Debian</w:t>
+            </w:r>
+          </w:p>
+        </w:tc>
+        <w:tc>
+          <w:tcPr>
+            <w:tcW w:type="dxa" w:w="2200"/>
+            <w:tcMar>
+              <w:top w:type="dxa" w:w="60"/>
+              <w:left w:type="dxa" w:w="100"/>
+              <w:bottom w:type="dxa" w:w="60"/>
+              <w:right w:type="dxa" w:w="100"/>
+            </w:tcMar>
+          </w:tcPr>
+          <w:p>
+            <w:r>
+              <w:rPr>
+                <w:rFonts w:ascii="Times New Roman" w:cs="Times New Roman" w:eastAsia="Times New Roman" w:hAnsi="Times New Roman"/>
+                <w:sz w:val="19"/>
+                <w:szCs w:val="19"/>
+              </w:rPr>
+              <w:t xml:space="preserve">complete</w:t>
             </w:r>
           </w:p>
         </w:tc>
@@ -3684,6 +4016,44 @@
     </w:p>
     <w:p>
       <w:pPr>
+        <w:pStyle w:val="ListParagraph"/>
+        <w:numPr>
+          <w:ilvl w:val="0"/>
+          <w:numId w:val="2"/>
+        </w:numPr>
+        <w:spacing w:after="60"/>
+      </w:pPr>
+      <w:r>
+        <w:rPr>
+          <w:rFonts w:ascii="Times New Roman" w:cs="Times New Roman" w:eastAsia="Times New Roman" w:hAnsi="Times New Roman"/>
+          <w:b/>
+          <w:bCs/>
+        </w:rPr>
+        <w:t xml:space="preserve">More disk space for CMSUSER.</w:t>
+      </w:r>
+      <w:r>
+        <w:rPr>
+          <w:rFonts w:ascii="Times New Roman" w:cs="Times New Roman" w:eastAsia="Times New Roman" w:hAnsi="Times New Roman"/>
+        </w:rPr>
+        <w:t xml:space="preserve"> Besides 191–195 on VM50U0, CMSUSER has four more minidisks, 196–199, of 115 cylinders (about 52 MB) each on VM50-8, in the cylinders the Community Edition leaves free there. They come formatted, labeled CMS196 to CMS199: </w:t>
+      </w:r>
+      <w:r>
+        <w:rPr>
+          <w:rFonts w:ascii="Courier New" w:cs="Courier New" w:eastAsia="Courier New" w:hAnsi="Courier New"/>
+          <w:sz w:val="19"/>
+          <w:szCs w:val="19"/>
+        </w:rPr>
+        <w:t xml:space="preserve">ACCESS 196 H</w:t>
+      </w:r>
+      <w:r>
+        <w:rPr>
+          <w:rFonts w:ascii="Times New Roman" w:cs="Times New Roman" w:eastAsia="Times New Roman" w:hAnsi="Times New Roman"/>
+        </w:rPr>
+        <w:t xml:space="preserve"> (197 I, 198 J, 199 K). A CMS minidisk on a 3350 holds at most 65,535 blocks of 800 bytes, about 52 MB; larger minidisks come with milestone M6.</w:t>
+      </w:r>
+    </w:p>
+    <w:p>
+      <w:pPr>
         <w:pStyle w:val="Heading2"/>
       </w:pPr>
       <w:r>
@@ -7467,7 +7837,7 @@
         <w:rPr>
           <w:rFonts w:ascii="Times New Roman" w:cs="Times New Roman" w:eastAsia="Times New Roman" w:hAnsi="Times New Roman"/>
         </w:rPr>
-        <w:t xml:space="preserve">The disk holds Debian 7.11 (wheezy) for s390: sysvinit, udev, rsyslog, cron, OpenSSH, apt and dpkg, 154 packages, root on ext2, a 128 MB swap file. Log in as </w:t>
+        <w:t xml:space="preserve">The disk holds Debian 7.11 (wheezy) for s390: sysvinit, udev, rsyslog, cron, OpenSSH, apt and dpkg, root on ext2, a 128 MB swap file. Log in as </w:t>
       </w:r>
       <w:r>
         <w:rPr>
@@ -7496,6 +7866,59 @@
           <w:rFonts w:ascii="Times New Roman" w:cs="Times New Roman" w:eastAsia="Times New Roman" w:hAnsi="Times New Roman"/>
         </w:rPr>
         <w:t xml:space="preserve">, and change the password.</w:t>
+      </w:r>
+    </w:p>
+    <w:p>
+      <w:pPr>
+        <w:spacing w:after="120"/>
+      </w:pPr>
+      <w:r>
+        <w:rPr>
+          <w:rFonts w:ascii="Times New Roman" w:cs="Times New Roman" w:eastAsia="Times New Roman" w:hAnsi="Times New Roman"/>
+        </w:rPr>
+        <w:t xml:space="preserve">Development tools are installed: GNU C and C++ 4.6.3 with make, Python 2.7.3 (</w:t>
+      </w:r>
+      <w:r>
+        <w:rPr>
+          <w:rFonts w:ascii="Courier New" w:cs="Courier New" w:eastAsia="Courier New" w:hAnsi="Courier New"/>
+          <w:sz w:val="19"/>
+          <w:szCs w:val="19"/>
+        </w:rPr>
+        <w:t xml:space="preserve">python</w:t>
+      </w:r>
+      <w:r>
+        <w:rPr>
+          <w:rFonts w:ascii="Times New Roman" w:cs="Times New Roman" w:eastAsia="Times New Roman" w:hAnsi="Times New Roman"/>
+        </w:rPr>
+        <w:t xml:space="preserve">) and Python 3.2.3 (</w:t>
+      </w:r>
+      <w:r>
+        <w:rPr>
+          <w:rFonts w:ascii="Courier New" w:cs="Courier New" w:eastAsia="Courier New" w:hAnsi="Courier New"/>
+          <w:sz w:val="19"/>
+          <w:szCs w:val="19"/>
+        </w:rPr>
+        <w:t xml:space="preserve">python3</w:t>
+      </w:r>
+      <w:r>
+        <w:rPr>
+          <w:rFonts w:ascii="Times New Roman" w:cs="Times New Roman" w:eastAsia="Times New Roman" w:hAnsi="Times New Roman"/>
+        </w:rPr>
+        <w:t xml:space="preserve">). cREXX and the languages of Chapter 6 are in </w:t>
+      </w:r>
+      <w:r>
+        <w:rPr>
+          <w:rFonts w:ascii="Courier New" w:cs="Courier New" w:eastAsia="Courier New" w:hAnsi="Courier New"/>
+          <w:sz w:val="19"/>
+          <w:szCs w:val="19"/>
+        </w:rPr>
+        <w:t xml:space="preserve">/usr/local/bin</w:t>
+      </w:r>
+      <w:r>
+        <w:rPr>
+          <w:rFonts w:ascii="Times New Roman" w:cs="Times New Roman" w:eastAsia="Times New Roman" w:hAnsi="Times New Roman"/>
+        </w:rPr>
+        <w:t xml:space="preserve">.</w:t>
       </w:r>
     </w:p>
     <w:tbl>
@@ -8819,15 +9242,15 @@
         <w:rPr>
           <w:rFonts w:ascii="Times New Roman" w:cs="Times New Roman" w:eastAsia="Times New Roman" w:hAnsi="Times New Roman"/>
         </w:rPr>
-        <w:t xml:space="preserve">The current release needs a C99 compiler; GCC380 is GCC 3.2.3. It runs on VM/370+ cross-compiled (</w:t>
-      </w:r>
-      <w:r>
-        <w:rPr>
-          <w:rFonts w:ascii="Courier New" w:cs="Courier New" w:eastAsia="Courier New" w:hAnsi="Courier New"/>
-          <w:sz w:val="19"/>
-          <w:szCs w:val="19"/>
-        </w:rPr>
-        <w:t xml:space="preserve">rxc8</w:t>
+        <w:t xml:space="preserve">The current release (1.0.0-beta.3) needs a C99 compiler; GCC380 is GCC 3.2.3. It runs on VM/370+ cross-compiled with GCC 13 (</w:t>
+      </w:r>
+      <w:r>
+        <w:rPr>
+          <w:rFonts w:ascii="Courier New" w:cs="Courier New" w:eastAsia="Courier New" w:hAnsi="Courier New"/>
+          <w:sz w:val="19"/>
+          <w:szCs w:val="19"/>
+        </w:rPr>
+        <w:t xml:space="preserve">RXC8</w:t>
       </w:r>
       <w:r>
         <w:rPr>
@@ -8841,7 +9264,7 @@
           <w:sz w:val="19"/>
           <w:szCs w:val="19"/>
         </w:rPr>
-        <w:t xml:space="preserve">rxas8</w:t>
+        <w:t xml:space="preserve">RXAS8</w:t>
       </w:r>
       <w:r>
         <w:rPr>
@@ -8855,13 +9278,2378 @@
           <w:sz w:val="19"/>
           <w:szCs w:val="19"/>
         </w:rPr>
-        <w:t xml:space="preserve">rxbvm8</w:t>
-      </w:r>
-      <w:r>
-        <w:rPr>
-          <w:rFonts w:ascii="Times New Roman" w:cs="Times New Roman" w:eastAsia="Times New Roman" w:hAnsi="Times New Roman"/>
-        </w:rPr>
-        <w:t xml:space="preserve">); building it natively is milestone M8.2.</w:t>
+        <w:t xml:space="preserve">RXBVM8</w:t>
+      </w:r>
+      <w:r>
+        <w:rPr>
+          <w:rFonts w:ascii="Times New Roman" w:cs="Times New Roman" w:eastAsia="Times New Roman" w:hAnsi="Times New Roman"/>
+        </w:rPr>
+        <w:t xml:space="preserve">, milestone M8.1). </w:t>
+      </w:r>
+      <w:r>
+        <w:rPr>
+          <w:rFonts w:ascii="Courier New" w:cs="Courier New" w:eastAsia="Courier New" w:hAnsi="Courier New"/>
+          <w:sz w:val="19"/>
+          <w:szCs w:val="19"/>
+        </w:rPr>
+        <w:t xml:space="preserve">RXC8</w:t>
+      </w:r>
+      <w:r>
+        <w:rPr>
+          <w:rFonts w:ascii="Times New Roman" w:cs="Times New Roman" w:eastAsia="Times New Roman" w:hAnsi="Times New Roman"/>
+        </w:rPr>
+        <w:t xml:space="preserve"> needs </w:t>
+      </w:r>
+      <w:r>
+        <w:rPr>
+          <w:rFonts w:ascii="Courier New" w:cs="Courier New" w:eastAsia="Courier New" w:hAnsi="Courier New"/>
+          <w:sz w:val="19"/>
+          <w:szCs w:val="19"/>
+        </w:rPr>
+        <w:t xml:space="preserve">LIBRARY RXBIN</w:t>
+      </w:r>
+      <w:r>
+        <w:rPr>
+          <w:rFonts w:ascii="Times New Roman" w:cs="Times New Roman" w:eastAsia="Times New Roman" w:hAnsi="Times New Roman"/>
+        </w:rPr>
+        <w:t xml:space="preserve"> and </w:t>
+      </w:r>
+      <w:r>
+        <w:rPr>
+          <w:rFonts w:ascii="Courier New" w:cs="Courier New" w:eastAsia="Courier New" w:hAnsi="Courier New"/>
+          <w:sz w:val="19"/>
+          <w:szCs w:val="19"/>
+        </w:rPr>
+        <w:t xml:space="preserve">RXCEXITS RXBIN</w:t>
+      </w:r>
+      <w:r>
+        <w:rPr>
+          <w:rFonts w:ascii="Times New Roman" w:cs="Times New Roman" w:eastAsia="Times New Roman" w:hAnsi="Times New Roman"/>
+        </w:rPr>
+        <w:t xml:space="preserve"> on the disk named by </w:t>
+      </w:r>
+      <w:r>
+        <w:rPr>
+          <w:rFonts w:ascii="Courier New" w:cs="Courier New" w:eastAsia="Courier New" w:hAnsi="Courier New"/>
+          <w:sz w:val="19"/>
+          <w:szCs w:val="19"/>
+        </w:rPr>
+        <w:t xml:space="preserve">-l</w:t>
+      </w:r>
+      <w:r>
+        <w:rPr>
+          <w:rFonts w:ascii="Times New Roman" w:cs="Times New Roman" w:eastAsia="Times New Roman" w:hAnsi="Times New Roman"/>
+        </w:rPr>
+        <w:t xml:space="preserve">; source files are </w:t>
+      </w:r>
+      <w:r>
+        <w:rPr>
+          <w:rFonts w:ascii="Courier New" w:cs="Courier New" w:eastAsia="Courier New" w:hAnsi="Courier New"/>
+          <w:sz w:val="19"/>
+          <w:szCs w:val="19"/>
+        </w:rPr>
+        <w:t xml:space="preserve">fn CREXX</w:t>
+      </w:r>
+      <w:r>
+        <w:rPr>
+          <w:rFonts w:ascii="Times New Roman" w:cs="Times New Roman" w:eastAsia="Times New Roman" w:hAnsi="Times New Roman"/>
+        </w:rPr>
+        <w:t xml:space="preserve">:</w:t>
+      </w:r>
+    </w:p>
+    <w:tbl>
+      <w:tblPr>
+        <w:tblW w:type="dxa" w:w="9638"/>
+        <w:tblBorders>
+          <w:top w:val="single" w:color="auto" w:sz="4"/>
+          <w:left w:val="single" w:color="auto" w:sz="4"/>
+          <w:bottom w:val="single" w:color="auto" w:sz="4"/>
+          <w:right w:val="single" w:color="auto" w:sz="4"/>
+          <w:insideH w:val="single" w:color="auto" w:sz="4"/>
+          <w:insideV w:val="single" w:color="auto" w:sz="4"/>
+        </w:tblBorders>
+      </w:tblPr>
+      <w:tblGrid>
+        <w:gridCol w:w="9638"/>
+      </w:tblGrid>
+      <w:tr>
+        <w:trPr>
+          <w:cantSplit/>
+        </w:trPr>
+        <w:tc>
+          <w:tcPr>
+            <w:tcW w:type="dxa" w:w="9638"/>
+            <w:shd w:fill="F2F2F2" w:color="auto" w:val="clear"/>
+            <w:tcMar>
+              <w:top w:type="dxa" w:w="100"/>
+              <w:left w:type="dxa" w:w="140"/>
+              <w:bottom w:type="dxa" w:w="100"/>
+              <w:right w:type="dxa" w:w="140"/>
+            </w:tcMar>
+          </w:tcPr>
+          <w:p>
+            <w:pPr>
+              <w:spacing w:after="0" w:line="228"/>
+            </w:pPr>
+            <w:r>
+              <w:rPr>
+                <w:rFonts w:ascii="Courier New" w:cs="Courier New" w:eastAsia="Courier New" w:hAnsi="Courier New"/>
+                <w:sz w:val="17"/>
+                <w:szCs w:val="17"/>
+              </w:rPr>
+              <w:t xml:space="preserve">rxc8 -l a -i a hello</w:t>
+            </w:r>
+          </w:p>
+          <w:p>
+            <w:pPr>
+              <w:spacing w:after="0" w:line="228"/>
+            </w:pPr>
+            <w:r>
+              <w:rPr>
+                <w:rFonts w:ascii="Courier New" w:cs="Courier New" w:eastAsia="Courier New" w:hAnsi="Courier New"/>
+                <w:sz w:val="17"/>
+                <w:szCs w:val="17"/>
+              </w:rPr>
+              <w:t xml:space="preserve">rxas8 -l a hello</w:t>
+            </w:r>
+          </w:p>
+          <w:p>
+            <w:pPr>
+              <w:spacing w:after="0" w:line="228"/>
+            </w:pPr>
+            <w:r>
+              <w:rPr>
+                <w:rFonts w:ascii="Courier New" w:cs="Courier New" w:eastAsia="Courier New" w:hAnsi="Courier New"/>
+                <w:sz w:val="17"/>
+                <w:szCs w:val="17"/>
+              </w:rPr>
+              <w:t xml:space="preserve">rxbvm8 -l a hello</w:t>
+            </w:r>
+          </w:p>
+          <w:p>
+            <w:pPr>
+              <w:spacing w:after="0" w:line="228"/>
+            </w:pPr>
+            <w:r>
+              <w:rPr>
+                <w:rFonts w:ascii="Courier New" w:cs="Courier New" w:eastAsia="Courier New" w:hAnsi="Courier New"/>
+                <w:sz w:val="17"/>
+                <w:szCs w:val="17"/>
+              </w:rPr>
+              <w:t xml:space="preserve">Hello from current cREXX on VM/370+</w:t>
+            </w:r>
+          </w:p>
+          <w:p>
+            <w:pPr>
+              <w:spacing w:after="0" w:line="228"/>
+            </w:pPr>
+            <w:r>
+              <w:rPr>
+                <w:rFonts w:ascii="Courier New" w:cs="Courier New" w:eastAsia="Courier New" w:hAnsi="Courier New"/>
+                <w:sz w:val="17"/>
+                <w:szCs w:val="17"/>
+              </w:rPr>
+              <w:t xml:space="preserve">sum 1..10 = 55</w:t>
+            </w:r>
+          </w:p>
+          <w:p>
+            <w:pPr>
+              <w:spacing w:after="0" w:line="228"/>
+            </w:pPr>
+            <w:r>
+              <w:rPr>
+                <w:rFonts w:ascii="Courier New" w:cs="Courier New" w:eastAsia="Courier New" w:hAnsi="Courier New"/>
+                <w:sz w:val="17"/>
+                <w:szCs w:val="17"/>
+              </w:rPr>
+              <w:t xml:space="preserve">Ready;</w:t>
+            </w:r>
+          </w:p>
+        </w:tc>
+      </w:tr>
+    </w:tbl>
+    <w:p>
+      <w:pPr>
+        <w:spacing w:after="200" w:before="80"/>
+      </w:pPr>
+      <w:r>
+        <w:rPr>
+          <w:rFonts w:ascii="Arial" w:cs="Arial" w:eastAsia="Arial" w:hAnsi="Arial"/>
+          <w:b/>
+          <w:bCs/>
+          <w:sz w:val="18"/>
+          <w:szCs w:val="18"/>
+        </w:rPr>
+        <w:t xml:space="preserve">Figure 17. </w:t>
+      </w:r>
+      <w:r>
+        <w:rPr>
+          <w:rFonts w:ascii="Arial" w:cs="Arial" w:eastAsia="Arial" w:hAnsi="Arial"/>
+          <w:sz w:val="18"/>
+          <w:szCs w:val="18"/>
+        </w:rPr>
+        <w:t xml:space="preserve">The current cREXX on CMS</w:t>
+      </w:r>
+    </w:p>
+    <w:p>
+      <w:pPr>
+        <w:spacing w:after="120"/>
+      </w:pPr>
+      <w:r>
+        <w:rPr>
+          <w:rFonts w:ascii="Times New Roman" w:cs="Times New Roman" w:eastAsia="Times New Roman" w:hAnsi="Times New Roman"/>
+        </w:rPr>
+        <w:t xml:space="preserve">Milestone M8.2 builds the same release natively with GCC380 and GCCLIB31 (</w:t>
+      </w:r>
+      <w:r>
+        <w:rPr>
+          <w:rFonts w:ascii="Courier New" w:cs="Courier New" w:eastAsia="Courier New" w:hAnsi="Courier New"/>
+          <w:sz w:val="19"/>
+          <w:szCs w:val="19"/>
+        </w:rPr>
+        <w:t xml:space="preserve">RXC82</w:t>
+      </w:r>
+      <w:r>
+        <w:rPr>
+          <w:rFonts w:ascii="Times New Roman" w:cs="Times New Roman" w:eastAsia="Times New Roman" w:hAnsi="Times New Roman"/>
+        </w:rPr>
+        <w:t xml:space="preserve">, </w:t>
+      </w:r>
+      <w:r>
+        <w:rPr>
+          <w:rFonts w:ascii="Courier New" w:cs="Courier New" w:eastAsia="Courier New" w:hAnsi="Courier New"/>
+          <w:sz w:val="19"/>
+          <w:szCs w:val="19"/>
+        </w:rPr>
+        <w:t xml:space="preserve">RXAS82</w:t>
+      </w:r>
+      <w:r>
+        <w:rPr>
+          <w:rFonts w:ascii="Times New Roman" w:cs="Times New Roman" w:eastAsia="Times New Roman" w:hAnsi="Times New Roman"/>
+        </w:rPr>
+        <w:t xml:space="preserve">, </w:t>
+      </w:r>
+      <w:r>
+        <w:rPr>
+          <w:rFonts w:ascii="Courier New" w:cs="Courier New" w:eastAsia="Courier New" w:hAnsi="Courier New"/>
+          <w:sz w:val="19"/>
+          <w:szCs w:val="19"/>
+        </w:rPr>
+        <w:t xml:space="preserve">RXBVM82</w:t>
+      </w:r>
+      <w:r>
+        <w:rPr>
+          <w:rFonts w:ascii="Times New Roman" w:cs="Times New Roman" w:eastAsia="Times New Roman" w:hAnsi="Times New Roman"/>
+        </w:rPr>
+        <w:t xml:space="preserve">). The three work for programs that call no library functions; the library itself does not build natively yet (Chapter 7). Until it does, use the M8.1 tools. Native cREXX on CMS runs in EBCDIC (IBM-1047) throughout, as IBM REXX does.</w:t>
+      </w:r>
+    </w:p>
+    <w:p>
+      <w:pPr>
+        <w:pStyle w:val="Heading2"/>
+      </w:pPr>
+      <w:r>
+        <w:t xml:space="preserve">Languages written in cREXX</w:t>
+      </w:r>
+    </w:p>
+    <w:p>
+      <w:pPr>
+        <w:spacing w:after="120"/>
+      </w:pPr>
+      <w:r>
+        <w:rPr>
+          <w:rFonts w:ascii="Times New Roman" w:cs="Times New Roman" w:eastAsia="Times New Roman" w:hAnsi="Times New Roman"/>
+        </w:rPr>
+        <w:t xml:space="preserve">Several languages are implemented as cREXX programs. They are compiled once on the PC and run unchanged on CMS (through </w:t>
+      </w:r>
+      <w:r>
+        <w:rPr>
+          <w:rFonts w:ascii="Courier New" w:cs="Courier New" w:eastAsia="Courier New" w:hAnsi="Courier New"/>
+          <w:sz w:val="19"/>
+          <w:szCs w:val="19"/>
+        </w:rPr>
+        <w:t xml:space="preserve">RXBVM8</w:t>
+      </w:r>
+      <w:r>
+        <w:rPr>
+          <w:rFonts w:ascii="Times New Roman" w:cs="Times New Roman" w:eastAsia="Times New Roman" w:hAnsi="Times New Roman"/>
+        </w:rPr>
+        <w:t xml:space="preserve">) and on Linux (through </w:t>
+      </w:r>
+      <w:r>
+        <w:rPr>
+          <w:rFonts w:ascii="Courier New" w:cs="Courier New" w:eastAsia="Courier New" w:hAnsi="Courier New"/>
+          <w:sz w:val="19"/>
+          <w:szCs w:val="19"/>
+        </w:rPr>
+        <w:t xml:space="preserve">rxvm</w:t>
+      </w:r>
+      <w:r>
+        <w:rPr>
+          <w:rFonts w:ascii="Times New Roman" w:cs="Times New Roman" w:eastAsia="Times New Roman" w:hAnsi="Times New Roman"/>
+        </w:rPr>
+        <w:t xml:space="preserve">). Floating point comes from </w:t>
+      </w:r>
+      <w:r>
+        <w:rPr>
+          <w:rFonts w:ascii="Courier New" w:cs="Courier New" w:eastAsia="Courier New" w:hAnsi="Courier New"/>
+          <w:sz w:val="19"/>
+          <w:szCs w:val="19"/>
+        </w:rPr>
+        <w:t xml:space="preserve">rxfloat</w:t>
+      </w:r>
+      <w:r>
+        <w:rPr>
+          <w:rFonts w:ascii="Times New Roman" w:cs="Times New Roman" w:eastAsia="Times New Roman" w:hAnsi="Times New Roman"/>
+        </w:rPr>
+        <w:t xml:space="preserve">, a cREXX version of the cREXX float plugin, so no native plugin is needed.</w:t>
+      </w:r>
+    </w:p>
+    <w:tbl>
+      <w:tblPr>
+        <w:tblW w:type="dxa" w:w="9638"/>
+        <w:tblBorders>
+          <w:top w:val="single" w:color="808080" w:sz="4"/>
+          <w:left w:val="single" w:color="808080" w:sz="4"/>
+          <w:bottom w:val="single" w:color="808080" w:sz="4"/>
+          <w:right w:val="single" w:color="808080" w:sz="4"/>
+          <w:insideH w:val="single" w:color="808080" w:sz="4"/>
+          <w:insideV w:val="single" w:color="808080" w:sz="4"/>
+        </w:tblBorders>
+      </w:tblPr>
+      <w:tblGrid>
+        <w:gridCol w:w="1400"/>
+        <w:gridCol w:w="2100"/>
+        <w:gridCol w:w="2100"/>
+        <w:gridCol w:w="4038"/>
+      </w:tblGrid>
+      <w:tr>
+        <w:trPr>
+          <w:cantSplit/>
+          <w:tblHeader/>
+        </w:trPr>
+        <w:tc>
+          <w:tcPr>
+            <w:tcW w:type="dxa" w:w="1400"/>
+            <w:shd w:fill="D9D9D9" w:color="auto" w:val="clear"/>
+            <w:tcMar>
+              <w:top w:type="dxa" w:w="60"/>
+              <w:left w:type="dxa" w:w="100"/>
+              <w:bottom w:type="dxa" w:w="60"/>
+              <w:right w:type="dxa" w:w="100"/>
+            </w:tcMar>
+          </w:tcPr>
+          <w:p>
+            <w:r>
+              <w:rPr>
+                <w:rFonts w:ascii="Arial" w:cs="Arial" w:eastAsia="Arial" w:hAnsi="Arial"/>
+                <w:b/>
+                <w:bCs/>
+                <w:sz w:val="18"/>
+                <w:szCs w:val="18"/>
+              </w:rPr>
+              <w:t xml:space="preserve">Language</w:t>
+            </w:r>
+          </w:p>
+        </w:tc>
+        <w:tc>
+          <w:tcPr>
+            <w:tcW w:type="dxa" w:w="2100"/>
+            <w:shd w:fill="D9D9D9" w:color="auto" w:val="clear"/>
+            <w:tcMar>
+              <w:top w:type="dxa" w:w="60"/>
+              <w:left w:type="dxa" w:w="100"/>
+              <w:bottom w:type="dxa" w:w="60"/>
+              <w:right w:type="dxa" w:w="100"/>
+            </w:tcMar>
+          </w:tcPr>
+          <w:p>
+            <w:r>
+              <w:rPr>
+                <w:rFonts w:ascii="Arial" w:cs="Arial" w:eastAsia="Arial" w:hAnsi="Arial"/>
+                <w:b/>
+                <w:bCs/>
+                <w:sz w:val="18"/>
+                <w:szCs w:val="18"/>
+              </w:rPr>
+              <w:t xml:space="preserve">CMS</w:t>
+            </w:r>
+          </w:p>
+        </w:tc>
+        <w:tc>
+          <w:tcPr>
+            <w:tcW w:type="dxa" w:w="2100"/>
+            <w:shd w:fill="D9D9D9" w:color="auto" w:val="clear"/>
+            <w:tcMar>
+              <w:top w:type="dxa" w:w="60"/>
+              <w:left w:type="dxa" w:w="100"/>
+              <w:bottom w:type="dxa" w:w="60"/>
+              <w:right w:type="dxa" w:w="100"/>
+            </w:tcMar>
+          </w:tcPr>
+          <w:p>
+            <w:r>
+              <w:rPr>
+                <w:rFonts w:ascii="Arial" w:cs="Arial" w:eastAsia="Arial" w:hAnsi="Arial"/>
+                <w:b/>
+                <w:bCs/>
+                <w:sz w:val="18"/>
+                <w:szCs w:val="18"/>
+              </w:rPr>
+              <w:t xml:space="preserve">Linux</w:t>
+            </w:r>
+          </w:p>
+        </w:tc>
+        <w:tc>
+          <w:tcPr>
+            <w:tcW w:type="dxa" w:w="4038"/>
+            <w:shd w:fill="D9D9D9" w:color="auto" w:val="clear"/>
+            <w:tcMar>
+              <w:top w:type="dxa" w:w="60"/>
+              <w:left w:type="dxa" w:w="100"/>
+              <w:bottom w:type="dxa" w:w="60"/>
+              <w:right w:type="dxa" w:w="100"/>
+            </w:tcMar>
+          </w:tcPr>
+          <w:p>
+            <w:r>
+              <w:rPr>
+                <w:rFonts w:ascii="Arial" w:cs="Arial" w:eastAsia="Arial" w:hAnsi="Arial"/>
+                <w:b/>
+                <w:bCs/>
+                <w:sz w:val="18"/>
+                <w:szCs w:val="18"/>
+              </w:rPr>
+              <w:t xml:space="preserve">Notes</w:t>
+            </w:r>
+          </w:p>
+        </w:tc>
+      </w:tr>
+      <w:tr>
+        <w:trPr>
+          <w:cantSplit/>
+          <w:tblHeader w:val="false"/>
+        </w:trPr>
+        <w:tc>
+          <w:tcPr>
+            <w:tcW w:type="dxa" w:w="1400"/>
+            <w:tcMar>
+              <w:top w:type="dxa" w:w="60"/>
+              <w:left w:type="dxa" w:w="100"/>
+              <w:bottom w:type="dxa" w:w="60"/>
+              <w:right w:type="dxa" w:w="100"/>
+            </w:tcMar>
+          </w:tcPr>
+          <w:p>
+            <w:r>
+              <w:rPr>
+                <w:rFonts w:ascii="Times New Roman" w:cs="Times New Roman" w:eastAsia="Times New Roman" w:hAnsi="Times New Roman"/>
+                <w:sz w:val="19"/>
+                <w:szCs w:val="19"/>
+              </w:rPr>
+              <w:t xml:space="preserve">BASIC</w:t>
+            </w:r>
+          </w:p>
+        </w:tc>
+        <w:tc>
+          <w:tcPr>
+            <w:tcW w:type="dxa" w:w="2100"/>
+            <w:tcMar>
+              <w:top w:type="dxa" w:w="60"/>
+              <w:left w:type="dxa" w:w="100"/>
+              <w:bottom w:type="dxa" w:w="60"/>
+              <w:right w:type="dxa" w:w="100"/>
+            </w:tcMar>
+          </w:tcPr>
+          <w:p>
+            <w:r>
+              <w:rPr>
+                <w:rFonts w:ascii="Courier New" w:cs="Courier New" w:eastAsia="Courier New" w:hAnsi="Courier New"/>
+                <w:sz w:val="19"/>
+                <w:szCs w:val="19"/>
+              </w:rPr>
+              <w:t xml:space="preserve">BASIC fn.bas</w:t>
+            </w:r>
+          </w:p>
+        </w:tc>
+        <w:tc>
+          <w:tcPr>
+            <w:tcW w:type="dxa" w:w="2100"/>
+            <w:tcMar>
+              <w:top w:type="dxa" w:w="60"/>
+              <w:left w:type="dxa" w:w="100"/>
+              <w:bottom w:type="dxa" w:w="60"/>
+              <w:right w:type="dxa" w:w="100"/>
+            </w:tcMar>
+          </w:tcPr>
+          <w:p>
+            <w:r>
+              <w:rPr>
+                <w:rFonts w:ascii="Courier New" w:cs="Courier New" w:eastAsia="Courier New" w:hAnsi="Courier New"/>
+                <w:sz w:val="19"/>
+                <w:szCs w:val="19"/>
+              </w:rPr>
+              <w:t xml:space="preserve">basic fn.bas</w:t>
+            </w:r>
+          </w:p>
+        </w:tc>
+        <w:tc>
+          <w:tcPr>
+            <w:tcW w:type="dxa" w:w="4038"/>
+            <w:tcMar>
+              <w:top w:type="dxa" w:w="60"/>
+              <w:left w:type="dxa" w:w="100"/>
+              <w:bottom w:type="dxa" w:w="60"/>
+              <w:right w:type="dxa" w:w="100"/>
+            </w:tcMar>
+          </w:tcPr>
+          <w:p>
+            <w:r>
+              <w:rPr>
+                <w:rFonts w:ascii="Times New Roman" w:cs="Times New Roman" w:eastAsia="Times New Roman" w:hAnsi="Times New Roman"/>
+                <w:sz w:val="19"/>
+                <w:szCs w:val="19"/>
+              </w:rPr>
+              <w:t xml:space="preserve">classic, MS and ANSI dialects (</w:t>
+            </w:r>
+            <w:r>
+              <w:rPr>
+                <w:rFonts w:ascii="Courier New" w:cs="Courier New" w:eastAsia="Courier New" w:hAnsi="Courier New"/>
+                <w:sz w:val="19"/>
+                <w:szCs w:val="19"/>
+              </w:rPr>
+              <w:t xml:space="preserve">-MS</w:t>
+            </w:r>
+            <w:r>
+              <w:rPr>
+                <w:rFonts w:ascii="Times New Roman" w:cs="Times New Roman" w:eastAsia="Times New Roman" w:hAnsi="Times New Roman"/>
+                <w:sz w:val="19"/>
+                <w:szCs w:val="19"/>
+              </w:rPr>
+              <w:t xml:space="preserve">, </w:t>
+            </w:r>
+            <w:r>
+              <w:rPr>
+                <w:rFonts w:ascii="Courier New" w:cs="Courier New" w:eastAsia="Courier New" w:hAnsi="Courier New"/>
+                <w:sz w:val="19"/>
+                <w:szCs w:val="19"/>
+              </w:rPr>
+              <w:t xml:space="preserve">-FB</w:t>
+            </w:r>
+            <w:r>
+              <w:rPr>
+                <w:rFonts w:ascii="Times New Roman" w:cs="Times New Roman" w:eastAsia="Times New Roman" w:hAnsi="Times New Roman"/>
+                <w:sz w:val="19"/>
+                <w:szCs w:val="19"/>
+              </w:rPr>
+              <w:t xml:space="preserve">, </w:t>
+            </w:r>
+            <w:r>
+              <w:rPr>
+                <w:rFonts w:ascii="Courier New" w:cs="Courier New" w:eastAsia="Courier New" w:hAnsi="Courier New"/>
+                <w:sz w:val="19"/>
+                <w:szCs w:val="19"/>
+              </w:rPr>
+              <w:t xml:space="preserve">-ANSI</w:t>
+            </w:r>
+            <w:r>
+              <w:rPr>
+                <w:rFonts w:ascii="Times New Roman" w:cs="Times New Roman" w:eastAsia="Times New Roman" w:hAnsi="Times New Roman"/>
+                <w:sz w:val="19"/>
+                <w:szCs w:val="19"/>
+              </w:rPr>
+              <w:t xml:space="preserve">)</w:t>
+            </w:r>
+          </w:p>
+        </w:tc>
+      </w:tr>
+      <w:tr>
+        <w:trPr>
+          <w:cantSplit/>
+          <w:tblHeader w:val="false"/>
+        </w:trPr>
+        <w:tc>
+          <w:tcPr>
+            <w:tcW w:type="dxa" w:w="1400"/>
+            <w:tcMar>
+              <w:top w:type="dxa" w:w="60"/>
+              <w:left w:type="dxa" w:w="100"/>
+              <w:bottom w:type="dxa" w:w="60"/>
+              <w:right w:type="dxa" w:w="100"/>
+            </w:tcMar>
+          </w:tcPr>
+          <w:p>
+            <w:r>
+              <w:rPr>
+                <w:rFonts w:ascii="Times New Roman" w:cs="Times New Roman" w:eastAsia="Times New Roman" w:hAnsi="Times New Roman"/>
+                <w:sz w:val="19"/>
+                <w:szCs w:val="19"/>
+              </w:rPr>
+              <w:t xml:space="preserve">SNOBOL4</w:t>
+            </w:r>
+          </w:p>
+        </w:tc>
+        <w:tc>
+          <w:tcPr>
+            <w:tcW w:type="dxa" w:w="2100"/>
+            <w:tcMar>
+              <w:top w:type="dxa" w:w="60"/>
+              <w:left w:type="dxa" w:w="100"/>
+              <w:bottom w:type="dxa" w:w="60"/>
+              <w:right w:type="dxa" w:w="100"/>
+            </w:tcMar>
+          </w:tcPr>
+          <w:p>
+            <w:r>
+              <w:rPr>
+                <w:rFonts w:ascii="Courier New" w:cs="Courier New" w:eastAsia="Courier New" w:hAnsi="Courier New"/>
+                <w:sz w:val="19"/>
+                <w:szCs w:val="19"/>
+              </w:rPr>
+              <w:t xml:space="preserve">SNOBOL fn.sno</w:t>
+            </w:r>
+          </w:p>
+        </w:tc>
+        <w:tc>
+          <w:tcPr>
+            <w:tcW w:type="dxa" w:w="2100"/>
+            <w:tcMar>
+              <w:top w:type="dxa" w:w="60"/>
+              <w:left w:type="dxa" w:w="100"/>
+              <w:bottom w:type="dxa" w:w="60"/>
+              <w:right w:type="dxa" w:w="100"/>
+            </w:tcMar>
+          </w:tcPr>
+          <w:p>
+            <w:r>
+              <w:rPr>
+                <w:rFonts w:ascii="Courier New" w:cs="Courier New" w:eastAsia="Courier New" w:hAnsi="Courier New"/>
+                <w:sz w:val="19"/>
+                <w:szCs w:val="19"/>
+              </w:rPr>
+              <w:t xml:space="preserve">snobol fn.sno</w:t>
+            </w:r>
+          </w:p>
+        </w:tc>
+        <w:tc>
+          <w:tcPr>
+            <w:tcW w:type="dxa" w:w="4038"/>
+            <w:tcMar>
+              <w:top w:type="dxa" w:w="60"/>
+              <w:left w:type="dxa" w:w="100"/>
+              <w:bottom w:type="dxa" w:w="60"/>
+              <w:right w:type="dxa" w:w="100"/>
+            </w:tcMar>
+          </w:tcPr>
+          <w:p>
+            <w:r>
+              <w:rPr>
+                <w:rFonts w:ascii="Times New Roman" w:cs="Times New Roman" w:eastAsia="Times New Roman" w:hAnsi="Times New Roman"/>
+                <w:sz w:val="19"/>
+                <w:szCs w:val="19"/>
+              </w:rPr>
+              <w:t xml:space="preserve">patterns, tables, arrays</w:t>
+            </w:r>
+          </w:p>
+        </w:tc>
+      </w:tr>
+      <w:tr>
+        <w:trPr>
+          <w:cantSplit/>
+          <w:tblHeader w:val="false"/>
+        </w:trPr>
+        <w:tc>
+          <w:tcPr>
+            <w:tcW w:type="dxa" w:w="1400"/>
+            <w:tcMar>
+              <w:top w:type="dxa" w:w="60"/>
+              <w:left w:type="dxa" w:w="100"/>
+              <w:bottom w:type="dxa" w:w="60"/>
+              <w:right w:type="dxa" w:w="100"/>
+            </w:tcMar>
+          </w:tcPr>
+          <w:p>
+            <w:r>
+              <w:rPr>
+                <w:rFonts w:ascii="Times New Roman" w:cs="Times New Roman" w:eastAsia="Times New Roman" w:hAnsi="Times New Roman"/>
+                <w:sz w:val="19"/>
+                <w:szCs w:val="19"/>
+              </w:rPr>
+              <w:t xml:space="preserve">Pascal</w:t>
+            </w:r>
+          </w:p>
+        </w:tc>
+        <w:tc>
+          <w:tcPr>
+            <w:tcW w:type="dxa" w:w="2100"/>
+            <w:tcMar>
+              <w:top w:type="dxa" w:w="60"/>
+              <w:left w:type="dxa" w:w="100"/>
+              <w:bottom w:type="dxa" w:w="60"/>
+              <w:right w:type="dxa" w:w="100"/>
+            </w:tcMar>
+          </w:tcPr>
+          <w:p>
+            <w:r>
+              <w:rPr>
+                <w:rFonts w:ascii="Courier New" w:cs="Courier New" w:eastAsia="Courier New" w:hAnsi="Courier New"/>
+                <w:sz w:val="19"/>
+                <w:szCs w:val="19"/>
+              </w:rPr>
+              <w:t xml:space="preserve">PASCAL fn</w:t>
+            </w:r>
+          </w:p>
+        </w:tc>
+        <w:tc>
+          <w:tcPr>
+            <w:tcW w:type="dxa" w:w="2100"/>
+            <w:tcMar>
+              <w:top w:type="dxa" w:w="60"/>
+              <w:left w:type="dxa" w:w="100"/>
+              <w:bottom w:type="dxa" w:w="60"/>
+              <w:right w:type="dxa" w:w="100"/>
+            </w:tcMar>
+          </w:tcPr>
+          <w:p>
+            <w:r>
+              <w:rPr>
+                <w:rFonts w:ascii="Courier New" w:cs="Courier New" w:eastAsia="Courier New" w:hAnsi="Courier New"/>
+                <w:sz w:val="19"/>
+                <w:szCs w:val="19"/>
+              </w:rPr>
+              <w:t xml:space="preserve">pasc fn.pas</w:t>
+            </w:r>
+          </w:p>
+        </w:tc>
+        <w:tc>
+          <w:tcPr>
+            <w:tcW w:type="dxa" w:w="4038"/>
+            <w:tcMar>
+              <w:top w:type="dxa" w:w="60"/>
+              <w:left w:type="dxa" w:w="100"/>
+              <w:bottom w:type="dxa" w:w="60"/>
+              <w:right w:type="dxa" w:w="100"/>
+            </w:tcMar>
+          </w:tcPr>
+          <w:p>
+            <w:r>
+              <w:rPr>
+                <w:rFonts w:ascii="Times New Roman" w:cs="Times New Roman" w:eastAsia="Times New Roman" w:hAnsi="Times New Roman"/>
+                <w:sz w:val="19"/>
+                <w:szCs w:val="19"/>
+              </w:rPr>
+              <w:t xml:space="preserve">compiles Pascal to cREXX, then runs it</w:t>
+            </w:r>
+          </w:p>
+        </w:tc>
+      </w:tr>
+      <w:tr>
+        <w:trPr>
+          <w:cantSplit/>
+          <w:tblHeader w:val="false"/>
+        </w:trPr>
+        <w:tc>
+          <w:tcPr>
+            <w:tcW w:type="dxa" w:w="1400"/>
+            <w:tcMar>
+              <w:top w:type="dxa" w:w="60"/>
+              <w:left w:type="dxa" w:w="100"/>
+              <w:bottom w:type="dxa" w:w="60"/>
+              <w:right w:type="dxa" w:w="100"/>
+            </w:tcMar>
+          </w:tcPr>
+          <w:p>
+            <w:r>
+              <w:rPr>
+                <w:rFonts w:ascii="Times New Roman" w:cs="Times New Roman" w:eastAsia="Times New Roman" w:hAnsi="Times New Roman"/>
+                <w:sz w:val="19"/>
+                <w:szCs w:val="19"/>
+              </w:rPr>
+              <w:t xml:space="preserve">Lisp</w:t>
+            </w:r>
+          </w:p>
+        </w:tc>
+        <w:tc>
+          <w:tcPr>
+            <w:tcW w:type="dxa" w:w="2100"/>
+            <w:tcMar>
+              <w:top w:type="dxa" w:w="60"/>
+              <w:left w:type="dxa" w:w="100"/>
+              <w:bottom w:type="dxa" w:w="60"/>
+              <w:right w:type="dxa" w:w="100"/>
+            </w:tcMar>
+          </w:tcPr>
+          <w:p>
+            <w:r>
+              <w:rPr>
+                <w:rFonts w:ascii="Courier New" w:cs="Courier New" w:eastAsia="Courier New" w:hAnsi="Courier New"/>
+                <w:sz w:val="19"/>
+                <w:szCs w:val="19"/>
+              </w:rPr>
+              <w:t xml:space="preserve">LISP fn.lisp</w:t>
+            </w:r>
+          </w:p>
+        </w:tc>
+        <w:tc>
+          <w:tcPr>
+            <w:tcW w:type="dxa" w:w="2100"/>
+            <w:tcMar>
+              <w:top w:type="dxa" w:w="60"/>
+              <w:left w:type="dxa" w:w="100"/>
+              <w:bottom w:type="dxa" w:w="60"/>
+              <w:right w:type="dxa" w:w="100"/>
+            </w:tcMar>
+          </w:tcPr>
+          <w:p>
+            <w:r>
+              <w:rPr>
+                <w:rFonts w:ascii="Courier New" w:cs="Courier New" w:eastAsia="Courier New" w:hAnsi="Courier New"/>
+                <w:sz w:val="19"/>
+                <w:szCs w:val="19"/>
+              </w:rPr>
+              <w:t xml:space="preserve">lisp fn.lisp</w:t>
+            </w:r>
+          </w:p>
+        </w:tc>
+        <w:tc>
+          <w:tcPr>
+            <w:tcW w:type="dxa" w:w="4038"/>
+            <w:tcMar>
+              <w:top w:type="dxa" w:w="60"/>
+              <w:left w:type="dxa" w:w="100"/>
+              <w:bottom w:type="dxa" w:w="60"/>
+              <w:right w:type="dxa" w:w="100"/>
+            </w:tcMar>
+          </w:tcPr>
+          <w:p>
+            <w:r>
+              <w:rPr>
+                <w:rFonts w:ascii="Times New Roman" w:cs="Times New Roman" w:eastAsia="Times New Roman" w:hAnsi="Times New Roman"/>
+                <w:sz w:val="19"/>
+                <w:szCs w:val="19"/>
+              </w:rPr>
+              <w:t xml:space="preserve">a Common Lisp subset; without a file, a read-eval-print loop</w:t>
+            </w:r>
+          </w:p>
+        </w:tc>
+      </w:tr>
+      <w:tr>
+        <w:trPr>
+          <w:cantSplit/>
+          <w:tblHeader w:val="false"/>
+        </w:trPr>
+        <w:tc>
+          <w:tcPr>
+            <w:tcW w:type="dxa" w:w="1400"/>
+            <w:tcMar>
+              <w:top w:type="dxa" w:w="60"/>
+              <w:left w:type="dxa" w:w="100"/>
+              <w:bottom w:type="dxa" w:w="60"/>
+              <w:right w:type="dxa" w:w="100"/>
+            </w:tcMar>
+          </w:tcPr>
+          <w:p>
+            <w:r>
+              <w:rPr>
+                <w:rFonts w:ascii="Times New Roman" w:cs="Times New Roman" w:eastAsia="Times New Roman" w:hAnsi="Times New Roman"/>
+                <w:sz w:val="19"/>
+                <w:szCs w:val="19"/>
+              </w:rPr>
+              <w:t xml:space="preserve">Smalltalk</w:t>
+            </w:r>
+          </w:p>
+        </w:tc>
+        <w:tc>
+          <w:tcPr>
+            <w:tcW w:type="dxa" w:w="2100"/>
+            <w:tcMar>
+              <w:top w:type="dxa" w:w="60"/>
+              <w:left w:type="dxa" w:w="100"/>
+              <w:bottom w:type="dxa" w:w="60"/>
+              <w:right w:type="dxa" w:w="100"/>
+            </w:tcMar>
+          </w:tcPr>
+          <w:p>
+            <w:r>
+              <w:rPr>
+                <w:rFonts w:ascii="Courier New" w:cs="Courier New" w:eastAsia="Courier New" w:hAnsi="Courier New"/>
+                <w:sz w:val="19"/>
+                <w:szCs w:val="19"/>
+              </w:rPr>
+              <w:t xml:space="preserve">SMALLTLK fn.st</w:t>
+            </w:r>
+          </w:p>
+        </w:tc>
+        <w:tc>
+          <w:tcPr>
+            <w:tcW w:type="dxa" w:w="2100"/>
+            <w:tcMar>
+              <w:top w:type="dxa" w:w="60"/>
+              <w:left w:type="dxa" w:w="100"/>
+              <w:bottom w:type="dxa" w:w="60"/>
+              <w:right w:type="dxa" w:w="100"/>
+            </w:tcMar>
+          </w:tcPr>
+          <w:p>
+            <w:r>
+              <w:rPr>
+                <w:rFonts w:ascii="Courier New" w:cs="Courier New" w:eastAsia="Courier New" w:hAnsi="Courier New"/>
+                <w:sz w:val="19"/>
+                <w:szCs w:val="19"/>
+              </w:rPr>
+              <w:t xml:space="preserve">smalltalk fn.st</w:t>
+            </w:r>
+          </w:p>
+        </w:tc>
+        <w:tc>
+          <w:tcPr>
+            <w:tcW w:type="dxa" w:w="4038"/>
+            <w:tcMar>
+              <w:top w:type="dxa" w:w="60"/>
+              <w:left w:type="dxa" w:w="100"/>
+              <w:bottom w:type="dxa" w:w="60"/>
+              <w:right w:type="dxa" w:w="100"/>
+            </w:tcMar>
+          </w:tcPr>
+          <w:p>
+            <w:r>
+              <w:rPr>
+                <w:rFonts w:ascii="Times New Roman" w:cs="Times New Roman" w:eastAsia="Times New Roman" w:hAnsi="Times New Roman"/>
+                <w:sz w:val="19"/>
+                <w:szCs w:val="19"/>
+              </w:rPr>
+              <w:t xml:space="preserve">Smalltalk-80 with GNU Smalltalk bracket syntax; class library in </w:t>
+            </w:r>
+            <w:r>
+              <w:rPr>
+                <w:rFonts w:ascii="Courier New" w:cs="Courier New" w:eastAsia="Courier New" w:hAnsi="Courier New"/>
+                <w:sz w:val="19"/>
+                <w:szCs w:val="19"/>
+              </w:rPr>
+              <w:t xml:space="preserve">*.ST</w:t>
+            </w:r>
+          </w:p>
+        </w:tc>
+      </w:tr>
+      <w:tr>
+        <w:trPr>
+          <w:cantSplit/>
+          <w:tblHeader w:val="false"/>
+        </w:trPr>
+        <w:tc>
+          <w:tcPr>
+            <w:tcW w:type="dxa" w:w="1400"/>
+            <w:tcMar>
+              <w:top w:type="dxa" w:w="60"/>
+              <w:left w:type="dxa" w:w="100"/>
+              <w:bottom w:type="dxa" w:w="60"/>
+              <w:right w:type="dxa" w:w="100"/>
+            </w:tcMar>
+          </w:tcPr>
+          <w:p>
+            <w:r>
+              <w:rPr>
+                <w:rFonts w:ascii="Times New Roman" w:cs="Times New Roman" w:eastAsia="Times New Roman" w:hAnsi="Times New Roman"/>
+                <w:sz w:val="19"/>
+                <w:szCs w:val="19"/>
+              </w:rPr>
+              <w:t xml:space="preserve">PL/M</w:t>
+            </w:r>
+          </w:p>
+        </w:tc>
+        <w:tc>
+          <w:tcPr>
+            <w:tcW w:type="dxa" w:w="2100"/>
+            <w:tcMar>
+              <w:top w:type="dxa" w:w="60"/>
+              <w:left w:type="dxa" w:w="100"/>
+              <w:bottom w:type="dxa" w:w="60"/>
+              <w:right w:type="dxa" w:w="100"/>
+            </w:tcMar>
+          </w:tcPr>
+          <w:p>
+            <w:r>
+              <w:rPr>
+                <w:rFonts w:ascii="Courier New" w:cs="Courier New" w:eastAsia="Courier New" w:hAnsi="Courier New"/>
+                <w:sz w:val="19"/>
+                <w:szCs w:val="19"/>
+              </w:rPr>
+              <w:t xml:space="preserve">PLM fn</w:t>
+            </w:r>
+          </w:p>
+        </w:tc>
+        <w:tc>
+          <w:tcPr>
+            <w:tcW w:type="dxa" w:w="2100"/>
+            <w:tcMar>
+              <w:top w:type="dxa" w:w="60"/>
+              <w:left w:type="dxa" w:w="100"/>
+              <w:bottom w:type="dxa" w:w="60"/>
+              <w:right w:type="dxa" w:w="100"/>
+            </w:tcMar>
+          </w:tcPr>
+          <w:p>
+            <w:r>
+              <w:rPr>
+                <w:rFonts w:ascii="Courier New" w:cs="Courier New" w:eastAsia="Courier New" w:hAnsi="Courier New"/>
+                <w:sz w:val="19"/>
+                <w:szCs w:val="19"/>
+              </w:rPr>
+              <w:t xml:space="preserve">plmc fn.plm</w:t>
+            </w:r>
+          </w:p>
+        </w:tc>
+        <w:tc>
+          <w:tcPr>
+            <w:tcW w:type="dxa" w:w="4038"/>
+            <w:tcMar>
+              <w:top w:type="dxa" w:w="60"/>
+              <w:left w:type="dxa" w:w="100"/>
+              <w:bottom w:type="dxa" w:w="60"/>
+              <w:right w:type="dxa" w:w="100"/>
+            </w:tcMar>
+          </w:tcPr>
+          <w:p>
+            <w:r>
+              <w:rPr>
+                <w:rFonts w:ascii="Times New Roman" w:cs="Times New Roman" w:eastAsia="Times New Roman" w:hAnsi="Times New Roman"/>
+                <w:sz w:val="19"/>
+                <w:szCs w:val="19"/>
+              </w:rPr>
+              <w:t xml:space="preserve">PL/M-80 compiled to cREXX; </w:t>
+            </w:r>
+            <w:r>
+              <w:rPr>
+                <w:rFonts w:ascii="Courier New" w:cs="Courier New" w:eastAsia="Courier New" w:hAnsi="Courier New"/>
+                <w:sz w:val="19"/>
+                <w:szCs w:val="19"/>
+              </w:rPr>
+              <w:t xml:space="preserve">( COMPILE</w:t>
+            </w:r>
+            <w:r>
+              <w:rPr>
+                <w:rFonts w:ascii="Times New Roman" w:cs="Times New Roman" w:eastAsia="Times New Roman" w:hAnsi="Times New Roman"/>
+                <w:sz w:val="19"/>
+                <w:szCs w:val="19"/>
+              </w:rPr>
+              <w:t xml:space="preserve"> or </w:t>
+            </w:r>
+            <w:r>
+              <w:rPr>
+                <w:rFonts w:ascii="Courier New" w:cs="Courier New" w:eastAsia="Courier New" w:hAnsi="Courier New"/>
+                <w:sz w:val="19"/>
+                <w:szCs w:val="19"/>
+              </w:rPr>
+              <w:t xml:space="preserve">-c</w:t>
+            </w:r>
+            <w:r>
+              <w:rPr>
+                <w:rFonts w:ascii="Times New Roman" w:cs="Times New Roman" w:eastAsia="Times New Roman" w:hAnsi="Times New Roman"/>
+                <w:sz w:val="19"/>
+                <w:szCs w:val="19"/>
+              </w:rPr>
+              <w:t xml:space="preserve"> compiles only</w:t>
+            </w:r>
+          </w:p>
+        </w:tc>
+      </w:tr>
+      <w:tr>
+        <w:trPr>
+          <w:cantSplit/>
+          <w:tblHeader w:val="false"/>
+        </w:trPr>
+        <w:tc>
+          <w:tcPr>
+            <w:tcW w:type="dxa" w:w="1400"/>
+            <w:tcMar>
+              <w:top w:type="dxa" w:w="60"/>
+              <w:left w:type="dxa" w:w="100"/>
+              <w:bottom w:type="dxa" w:w="60"/>
+              <w:right w:type="dxa" w:w="100"/>
+            </w:tcMar>
+          </w:tcPr>
+          <w:p>
+            <w:r>
+              <w:rPr>
+                <w:rFonts w:ascii="Times New Roman" w:cs="Times New Roman" w:eastAsia="Times New Roman" w:hAnsi="Times New Roman"/>
+                <w:sz w:val="19"/>
+                <w:szCs w:val="19"/>
+              </w:rPr>
+              <w:t xml:space="preserve">Prolog</w:t>
+            </w:r>
+          </w:p>
+        </w:tc>
+        <w:tc>
+          <w:tcPr>
+            <w:tcW w:type="dxa" w:w="2100"/>
+            <w:tcMar>
+              <w:top w:type="dxa" w:w="60"/>
+              <w:left w:type="dxa" w:w="100"/>
+              <w:bottom w:type="dxa" w:w="60"/>
+              <w:right w:type="dxa" w:w="100"/>
+            </w:tcMar>
+          </w:tcPr>
+          <w:p>
+            <w:r>
+              <w:rPr>
+                <w:rFonts w:ascii="Courier New" w:cs="Courier New" w:eastAsia="Courier New" w:hAnsi="Courier New"/>
+                <w:sz w:val="19"/>
+                <w:szCs w:val="19"/>
+              </w:rPr>
+              <w:t xml:space="preserve">PROLOG</w:t>
+            </w:r>
+          </w:p>
+        </w:tc>
+        <w:tc>
+          <w:tcPr>
+            <w:tcW w:type="dxa" w:w="2100"/>
+            <w:tcMar>
+              <w:top w:type="dxa" w:w="60"/>
+              <w:left w:type="dxa" w:w="100"/>
+              <w:bottom w:type="dxa" w:w="60"/>
+              <w:right w:type="dxa" w:w="100"/>
+            </w:tcMar>
+          </w:tcPr>
+          <w:p>
+            <w:r>
+              <w:rPr>
+                <w:rFonts w:ascii="Courier New" w:cs="Courier New" w:eastAsia="Courier New" w:hAnsi="Courier New"/>
+                <w:sz w:val="19"/>
+                <w:szCs w:val="19"/>
+              </w:rPr>
+              <w:t xml:space="preserve">prolog</w:t>
+            </w:r>
+          </w:p>
+        </w:tc>
+        <w:tc>
+          <w:tcPr>
+            <w:tcW w:type="dxa" w:w="4038"/>
+            <w:tcMar>
+              <w:top w:type="dxa" w:w="60"/>
+              <w:left w:type="dxa" w:w="100"/>
+              <w:bottom w:type="dxa" w:w="60"/>
+              <w:right w:type="dxa" w:w="100"/>
+            </w:tcMar>
+          </w:tcPr>
+          <w:p>
+            <w:r>
+              <w:rPr>
+                <w:rFonts w:ascii="Times New Roman" w:cs="Times New Roman" w:eastAsia="Times New Roman" w:hAnsi="Times New Roman"/>
+                <w:sz w:val="19"/>
+                <w:szCs w:val="19"/>
+              </w:rPr>
+              <w:t xml:space="preserve">consult files with </w:t>
+            </w:r>
+            <w:r>
+              <w:rPr>
+                <w:rFonts w:ascii="Courier New" w:cs="Courier New" w:eastAsia="Courier New" w:hAnsi="Courier New"/>
+                <w:sz w:val="19"/>
+                <w:szCs w:val="19"/>
+              </w:rPr>
+              <w:t xml:space="preserve">consult('family.pl')?</w:t>
+            </w:r>
+          </w:p>
+        </w:tc>
+      </w:tr>
+      <w:tr>
+        <w:trPr>
+          <w:cantSplit/>
+          <w:tblHeader w:val="false"/>
+        </w:trPr>
+        <w:tc>
+          <w:tcPr>
+            <w:tcW w:type="dxa" w:w="1400"/>
+            <w:tcMar>
+              <w:top w:type="dxa" w:w="60"/>
+              <w:left w:type="dxa" w:w="100"/>
+              <w:bottom w:type="dxa" w:w="60"/>
+              <w:right w:type="dxa" w:w="100"/>
+            </w:tcMar>
+          </w:tcPr>
+          <w:p>
+            <w:r>
+              <w:rPr>
+                <w:rFonts w:ascii="Times New Roman" w:cs="Times New Roman" w:eastAsia="Times New Roman" w:hAnsi="Times New Roman"/>
+                <w:sz w:val="19"/>
+                <w:szCs w:val="19"/>
+              </w:rPr>
+              <w:t xml:space="preserve">LOGO</w:t>
+            </w:r>
+          </w:p>
+        </w:tc>
+        <w:tc>
+          <w:tcPr>
+            <w:tcW w:type="dxa" w:w="2100"/>
+            <w:tcMar>
+              <w:top w:type="dxa" w:w="60"/>
+              <w:left w:type="dxa" w:w="100"/>
+              <w:bottom w:type="dxa" w:w="60"/>
+              <w:right w:type="dxa" w:w="100"/>
+            </w:tcMar>
+          </w:tcPr>
+          <w:p>
+            <w:r>
+              <w:rPr>
+                <w:rFonts w:ascii="Courier New" w:cs="Courier New" w:eastAsia="Courier New" w:hAnsi="Courier New"/>
+                <w:sz w:val="19"/>
+                <w:szCs w:val="19"/>
+              </w:rPr>
+              <w:t xml:space="preserve">LOGO fn.logo out</w:t>
+            </w:r>
+          </w:p>
+        </w:tc>
+        <w:tc>
+          <w:tcPr>
+            <w:tcW w:type="dxa" w:w="2100"/>
+            <w:tcMar>
+              <w:top w:type="dxa" w:w="60"/>
+              <w:left w:type="dxa" w:w="100"/>
+              <w:bottom w:type="dxa" w:w="60"/>
+              <w:right w:type="dxa" w:w="100"/>
+            </w:tcMar>
+          </w:tcPr>
+          <w:p>
+            <w:r>
+              <w:rPr>
+                <w:rFonts w:ascii="Courier New" w:cs="Courier New" w:eastAsia="Courier New" w:hAnsi="Courier New"/>
+                <w:sz w:val="19"/>
+                <w:szCs w:val="19"/>
+              </w:rPr>
+              <w:t xml:space="preserve">logo fn.logo out.svg</w:t>
+            </w:r>
+          </w:p>
+        </w:tc>
+        <w:tc>
+          <w:tcPr>
+            <w:tcW w:type="dxa" w:w="4038"/>
+            <w:tcMar>
+              <w:top w:type="dxa" w:w="60"/>
+              <w:left w:type="dxa" w:w="100"/>
+              <w:bottom w:type="dxa" w:w="60"/>
+              <w:right w:type="dxa" w:w="100"/>
+            </w:tcMar>
+          </w:tcPr>
+          <w:p>
+            <w:r>
+              <w:rPr>
+                <w:rFonts w:ascii="Times New Roman" w:cs="Times New Roman" w:eastAsia="Times New Roman" w:hAnsi="Times New Roman"/>
+                <w:sz w:val="19"/>
+                <w:szCs w:val="19"/>
+              </w:rPr>
+              <w:t xml:space="preserve">turtle graphics written as SVG</w:t>
+            </w:r>
+          </w:p>
+        </w:tc>
+      </w:tr>
+    </w:tbl>
+    <w:p>
+      <w:pPr>
+        <w:spacing w:after="200" w:before="80"/>
+      </w:pPr>
+      <w:r>
+        <w:rPr>
+          <w:rFonts w:ascii="Arial" w:cs="Arial" w:eastAsia="Arial" w:hAnsi="Arial"/>
+          <w:b/>
+          <w:bCs/>
+          <w:sz w:val="18"/>
+          <w:szCs w:val="18"/>
+        </w:rPr>
+        <w:t xml:space="preserve">Figure 18. </w:t>
+      </w:r>
+      <w:r>
+        <w:rPr>
+          <w:rFonts w:ascii="Arial" w:cs="Arial" w:eastAsia="Arial" w:hAnsi="Arial"/>
+          <w:sz w:val="18"/>
+          <w:szCs w:val="18"/>
+        </w:rPr>
+        <w:t xml:space="preserve">Languages in cREXX</w:t>
+      </w:r>
+    </w:p>
+    <w:p>
+      <w:pPr>
+        <w:spacing w:after="120"/>
+      </w:pPr>
+      <w:r>
+        <w:rPr>
+          <w:rFonts w:ascii="Times New Roman" w:cs="Times New Roman" w:eastAsia="Times New Roman" w:hAnsi="Times New Roman"/>
+        </w:rPr>
+        <w:t xml:space="preserve">On CMS the languages arrive as one reader deck (</w:t>
+      </w:r>
+      <w:r>
+        <w:rPr>
+          <w:rFonts w:ascii="Courier New" w:cs="Courier New" w:eastAsia="Courier New" w:hAnsi="Courier New"/>
+          <w:sz w:val="19"/>
+          <w:szCs w:val="19"/>
+        </w:rPr>
+        <w:t xml:space="preserve">LANGS</w:t>
+      </w:r>
+      <w:r>
+        <w:rPr>
+          <w:rFonts w:ascii="Times New Roman" w:cs="Times New Roman" w:eastAsia="Times New Roman" w:hAnsi="Times New Roman"/>
+        </w:rPr>
+        <w:t xml:space="preserve">); </w:t>
+      </w:r>
+      <w:r>
+        <w:rPr>
+          <w:rFonts w:ascii="Courier New" w:cs="Courier New" w:eastAsia="Courier New" w:hAnsi="Courier New"/>
+          <w:sz w:val="19"/>
+          <w:szCs w:val="19"/>
+        </w:rPr>
+        <w:t xml:space="preserve">READCARD *</w:t>
+      </w:r>
+      <w:r>
+        <w:rPr>
+          <w:rFonts w:ascii="Times New Roman" w:cs="Times New Roman" w:eastAsia="Times New Roman" w:hAnsi="Times New Roman"/>
+        </w:rPr>
+        <w:t xml:space="preserve"> puts the files on your A disk and </w:t>
+      </w:r>
+      <w:r>
+        <w:rPr>
+          <w:rFonts w:ascii="Courier New" w:cs="Courier New" w:eastAsia="Courier New" w:hAnsi="Courier New"/>
+          <w:sz w:val="19"/>
+          <w:szCs w:val="19"/>
+        </w:rPr>
+        <w:t xml:space="preserve">LANGSUP EXEC</w:t>
+      </w:r>
+      <w:r>
+        <w:rPr>
+          <w:rFonts w:ascii="Times New Roman" w:cs="Times New Roman" w:eastAsia="Times New Roman" w:hAnsi="Times New Roman"/>
+        </w:rPr>
+        <w:t xml:space="preserve"> rebuilds the modules from their hex form. Use one of CMSUSER’s large disks as A for it (for example </w:t>
+      </w:r>
+      <w:r>
+        <w:rPr>
+          <w:rFonts w:ascii="Courier New" w:cs="Courier New" w:eastAsia="Courier New" w:hAnsi="Courier New"/>
+          <w:sz w:val="19"/>
+          <w:szCs w:val="19"/>
+        </w:rPr>
+        <w:t xml:space="preserve">ACCESS 196 A</w:t>
+      </w:r>
+      <w:r>
+        <w:rPr>
+          <w:rFonts w:ascii="Times New Roman" w:cs="Times New Roman" w:eastAsia="Times New Roman" w:hAnsi="Times New Roman"/>
+        </w:rPr>
+        <w:t xml:space="preserve">). CMS cuts a command argument to eight characters, so the EXECs pass file names through the program stack: type the names as usual.</w:t>
+      </w:r>
+    </w:p>
+    <w:p>
+      <w:pPr>
+        <w:spacing w:after="120"/>
+      </w:pPr>
+      <w:r>
+        <w:rPr>
+          <w:rFonts w:ascii="Times New Roman" w:cs="Times New Roman" w:eastAsia="Times New Roman" w:hAnsi="Times New Roman"/>
+        </w:rPr>
+        <w:t xml:space="preserve">On Debian the languages are part of the cREXX bundle (</w:t>
+      </w:r>
+      <w:r>
+        <w:rPr>
+          <w:rFonts w:ascii="Courier New" w:cs="Courier New" w:eastAsia="Courier New" w:hAnsi="Courier New"/>
+          <w:sz w:val="19"/>
+          <w:szCs w:val="19"/>
+        </w:rPr>
+        <w:t xml:space="preserve">lxcrexx.tgz</w:t>
+      </w:r>
+      <w:r>
+        <w:rPr>
+          <w:rFonts w:ascii="Times New Roman" w:cs="Times New Roman" w:eastAsia="Times New Roman" w:hAnsi="Times New Roman"/>
+        </w:rPr>
+        <w:t xml:space="preserve">), unpacked under </w:t>
+      </w:r>
+      <w:r>
+        <w:rPr>
+          <w:rFonts w:ascii="Courier New" w:cs="Courier New" w:eastAsia="Courier New" w:hAnsi="Courier New"/>
+          <w:sz w:val="19"/>
+          <w:szCs w:val="19"/>
+        </w:rPr>
+        <w:t xml:space="preserve">/usr/local</w:t>
+      </w:r>
+      <w:r>
+        <w:rPr>
+          <w:rFonts w:ascii="Times New Roman" w:cs="Times New Roman" w:eastAsia="Times New Roman" w:hAnsi="Times New Roman"/>
+        </w:rPr>
+        <w:t xml:space="preserve">; the examples are in </w:t>
+      </w:r>
+      <w:r>
+        <w:rPr>
+          <w:rFonts w:ascii="Courier New" w:cs="Courier New" w:eastAsia="Courier New" w:hAnsi="Courier New"/>
+          <w:sz w:val="19"/>
+          <w:szCs w:val="19"/>
+        </w:rPr>
+        <w:t xml:space="preserve">/usr/local/share/</w:t>
+      </w:r>
+      <w:r>
+        <w:rPr>
+          <w:rFonts w:ascii="Times New Roman" w:cs="Times New Roman" w:eastAsia="Times New Roman" w:hAnsi="Times New Roman"/>
+          <w:i/>
+          <w:iCs/>
+        </w:rPr>
+        <w:t xml:space="preserve">language</w:t>
+      </w:r>
+      <w:r>
+        <w:rPr>
+          <w:rFonts w:ascii="Times New Roman" w:cs="Times New Roman" w:eastAsia="Times New Roman" w:hAnsi="Times New Roman"/>
+        </w:rPr>
+        <w:t xml:space="preserve">.</w:t>
+      </w:r>
+    </w:p>
+    <w:p>
+      <w:pPr>
+        <w:pStyle w:val="Heading2"/>
+      </w:pPr>
+      <w:r>
+        <w:t xml:space="preserve">Turbo CREXX</w:t>
+      </w:r>
+    </w:p>
+    <w:p>
+      <w:pPr>
+        <w:spacing w:after="120"/>
+      </w:pPr>
+      <w:r>
+        <w:rPr>
+          <w:rFonts w:ascii="Times New Roman" w:cs="Times New Roman" w:eastAsia="Times New Roman" w:hAnsi="Times New Roman"/>
+        </w:rPr>
+        <w:t xml:space="preserve">Turbo CREXX is a small Turbo-Pascal-style front end: a menu that creates, edits, compiles and runs one cREXX program at a time. It does not implement REXX; it calls the real cREXX tools.</w:t>
+      </w:r>
+    </w:p>
+    <w:tbl>
+      <w:tblPr>
+        <w:tblW w:type="dxa" w:w="9638"/>
+        <w:tblBorders>
+          <w:top w:val="single" w:color="808080" w:sz="4"/>
+          <w:left w:val="single" w:color="808080" w:sz="4"/>
+          <w:bottom w:val="single" w:color="808080" w:sz="4"/>
+          <w:right w:val="single" w:color="808080" w:sz="4"/>
+          <w:insideH w:val="single" w:color="808080" w:sz="4"/>
+          <w:insideV w:val="single" w:color="808080" w:sz="4"/>
+        </w:tblBorders>
+      </w:tblPr>
+      <w:tblGrid>
+        <w:gridCol w:w="1400"/>
+        <w:gridCol w:w="8238"/>
+      </w:tblGrid>
+      <w:tr>
+        <w:trPr>
+          <w:cantSplit/>
+          <w:tblHeader/>
+        </w:trPr>
+        <w:tc>
+          <w:tcPr>
+            <w:tcW w:type="dxa" w:w="1400"/>
+            <w:shd w:fill="D9D9D9" w:color="auto" w:val="clear"/>
+            <w:tcMar>
+              <w:top w:type="dxa" w:w="60"/>
+              <w:left w:type="dxa" w:w="100"/>
+              <w:bottom w:type="dxa" w:w="60"/>
+              <w:right w:type="dxa" w:w="100"/>
+            </w:tcMar>
+          </w:tcPr>
+          <w:p>
+            <w:r>
+              <w:rPr>
+                <w:rFonts w:ascii="Arial" w:cs="Arial" w:eastAsia="Arial" w:hAnsi="Arial"/>
+                <w:b/>
+                <w:bCs/>
+                <w:sz w:val="18"/>
+                <w:szCs w:val="18"/>
+              </w:rPr>
+              <w:t xml:space="preserve">Key</w:t>
+            </w:r>
+          </w:p>
+        </w:tc>
+        <w:tc>
+          <w:tcPr>
+            <w:tcW w:type="dxa" w:w="8238"/>
+            <w:shd w:fill="D9D9D9" w:color="auto" w:val="clear"/>
+            <w:tcMar>
+              <w:top w:type="dxa" w:w="60"/>
+              <w:left w:type="dxa" w:w="100"/>
+              <w:bottom w:type="dxa" w:w="60"/>
+              <w:right w:type="dxa" w:w="100"/>
+            </w:tcMar>
+          </w:tcPr>
+          <w:p>
+            <w:r>
+              <w:rPr>
+                <w:rFonts w:ascii="Arial" w:cs="Arial" w:eastAsia="Arial" w:hAnsi="Arial"/>
+                <w:b/>
+                <w:bCs/>
+                <w:sz w:val="18"/>
+                <w:szCs w:val="18"/>
+              </w:rPr>
+              <w:t xml:space="preserve">Action</w:t>
+            </w:r>
+          </w:p>
+        </w:tc>
+      </w:tr>
+      <w:tr>
+        <w:trPr>
+          <w:cantSplit/>
+          <w:tblHeader w:val="false"/>
+        </w:trPr>
+        <w:tc>
+          <w:tcPr>
+            <w:tcW w:type="dxa" w:w="1400"/>
+            <w:tcMar>
+              <w:top w:type="dxa" w:w="60"/>
+              <w:left w:type="dxa" w:w="100"/>
+              <w:bottom w:type="dxa" w:w="60"/>
+              <w:right w:type="dxa" w:w="100"/>
+            </w:tcMar>
+          </w:tcPr>
+          <w:p>
+            <w:r>
+              <w:rPr>
+                <w:rFonts w:ascii="Times New Roman" w:cs="Times New Roman" w:eastAsia="Times New Roman" w:hAnsi="Times New Roman"/>
+                <w:sz w:val="19"/>
+                <w:szCs w:val="19"/>
+              </w:rPr>
+              <w:t xml:space="preserve">N</w:t>
+            </w:r>
+          </w:p>
+        </w:tc>
+        <w:tc>
+          <w:tcPr>
+            <w:tcW w:type="dxa" w:w="8238"/>
+            <w:tcMar>
+              <w:top w:type="dxa" w:w="60"/>
+              <w:left w:type="dxa" w:w="100"/>
+              <w:bottom w:type="dxa" w:w="60"/>
+              <w:right w:type="dxa" w:w="100"/>
+            </w:tcMar>
+          </w:tcPr>
+          <w:p>
+            <w:r>
+              <w:rPr>
+                <w:rFonts w:ascii="Times New Roman" w:cs="Times New Roman" w:eastAsia="Times New Roman" w:hAnsi="Times New Roman"/>
+                <w:sz w:val="19"/>
+                <w:szCs w:val="19"/>
+              </w:rPr>
+              <w:t xml:space="preserve">new program (from a template), then edit it</w:t>
+            </w:r>
+          </w:p>
+        </w:tc>
+      </w:tr>
+      <w:tr>
+        <w:trPr>
+          <w:cantSplit/>
+          <w:tblHeader w:val="false"/>
+        </w:trPr>
+        <w:tc>
+          <w:tcPr>
+            <w:tcW w:type="dxa" w:w="1400"/>
+            <w:tcMar>
+              <w:top w:type="dxa" w:w="60"/>
+              <w:left w:type="dxa" w:w="100"/>
+              <w:bottom w:type="dxa" w:w="60"/>
+              <w:right w:type="dxa" w:w="100"/>
+            </w:tcMar>
+          </w:tcPr>
+          <w:p>
+            <w:r>
+              <w:rPr>
+                <w:rFonts w:ascii="Times New Roman" w:cs="Times New Roman" w:eastAsia="Times New Roman" w:hAnsi="Times New Roman"/>
+                <w:sz w:val="19"/>
+                <w:szCs w:val="19"/>
+              </w:rPr>
+              <w:t xml:space="preserve">O / E</w:t>
+            </w:r>
+          </w:p>
+        </w:tc>
+        <w:tc>
+          <w:tcPr>
+            <w:tcW w:type="dxa" w:w="8238"/>
+            <w:tcMar>
+              <w:top w:type="dxa" w:w="60"/>
+              <w:left w:type="dxa" w:w="100"/>
+              <w:bottom w:type="dxa" w:w="60"/>
+              <w:right w:type="dxa" w:w="100"/>
+            </w:tcMar>
+          </w:tcPr>
+          <w:p>
+            <w:r>
+              <w:rPr>
+                <w:rFonts w:ascii="Times New Roman" w:cs="Times New Roman" w:eastAsia="Times New Roman" w:hAnsi="Times New Roman"/>
+                <w:sz w:val="19"/>
+                <w:szCs w:val="19"/>
+              </w:rPr>
+              <w:t xml:space="preserve">open an existing program; edit it</w:t>
+            </w:r>
+          </w:p>
+        </w:tc>
+      </w:tr>
+      <w:tr>
+        <w:trPr>
+          <w:cantSplit/>
+          <w:tblHeader w:val="false"/>
+        </w:trPr>
+        <w:tc>
+          <w:tcPr>
+            <w:tcW w:type="dxa" w:w="1400"/>
+            <w:tcMar>
+              <w:top w:type="dxa" w:w="60"/>
+              <w:left w:type="dxa" w:w="100"/>
+              <w:bottom w:type="dxa" w:w="60"/>
+              <w:right w:type="dxa" w:w="100"/>
+            </w:tcMar>
+          </w:tcPr>
+          <w:p>
+            <w:r>
+              <w:rPr>
+                <w:rFonts w:ascii="Times New Roman" w:cs="Times New Roman" w:eastAsia="Times New Roman" w:hAnsi="Times New Roman"/>
+                <w:sz w:val="19"/>
+                <w:szCs w:val="19"/>
+              </w:rPr>
+              <w:t xml:space="preserve">C</w:t>
+            </w:r>
+          </w:p>
+        </w:tc>
+        <w:tc>
+          <w:tcPr>
+            <w:tcW w:type="dxa" w:w="8238"/>
+            <w:tcMar>
+              <w:top w:type="dxa" w:w="60"/>
+              <w:left w:type="dxa" w:w="100"/>
+              <w:bottom w:type="dxa" w:w="60"/>
+              <w:right w:type="dxa" w:w="100"/>
+            </w:tcMar>
+          </w:tcPr>
+          <w:p>
+            <w:r>
+              <w:rPr>
+                <w:rFonts w:ascii="Times New Roman" w:cs="Times New Roman" w:eastAsia="Times New Roman" w:hAnsi="Times New Roman"/>
+                <w:sz w:val="19"/>
+                <w:szCs w:val="19"/>
+              </w:rPr>
+              <w:t xml:space="preserve">compile: compiler and assembler, no run</w:t>
+            </w:r>
+          </w:p>
+        </w:tc>
+      </w:tr>
+      <w:tr>
+        <w:trPr>
+          <w:cantSplit/>
+          <w:tblHeader w:val="false"/>
+        </w:trPr>
+        <w:tc>
+          <w:tcPr>
+            <w:tcW w:type="dxa" w:w="1400"/>
+            <w:tcMar>
+              <w:top w:type="dxa" w:w="60"/>
+              <w:left w:type="dxa" w:w="100"/>
+              <w:bottom w:type="dxa" w:w="60"/>
+              <w:right w:type="dxa" w:w="100"/>
+            </w:tcMar>
+          </w:tcPr>
+          <w:p>
+            <w:r>
+              <w:rPr>
+                <w:rFonts w:ascii="Times New Roman" w:cs="Times New Roman" w:eastAsia="Times New Roman" w:hAnsi="Times New Roman"/>
+                <w:sz w:val="19"/>
+                <w:szCs w:val="19"/>
+              </w:rPr>
+              <w:t xml:space="preserve">R</w:t>
+            </w:r>
+          </w:p>
+        </w:tc>
+        <w:tc>
+          <w:tcPr>
+            <w:tcW w:type="dxa" w:w="8238"/>
+            <w:tcMar>
+              <w:top w:type="dxa" w:w="60"/>
+              <w:left w:type="dxa" w:w="100"/>
+              <w:bottom w:type="dxa" w:w="60"/>
+              <w:right w:type="dxa" w:w="100"/>
+            </w:tcMar>
+          </w:tcPr>
+          <w:p>
+            <w:r>
+              <w:rPr>
+                <w:rFonts w:ascii="Times New Roman" w:cs="Times New Roman" w:eastAsia="Times New Roman" w:hAnsi="Times New Roman"/>
+                <w:sz w:val="19"/>
+                <w:szCs w:val="19"/>
+              </w:rPr>
+              <w:t xml:space="preserve">compile and run</w:t>
+            </w:r>
+          </w:p>
+        </w:tc>
+      </w:tr>
+      <w:tr>
+        <w:trPr>
+          <w:cantSplit/>
+          <w:tblHeader w:val="false"/>
+        </w:trPr>
+        <w:tc>
+          <w:tcPr>
+            <w:tcW w:type="dxa" w:w="1400"/>
+            <w:tcMar>
+              <w:top w:type="dxa" w:w="60"/>
+              <w:left w:type="dxa" w:w="100"/>
+              <w:bottom w:type="dxa" w:w="60"/>
+              <w:right w:type="dxa" w:w="100"/>
+            </w:tcMar>
+          </w:tcPr>
+          <w:p>
+            <w:r>
+              <w:rPr>
+                <w:rFonts w:ascii="Times New Roman" w:cs="Times New Roman" w:eastAsia="Times New Roman" w:hAnsi="Times New Roman"/>
+                <w:sz w:val="19"/>
+                <w:szCs w:val="19"/>
+              </w:rPr>
+              <w:t xml:space="preserve">L</w:t>
+            </w:r>
+          </w:p>
+        </w:tc>
+        <w:tc>
+          <w:tcPr>
+            <w:tcW w:type="dxa" w:w="8238"/>
+            <w:tcMar>
+              <w:top w:type="dxa" w:w="60"/>
+              <w:left w:type="dxa" w:w="100"/>
+              <w:bottom w:type="dxa" w:w="60"/>
+              <w:right w:type="dxa" w:w="100"/>
+            </w:tcMar>
+          </w:tcPr>
+          <w:p>
+            <w:r>
+              <w:rPr>
+                <w:rFonts w:ascii="Times New Roman" w:cs="Times New Roman" w:eastAsia="Times New Roman" w:hAnsi="Times New Roman"/>
+                <w:sz w:val="19"/>
+                <w:szCs w:val="19"/>
+              </w:rPr>
+              <w:t xml:space="preserve">copy an example (hello, fibfact) to your disk or directory</w:t>
+            </w:r>
+          </w:p>
+        </w:tc>
+      </w:tr>
+      <w:tr>
+        <w:trPr>
+          <w:cantSplit/>
+          <w:tblHeader w:val="false"/>
+        </w:trPr>
+        <w:tc>
+          <w:tcPr>
+            <w:tcW w:type="dxa" w:w="1400"/>
+            <w:tcMar>
+              <w:top w:type="dxa" w:w="60"/>
+              <w:left w:type="dxa" w:w="100"/>
+              <w:bottom w:type="dxa" w:w="60"/>
+              <w:right w:type="dxa" w:w="100"/>
+            </w:tcMar>
+          </w:tcPr>
+          <w:p>
+            <w:r>
+              <w:rPr>
+                <w:rFonts w:ascii="Times New Roman" w:cs="Times New Roman" w:eastAsia="Times New Roman" w:hAnsi="Times New Roman"/>
+                <w:sz w:val="19"/>
+                <w:szCs w:val="19"/>
+              </w:rPr>
+              <w:t xml:space="preserve">D</w:t>
+            </w:r>
+          </w:p>
+        </w:tc>
+        <w:tc>
+          <w:tcPr>
+            <w:tcW w:type="dxa" w:w="8238"/>
+            <w:tcMar>
+              <w:top w:type="dxa" w:w="60"/>
+              <w:left w:type="dxa" w:w="100"/>
+              <w:bottom w:type="dxa" w:w="60"/>
+              <w:right w:type="dxa" w:w="100"/>
+            </w:tcMar>
+          </w:tcPr>
+          <w:p>
+            <w:r>
+              <w:rPr>
+                <w:rFonts w:ascii="Times New Roman" w:cs="Times New Roman" w:eastAsia="Times New Roman" w:hAnsi="Times New Roman"/>
+                <w:sz w:val="19"/>
+                <w:szCs w:val="19"/>
+              </w:rPr>
+              <w:t xml:space="preserve">show the versions of the tools</w:t>
+            </w:r>
+          </w:p>
+        </w:tc>
+      </w:tr>
+      <w:tr>
+        <w:trPr>
+          <w:cantSplit/>
+          <w:tblHeader w:val="false"/>
+        </w:trPr>
+        <w:tc>
+          <w:tcPr>
+            <w:tcW w:type="dxa" w:w="1400"/>
+            <w:tcMar>
+              <w:top w:type="dxa" w:w="60"/>
+              <w:left w:type="dxa" w:w="100"/>
+              <w:bottom w:type="dxa" w:w="60"/>
+              <w:right w:type="dxa" w:w="100"/>
+            </w:tcMar>
+          </w:tcPr>
+          <w:p>
+            <w:r>
+              <w:rPr>
+                <w:rFonts w:ascii="Times New Roman" w:cs="Times New Roman" w:eastAsia="Times New Roman" w:hAnsi="Times New Roman"/>
+                <w:sz w:val="19"/>
+                <w:szCs w:val="19"/>
+              </w:rPr>
+              <w:t xml:space="preserve">Q</w:t>
+            </w:r>
+          </w:p>
+        </w:tc>
+        <w:tc>
+          <w:tcPr>
+            <w:tcW w:type="dxa" w:w="8238"/>
+            <w:tcMar>
+              <w:top w:type="dxa" w:w="60"/>
+              <w:left w:type="dxa" w:w="100"/>
+              <w:bottom w:type="dxa" w:w="60"/>
+              <w:right w:type="dxa" w:w="100"/>
+            </w:tcMar>
+          </w:tcPr>
+          <w:p>
+            <w:r>
+              <w:rPr>
+                <w:rFonts w:ascii="Times New Roman" w:cs="Times New Roman" w:eastAsia="Times New Roman" w:hAnsi="Times New Roman"/>
+                <w:sz w:val="19"/>
+                <w:szCs w:val="19"/>
+              </w:rPr>
+              <w:t xml:space="preserve">quit</w:t>
+            </w:r>
+          </w:p>
+        </w:tc>
+      </w:tr>
+    </w:tbl>
+    <w:p>
+      <w:pPr>
+        <w:spacing w:after="200" w:before="80"/>
+      </w:pPr>
+      <w:r>
+        <w:rPr>
+          <w:rFonts w:ascii="Arial" w:cs="Arial" w:eastAsia="Arial" w:hAnsi="Arial"/>
+          <w:b/>
+          <w:bCs/>
+          <w:sz w:val="18"/>
+          <w:szCs w:val="18"/>
+        </w:rPr>
+        <w:t xml:space="preserve">Figure 19. </w:t>
+      </w:r>
+      <w:r>
+        <w:rPr>
+          <w:rFonts w:ascii="Arial" w:cs="Arial" w:eastAsia="Arial" w:hAnsi="Arial"/>
+          <w:sz w:val="18"/>
+          <w:szCs w:val="18"/>
+        </w:rPr>
+        <w:t xml:space="preserve">Turbo CREXX menu</w:t>
+      </w:r>
+    </w:p>
+    <w:p>
+      <w:pPr>
+        <w:spacing w:after="120"/>
+      </w:pPr>
+      <w:r>
+        <w:rPr>
+          <w:rFonts w:ascii="Times New Roman" w:cs="Times New Roman" w:eastAsia="Times New Roman" w:hAnsi="Times New Roman"/>
+          <w:b/>
+          <w:bCs/>
+        </w:rPr>
+        <w:t xml:space="preserve">On Debian</w:t>
+      </w:r>
+      <w:r>
+        <w:rPr>
+          <w:rFonts w:ascii="Times New Roman" w:cs="Times New Roman" w:eastAsia="Times New Roman" w:hAnsi="Times New Roman"/>
+        </w:rPr>
+        <w:t xml:space="preserve">, type </w:t>
+      </w:r>
+      <w:r>
+        <w:rPr>
+          <w:rFonts w:ascii="Courier New" w:cs="Courier New" w:eastAsia="Courier New" w:hAnsi="Courier New"/>
+          <w:sz w:val="19"/>
+          <w:szCs w:val="19"/>
+        </w:rPr>
+        <w:t xml:space="preserve">turbocrexx</w:t>
+      </w:r>
+      <w:r>
+        <w:rPr>
+          <w:rFonts w:ascii="Times New Roman" w:cs="Times New Roman" w:eastAsia="Times New Roman" w:hAnsi="Times New Roman"/>
+        </w:rPr>
+        <w:t xml:space="preserve"> (or </w:t>
+      </w:r>
+      <w:r>
+        <w:rPr>
+          <w:rFonts w:ascii="Courier New" w:cs="Courier New" w:eastAsia="Courier New" w:hAnsi="Courier New"/>
+          <w:sz w:val="19"/>
+          <w:szCs w:val="19"/>
+        </w:rPr>
+        <w:t xml:space="preserve">turbocrexx</w:t>
+      </w:r>
+      <w:r>
+        <w:rPr>
+          <w:rFonts w:ascii="Times New Roman" w:cs="Times New Roman" w:eastAsia="Times New Roman" w:hAnsi="Times New Roman"/>
+        </w:rPr>
+        <w:t xml:space="preserve"> </w:t>
+      </w:r>
+      <w:r>
+        <w:rPr>
+          <w:rFonts w:ascii="Times New Roman" w:cs="Times New Roman" w:eastAsia="Times New Roman" w:hAnsi="Times New Roman"/>
+          <w:i/>
+          <w:iCs/>
+        </w:rPr>
+        <w:t xml:space="preserve">file</w:t>
+      </w:r>
+      <w:r>
+        <w:rPr>
+          <w:rFonts w:ascii="Courier New" w:cs="Courier New" w:eastAsia="Courier New" w:hAnsi="Courier New"/>
+          <w:sz w:val="19"/>
+          <w:szCs w:val="19"/>
+        </w:rPr>
+        <w:t xml:space="preserve">.crexx</w:t>
+      </w:r>
+      <w:r>
+        <w:rPr>
+          <w:rFonts w:ascii="Times New Roman" w:cs="Times New Roman" w:eastAsia="Times New Roman" w:hAnsi="Times New Roman"/>
+        </w:rPr>
+        <w:t xml:space="preserve">). The editor is </w:t>
+      </w:r>
+      <w:r>
+        <w:rPr>
+          <w:rFonts w:ascii="Courier New" w:cs="Courier New" w:eastAsia="Courier New" w:hAnsi="Courier New"/>
+          <w:sz w:val="19"/>
+          <w:szCs w:val="19"/>
+        </w:rPr>
+        <w:t xml:space="preserve">$EDITOR</w:t>
+      </w:r>
+      <w:r>
+        <w:rPr>
+          <w:rFonts w:ascii="Times New Roman" w:cs="Times New Roman" w:eastAsia="Times New Roman" w:hAnsi="Times New Roman"/>
+        </w:rPr>
+        <w:t xml:space="preserve">, else nano or vi. Underneath, </w:t>
+      </w:r>
+      <w:r>
+        <w:rPr>
+          <w:rFonts w:ascii="Courier New" w:cs="Courier New" w:eastAsia="Courier New" w:hAnsi="Courier New"/>
+          <w:sz w:val="19"/>
+          <w:szCs w:val="19"/>
+        </w:rPr>
+        <w:t xml:space="preserve">crexx</w:t>
+      </w:r>
+      <w:r>
+        <w:rPr>
+          <w:rFonts w:ascii="Times New Roman" w:cs="Times New Roman" w:eastAsia="Times New Roman" w:hAnsi="Times New Roman"/>
+        </w:rPr>
+        <w:t xml:space="preserve"> </w:t>
+      </w:r>
+      <w:r>
+        <w:rPr>
+          <w:rFonts w:ascii="Times New Roman" w:cs="Times New Roman" w:eastAsia="Times New Roman" w:hAnsi="Times New Roman"/>
+          <w:i/>
+          <w:iCs/>
+        </w:rPr>
+        <w:t xml:space="preserve">file</w:t>
+      </w:r>
+      <w:r>
+        <w:rPr>
+          <w:rFonts w:ascii="Courier New" w:cs="Courier New" w:eastAsia="Courier New" w:hAnsi="Courier New"/>
+          <w:sz w:val="19"/>
+          <w:szCs w:val="19"/>
+        </w:rPr>
+        <w:t xml:space="preserve">.crexx</w:t>
+      </w:r>
+      <w:r>
+        <w:rPr>
+          <w:rFonts w:ascii="Times New Roman" w:cs="Times New Roman" w:eastAsia="Times New Roman" w:hAnsi="Times New Roman"/>
+        </w:rPr>
+        <w:t xml:space="preserve"> compiles and runs a program (</w:t>
+      </w:r>
+      <w:r>
+        <w:rPr>
+          <w:rFonts w:ascii="Courier New" w:cs="Courier New" w:eastAsia="Courier New" w:hAnsi="Courier New"/>
+          <w:sz w:val="19"/>
+          <w:szCs w:val="19"/>
+        </w:rPr>
+        <w:t xml:space="preserve">crexx -noexec</w:t>
+      </w:r>
+      <w:r>
+        <w:rPr>
+          <w:rFonts w:ascii="Times New Roman" w:cs="Times New Roman" w:eastAsia="Times New Roman" w:hAnsi="Times New Roman"/>
+        </w:rPr>
+        <w:t xml:space="preserve"> only compiles): a small driver of VM/370+ for </w:t>
+      </w:r>
+      <w:r>
+        <w:rPr>
+          <w:rFonts w:ascii="Courier New" w:cs="Courier New" w:eastAsia="Courier New" w:hAnsi="Courier New"/>
+          <w:sz w:val="19"/>
+          <w:szCs w:val="19"/>
+        </w:rPr>
+        <w:t xml:space="preserve">rxc</w:t>
+      </w:r>
+      <w:r>
+        <w:rPr>
+          <w:rFonts w:ascii="Times New Roman" w:cs="Times New Roman" w:eastAsia="Times New Roman" w:hAnsi="Times New Roman"/>
+        </w:rPr>
+        <w:t xml:space="preserve">, </w:t>
+      </w:r>
+      <w:r>
+        <w:rPr>
+          <w:rFonts w:ascii="Courier New" w:cs="Courier New" w:eastAsia="Courier New" w:hAnsi="Courier New"/>
+          <w:sz w:val="19"/>
+          <w:szCs w:val="19"/>
+        </w:rPr>
+        <w:t xml:space="preserve">rxas</w:t>
+      </w:r>
+      <w:r>
+        <w:rPr>
+          <w:rFonts w:ascii="Times New Roman" w:cs="Times New Roman" w:eastAsia="Times New Roman" w:hAnsi="Times New Roman"/>
+        </w:rPr>
+        <w:t xml:space="preserve"> and </w:t>
+      </w:r>
+      <w:r>
+        <w:rPr>
+          <w:rFonts w:ascii="Courier New" w:cs="Courier New" w:eastAsia="Courier New" w:hAnsi="Courier New"/>
+          <w:sz w:val="19"/>
+          <w:szCs w:val="19"/>
+        </w:rPr>
+        <w:t xml:space="preserve">rxvm</w:t>
+      </w:r>
+      <w:r>
+        <w:rPr>
+          <w:rFonts w:ascii="Times New Roman" w:cs="Times New Roman" w:eastAsia="Times New Roman" w:hAnsi="Times New Roman"/>
+        </w:rPr>
+        <w:t xml:space="preserve">, since the upstream </w:t>
+      </w:r>
+      <w:r>
+        <w:rPr>
+          <w:rFonts w:ascii="Courier New" w:cs="Courier New" w:eastAsia="Courier New" w:hAnsi="Courier New"/>
+          <w:sz w:val="19"/>
+          <w:szCs w:val="19"/>
+        </w:rPr>
+        <w:t xml:space="preserve">crexx</w:t>
+      </w:r>
+      <w:r>
+        <w:rPr>
+          <w:rFonts w:ascii="Times New Roman" w:cs="Times New Roman" w:eastAsia="Times New Roman" w:hAnsi="Times New Roman"/>
+        </w:rPr>
+        <w:t xml:space="preserve"> driver is not yet built for s390.</w:t>
+      </w:r>
+    </w:p>
+    <w:p>
+      <w:pPr>
+        <w:spacing w:after="120"/>
+      </w:pPr>
+      <w:r>
+        <w:rPr>
+          <w:rFonts w:ascii="Times New Roman" w:cs="Times New Roman" w:eastAsia="Times New Roman" w:hAnsi="Times New Roman"/>
+          <w:b/>
+          <w:bCs/>
+        </w:rPr>
+        <w:t xml:space="preserve">On CMS</w:t>
+      </w:r>
+      <w:r>
+        <w:rPr>
+          <w:rFonts w:ascii="Times New Roman" w:cs="Times New Roman" w:eastAsia="Times New Roman" w:hAnsi="Times New Roman"/>
+        </w:rPr>
+        <w:t xml:space="preserve">, type </w:t>
+      </w:r>
+      <w:r>
+        <w:rPr>
+          <w:rFonts w:ascii="Courier New" w:cs="Courier New" w:eastAsia="Courier New" w:hAnsi="Courier New"/>
+          <w:sz w:val="19"/>
+          <w:szCs w:val="19"/>
+        </w:rPr>
+        <w:t xml:space="preserve">TURBO</w:t>
+      </w:r>
+      <w:r>
+        <w:rPr>
+          <w:rFonts w:ascii="Times New Roman" w:cs="Times New Roman" w:eastAsia="Times New Roman" w:hAnsi="Times New Roman"/>
+        </w:rPr>
+        <w:t xml:space="preserve"> (or </w:t>
+      </w:r>
+      <w:r>
+        <w:rPr>
+          <w:rFonts w:ascii="Courier New" w:cs="Courier New" w:eastAsia="Courier New" w:hAnsi="Courier New"/>
+          <w:sz w:val="19"/>
+          <w:szCs w:val="19"/>
+        </w:rPr>
+        <w:t xml:space="preserve">TURBO fn</w:t>
+      </w:r>
+      <w:r>
+        <w:rPr>
+          <w:rFonts w:ascii="Times New Roman" w:cs="Times New Roman" w:eastAsia="Times New Roman" w:hAnsi="Times New Roman"/>
+        </w:rPr>
+        <w:t xml:space="preserve">). Programs are </w:t>
+      </w:r>
+      <w:r>
+        <w:rPr>
+          <w:rFonts w:ascii="Courier New" w:cs="Courier New" w:eastAsia="Courier New" w:hAnsi="Courier New"/>
+          <w:sz w:val="19"/>
+          <w:szCs w:val="19"/>
+        </w:rPr>
+        <w:t xml:space="preserve">fn CREXX A</w:t>
+      </w:r>
+      <w:r>
+        <w:rPr>
+          <w:rFonts w:ascii="Times New Roman" w:cs="Times New Roman" w:eastAsia="Times New Roman" w:hAnsi="Times New Roman"/>
+        </w:rPr>
+        <w:t xml:space="preserve">; the editor is EDIT; compile and run use </w:t>
+      </w:r>
+      <w:r>
+        <w:rPr>
+          <w:rFonts w:ascii="Courier New" w:cs="Courier New" w:eastAsia="Courier New" w:hAnsi="Courier New"/>
+          <w:sz w:val="19"/>
+          <w:szCs w:val="19"/>
+        </w:rPr>
+        <w:t xml:space="preserve">RXC8</w:t>
+      </w:r>
+      <w:r>
+        <w:rPr>
+          <w:rFonts w:ascii="Times New Roman" w:cs="Times New Roman" w:eastAsia="Times New Roman" w:hAnsi="Times New Roman"/>
+        </w:rPr>
+        <w:t xml:space="preserve">, </w:t>
+      </w:r>
+      <w:r>
+        <w:rPr>
+          <w:rFonts w:ascii="Courier New" w:cs="Courier New" w:eastAsia="Courier New" w:hAnsi="Courier New"/>
+          <w:sz w:val="19"/>
+          <w:szCs w:val="19"/>
+        </w:rPr>
+        <w:t xml:space="preserve">RXAS8</w:t>
+      </w:r>
+      <w:r>
+        <w:rPr>
+          <w:rFonts w:ascii="Times New Roman" w:cs="Times New Roman" w:eastAsia="Times New Roman" w:hAnsi="Times New Roman"/>
+        </w:rPr>
+        <w:t xml:space="preserve"> and </w:t>
+      </w:r>
+      <w:r>
+        <w:rPr>
+          <w:rFonts w:ascii="Courier New" w:cs="Courier New" w:eastAsia="Courier New" w:hAnsi="Courier New"/>
+          <w:sz w:val="19"/>
+          <w:szCs w:val="19"/>
+        </w:rPr>
+        <w:t xml:space="preserve">RXBVM8</w:t>
+      </w:r>
+      <w:r>
+        <w:rPr>
+          <w:rFonts w:ascii="Times New Roman" w:cs="Times New Roman" w:eastAsia="Times New Roman" w:hAnsi="Times New Roman"/>
+        </w:rPr>
+        <w:t xml:space="preserve"> with </w:t>
+      </w:r>
+      <w:r>
+        <w:rPr>
+          <w:rFonts w:ascii="Courier New" w:cs="Courier New" w:eastAsia="Courier New" w:hAnsi="Courier New"/>
+          <w:sz w:val="19"/>
+          <w:szCs w:val="19"/>
+        </w:rPr>
+        <w:t xml:space="preserve">LIBRARY RXBIN</w:t>
+      </w:r>
+      <w:r>
+        <w:rPr>
+          <w:rFonts w:ascii="Times New Roman" w:cs="Times New Roman" w:eastAsia="Times New Roman" w:hAnsi="Times New Roman"/>
+        </w:rPr>
+        <w:t xml:space="preserve"> on A. Without the menu: </w:t>
+      </w:r>
+      <w:r>
+        <w:rPr>
+          <w:rFonts w:ascii="Courier New" w:cs="Courier New" w:eastAsia="Courier New" w:hAnsi="Courier New"/>
+          <w:sz w:val="19"/>
+          <w:szCs w:val="19"/>
+        </w:rPr>
+        <w:t xml:space="preserve">TURBO C fn</w:t>
+      </w:r>
+      <w:r>
+        <w:rPr>
+          <w:rFonts w:ascii="Times New Roman" w:cs="Times New Roman" w:eastAsia="Times New Roman" w:hAnsi="Times New Roman"/>
+        </w:rPr>
+        <w:t xml:space="preserve">, </w:t>
+      </w:r>
+      <w:r>
+        <w:rPr>
+          <w:rFonts w:ascii="Courier New" w:cs="Courier New" w:eastAsia="Courier New" w:hAnsi="Courier New"/>
+          <w:sz w:val="19"/>
+          <w:szCs w:val="19"/>
+        </w:rPr>
+        <w:t xml:space="preserve">TURBO R fn</w:t>
+      </w:r>
+      <w:r>
+        <w:rPr>
+          <w:rFonts w:ascii="Times New Roman" w:cs="Times New Roman" w:eastAsia="Times New Roman" w:hAnsi="Times New Roman"/>
+        </w:rPr>
+        <w:t xml:space="preserve">, </w:t>
+      </w:r>
+      <w:r>
+        <w:rPr>
+          <w:rFonts w:ascii="Courier New" w:cs="Courier New" w:eastAsia="Courier New" w:hAnsi="Courier New"/>
+          <w:sz w:val="19"/>
+          <w:szCs w:val="19"/>
+        </w:rPr>
+        <w:t xml:space="preserve">TURBO E fn</w:t>
+      </w:r>
+      <w:r>
+        <w:rPr>
+          <w:rFonts w:ascii="Times New Roman" w:cs="Times New Roman" w:eastAsia="Times New Roman" w:hAnsi="Times New Roman"/>
+        </w:rPr>
+        <w:t xml:space="preserve">. The examples are </w:t>
+      </w:r>
+      <w:r>
+        <w:rPr>
+          <w:rFonts w:ascii="Courier New" w:cs="Courier New" w:eastAsia="Courier New" w:hAnsi="Courier New"/>
+          <w:sz w:val="19"/>
+          <w:szCs w:val="19"/>
+        </w:rPr>
+        <w:t xml:space="preserve">HELLO TCEXAMPL</w:t>
+      </w:r>
+      <w:r>
+        <w:rPr>
+          <w:rFonts w:ascii="Times New Roman" w:cs="Times New Roman" w:eastAsia="Times New Roman" w:hAnsi="Times New Roman"/>
+        </w:rPr>
+        <w:t xml:space="preserve"> and </w:t>
+      </w:r>
+      <w:r>
+        <w:rPr>
+          <w:rFonts w:ascii="Courier New" w:cs="Courier New" w:eastAsia="Courier New" w:hAnsi="Courier New"/>
+          <w:sz w:val="19"/>
+          <w:szCs w:val="19"/>
+        </w:rPr>
+        <w:t xml:space="preserve">FIBFACT TCEXAMPL</w:t>
+      </w:r>
+      <w:r>
+        <w:rPr>
+          <w:rFonts w:ascii="Times New Roman" w:cs="Times New Roman" w:eastAsia="Times New Roman" w:hAnsi="Times New Roman"/>
+        </w:rPr>
+        <w:t xml:space="preserve">.</w:t>
+      </w:r>
+    </w:p>
+    <w:tbl>
+      <w:tblPr>
+        <w:tblW w:type="dxa" w:w="9638"/>
+        <w:tblBorders>
+          <w:top w:val="single" w:color="auto" w:sz="4"/>
+          <w:left w:val="single" w:color="auto" w:sz="4"/>
+          <w:bottom w:val="single" w:color="auto" w:sz="4"/>
+          <w:right w:val="single" w:color="auto" w:sz="4"/>
+          <w:insideH w:val="single" w:color="auto" w:sz="4"/>
+          <w:insideV w:val="single" w:color="auto" w:sz="4"/>
+        </w:tblBorders>
+      </w:tblPr>
+      <w:tblGrid>
+        <w:gridCol w:w="9638"/>
+      </w:tblGrid>
+      <w:tr>
+        <w:trPr>
+          <w:cantSplit/>
+        </w:trPr>
+        <w:tc>
+          <w:tcPr>
+            <w:tcW w:type="dxa" w:w="9638"/>
+            <w:shd w:fill="F2F2F2" w:color="auto" w:val="clear"/>
+            <w:tcMar>
+              <w:top w:type="dxa" w:w="100"/>
+              <w:left w:type="dxa" w:w="140"/>
+              <w:bottom w:type="dxa" w:w="100"/>
+              <w:right w:type="dxa" w:w="140"/>
+            </w:tcMar>
+          </w:tcPr>
+          <w:p>
+            <w:pPr>
+              <w:spacing w:after="0" w:line="228"/>
+            </w:pPr>
+            <w:r>
+              <w:rPr>
+                <w:rFonts w:ascii="Courier New" w:cs="Courier New" w:eastAsia="Courier New" w:hAnsi="Courier New"/>
+                <w:sz w:val="17"/>
+                <w:szCs w:val="17"/>
+              </w:rPr>
+              <w:t xml:space="preserve">turbo</w:t>
+            </w:r>
+          </w:p>
+          <w:p>
+            <w:pPr>
+              <w:spacing w:after="0" w:line="228"/>
+            </w:pPr>
+            <w:r>
+              <w:rPr>
+                <w:rFonts w:ascii="Courier New" w:cs="Courier New" w:eastAsia="Courier New" w:hAnsi="Courier New"/>
+                <w:sz w:val="17"/>
+                <w:szCs w:val="17"/>
+              </w:rPr>
+              <w:t xml:space="preserve">  T U R B O   C R E X X   ---   VM/370+ CMS</w:t>
+            </w:r>
+          </w:p>
+          <w:p>
+            <w:pPr>
+              <w:spacing w:after="0" w:line="228"/>
+            </w:pPr>
+            <w:r>
+              <w:rPr>
+                <w:rFonts w:ascii="Courier New" w:cs="Courier New" w:eastAsia="Courier New" w:hAnsi="Courier New"/>
+                <w:sz w:val="17"/>
+                <w:szCs w:val="17"/>
+              </w:rPr>
+              <w:t xml:space="preserve">  Current file: (none)</w:t>
+            </w:r>
+          </w:p>
+          <w:p>
+            <w:pPr>
+              <w:spacing w:after="0" w:line="228"/>
+            </w:pPr>
+            <w:r>
+              <w:rPr>
+                <w:rFonts w:ascii="Courier New" w:cs="Courier New" w:eastAsia="Courier New" w:hAnsi="Courier New"/>
+                <w:sz w:val="17"/>
+                <w:szCs w:val="17"/>
+              </w:rPr>
+              <w:t xml:space="preserve">  N New    O Open    E Edit    C Compile    R Run</w:t>
+            </w:r>
+          </w:p>
+          <w:p>
+            <w:pPr>
+              <w:spacing w:after="0" w:line="228"/>
+            </w:pPr>
+            <w:r>
+              <w:rPr>
+                <w:rFonts w:ascii="Courier New" w:cs="Courier New" w:eastAsia="Courier New" w:hAnsi="Courier New"/>
+                <w:sz w:val="17"/>
+                <w:szCs w:val="17"/>
+              </w:rPr>
+              <w:t xml:space="preserve">  L Examples         D Versions             Q Quit</w:t>
+            </w:r>
+          </w:p>
+          <w:p>
+            <w:pPr>
+              <w:spacing w:after="0" w:line="228"/>
+            </w:pPr>
+            <w:r>
+              <w:rPr>
+                <w:rFonts w:ascii="Courier New" w:cs="Courier New" w:eastAsia="Courier New" w:hAnsi="Courier New"/>
+                <w:sz w:val="17"/>
+                <w:szCs w:val="17"/>
+              </w:rPr>
+              <w:t xml:space="preserve">Command:</w:t>
+            </w:r>
+          </w:p>
+        </w:tc>
+      </w:tr>
+    </w:tbl>
+    <w:p>
+      <w:pPr>
+        <w:spacing w:after="200" w:before="80"/>
+      </w:pPr>
+      <w:r>
+        <w:rPr>
+          <w:rFonts w:ascii="Arial" w:cs="Arial" w:eastAsia="Arial" w:hAnsi="Arial"/>
+          <w:b/>
+          <w:bCs/>
+          <w:sz w:val="18"/>
+          <w:szCs w:val="18"/>
+        </w:rPr>
+        <w:t xml:space="preserve">Figure 20. </w:t>
+      </w:r>
+      <w:r>
+        <w:rPr>
+          <w:rFonts w:ascii="Arial" w:cs="Arial" w:eastAsia="Arial" w:hAnsi="Arial"/>
+          <w:sz w:val="18"/>
+          <w:szCs w:val="18"/>
+        </w:rPr>
+        <w:t xml:space="preserve">Turbo CREXX on CMS</w:t>
       </w:r>
     </w:p>
     <w:p>
@@ -9349,6 +12137,134 @@
                 <w:sz w:val="19"/>
                 <w:szCs w:val="19"/>
               </w:rPr>
+              <w:t xml:space="preserve">cREXX, native</w:t>
+            </w:r>
+          </w:p>
+        </w:tc>
+        <w:tc>
+          <w:tcPr>
+            <w:tcW w:type="dxa" w:w="7238"/>
+            <w:tcMar>
+              <w:top w:type="dxa" w:w="60"/>
+              <w:left w:type="dxa" w:w="100"/>
+              <w:bottom w:type="dxa" w:w="60"/>
+              <w:right w:type="dxa" w:w="100"/>
+            </w:tcMar>
+          </w:tcPr>
+          <w:p>
+            <w:r>
+              <w:rPr>
+                <w:rFonts w:ascii="Times New Roman" w:cs="Times New Roman" w:eastAsia="Times New Roman" w:hAnsi="Times New Roman"/>
+                <w:sz w:val="19"/>
+                <w:szCs w:val="19"/>
+              </w:rPr>
+              <w:t xml:space="preserve">The natively built current cREXX (M8.2) cannot build its library yet; use RXC8, RXAS8 and RXBVM8 (M8.1).</w:t>
+            </w:r>
+          </w:p>
+        </w:tc>
+      </w:tr>
+      <w:tr>
+        <w:trPr>
+          <w:cantSplit/>
+          <w:tblHeader w:val="false"/>
+        </w:trPr>
+        <w:tc>
+          <w:tcPr>
+            <w:tcW w:type="dxa" w:w="2400"/>
+            <w:tcMar>
+              <w:top w:type="dxa" w:w="60"/>
+              <w:left w:type="dxa" w:w="100"/>
+              <w:bottom w:type="dxa" w:w="60"/>
+              <w:right w:type="dxa" w:w="100"/>
+            </w:tcMar>
+          </w:tcPr>
+          <w:p>
+            <w:r>
+              <w:rPr>
+                <w:rFonts w:ascii="Times New Roman" w:cs="Times New Roman" w:eastAsia="Times New Roman" w:hAnsi="Times New Roman"/>
+                <w:sz w:val="19"/>
+                <w:szCs w:val="19"/>
+              </w:rPr>
+              <w:t xml:space="preserve">CMS file names</w:t>
+            </w:r>
+          </w:p>
+        </w:tc>
+        <w:tc>
+          <w:tcPr>
+            <w:tcW w:type="dxa" w:w="7238"/>
+            <w:tcMar>
+              <w:top w:type="dxa" w:w="60"/>
+              <w:left w:type="dxa" w:w="100"/>
+              <w:bottom w:type="dxa" w:w="60"/>
+              <w:right w:type="dxa" w:w="100"/>
+            </w:tcMar>
+          </w:tcPr>
+          <w:p>
+            <w:r>
+              <w:rPr>
+                <w:rFonts w:ascii="Times New Roman" w:cs="Times New Roman" w:eastAsia="Times New Roman" w:hAnsi="Times New Roman"/>
+                <w:sz w:val="19"/>
+                <w:szCs w:val="19"/>
+              </w:rPr>
+              <w:t xml:space="preserve">Programs cross-compiled for CMS cut a file name longer than eight characters to eight (Smalltalk’s </w:t>
+            </w:r>
+            <w:r>
+              <w:rPr>
+                <w:rFonts w:ascii="Courier New" w:cs="Courier New" w:eastAsia="Courier New" w:hAnsi="Courier New"/>
+                <w:sz w:val="19"/>
+                <w:szCs w:val="19"/>
+              </w:rPr>
+              <w:t xml:space="preserve">collections.st</w:t>
+            </w:r>
+            <w:r>
+              <w:rPr>
+                <w:rFonts w:ascii="Times New Roman" w:cs="Times New Roman" w:eastAsia="Times New Roman" w:hAnsi="Times New Roman"/>
+                <w:sz w:val="19"/>
+                <w:szCs w:val="19"/>
+              </w:rPr>
+              <w:t xml:space="preserve"> is </w:t>
+            </w:r>
+            <w:r>
+              <w:rPr>
+                <w:rFonts w:ascii="Courier New" w:cs="Courier New" w:eastAsia="Courier New" w:hAnsi="Courier New"/>
+                <w:sz w:val="19"/>
+                <w:szCs w:val="19"/>
+              </w:rPr>
+              <w:t xml:space="preserve">COLLECTI ST</w:t>
+            </w:r>
+            <w:r>
+              <w:rPr>
+                <w:rFonts w:ascii="Times New Roman" w:cs="Times New Roman" w:eastAsia="Times New Roman" w:hAnsi="Times New Roman"/>
+                <w:sz w:val="19"/>
+                <w:szCs w:val="19"/>
+              </w:rPr>
+              <w:t xml:space="preserve">).</w:t>
+            </w:r>
+          </w:p>
+        </w:tc>
+      </w:tr>
+      <w:tr>
+        <w:trPr>
+          <w:cantSplit/>
+          <w:tblHeader w:val="false"/>
+        </w:trPr>
+        <w:tc>
+          <w:tcPr>
+            <w:tcW w:type="dxa" w:w="2400"/>
+            <w:tcMar>
+              <w:top w:type="dxa" w:w="60"/>
+              <w:left w:type="dxa" w:w="100"/>
+              <w:bottom w:type="dxa" w:w="60"/>
+              <w:right w:type="dxa" w:w="100"/>
+            </w:tcMar>
+          </w:tcPr>
+          <w:p>
+            <w:r>
+              <w:rPr>
+                <w:rFonts w:ascii="Times New Roman" w:cs="Times New Roman" w:eastAsia="Times New Roman" w:hAnsi="Times New Roman"/>
+                <w:sz w:val="19"/>
+                <w:szCs w:val="19"/>
+              </w:rPr>
               <w:t xml:space="preserve">Linux</w:t>
             </w:r>
           </w:p>
@@ -9388,7 +12304,7 @@
           <w:sz w:val="18"/>
           <w:szCs w:val="18"/>
         </w:rPr>
-        <w:t xml:space="preserve">Figure 17. </w:t>
+        <w:t xml:space="preserve">Figure 21. </w:t>
       </w:r>
       <w:r>
         <w:rPr>
@@ -9487,7 +12403,7 @@
           <w:sz w:val="18"/>
           <w:szCs w:val="18"/>
         </w:rPr>
-        <w:t xml:space="preserve">Figure 18. </w:t>
+        <w:t xml:space="preserve">Figure 22. </w:t>
       </w:r>
       <w:r>
         <w:rPr>
@@ -9636,7 +12552,7 @@
           <w:sz w:val="18"/>
           <w:szCs w:val="18"/>
         </w:rPr>
-        <w:t xml:space="preserve">Figure 19. </w:t>
+        <w:t xml:space="preserve">Figure 23. </w:t>
       </w:r>
       <w:r>
         <w:rPr>
@@ -10206,7 +13122,7 @@
           <w:sz w:val="18"/>
           <w:szCs w:val="18"/>
         </w:rPr>
-        <w:t xml:space="preserve">Figure 20. </w:t>
+        <w:t xml:space="preserve">Figure 24. </w:t>
       </w:r>
       <w:r>
         <w:rPr>

</xml_diff>

<commit_message>
Debian: THE 3.3 and Regina 3.6 installed; cmsrt: main runs on an 8 MB stack from the heap (64 KB was too small), CMS save area and plists below 16 MB; guide updated
Co-Authored-By: Claude Opus 5.5 <noreply@anthropic.com>
Claude-Session: https://claude.ai/code/session_01JBNU8KnKzXkgscse8vw6so
</commit_message>
<xml_diff>
--- a/arch/31bit/manual/VM370PLUS-Guide.docx
+++ b/arch/31bit/manual/VM370PLUS-Guide.docx
@@ -1694,7 +1694,7 @@
         <w:rPr>
           <w:rFonts w:ascii="Times New Roman" w:cs="Times New Roman" w:eastAsia="Times New Roman" w:hAnsi="Times New Roman"/>
         </w:rPr>
-        <w:t xml:space="preserve"> Languages written in cREXX for CMS and Linux (BASIC, SNOBOL4, Pascal, Lisp, Smalltalk, PL/M, Prolog, LOGO); Turbo CREXX on both; four more minidisks for CMSUSER (196–199); the native build of the current cREXX (M8.2); Python and GNU C under Debian; milestones brought up to date.</w:t>
+        <w:t xml:space="preserve"> Regina REXX and THE under Debian; languages written in cREXX for CMS and Linux (BASIC, SNOBOL4, Pascal, Lisp, Smalltalk, PL/M, Prolog, LOGO); Turbo CREXX on both; four more minidisks for CMSUSER (196–199); the native build of the current cREXX (M8.2); Python and GNU C under Debian; milestones brought up to date.</w:t>
       </w:r>
     </w:p>
     <w:p>
@@ -3041,7 +3041,7 @@
                 <w:sz w:val="19"/>
                 <w:szCs w:val="19"/>
               </w:rPr>
-              <w:t xml:space="preserve">in the Linux bundle; CMS deck being tested</w:t>
+              <w:t xml:space="preserve">Linux complete; CMS: all but Smalltalk</w:t>
             </w:r>
           </w:p>
         </w:tc>
@@ -3089,7 +3089,7 @@
                 <w:sz w:val="19"/>
                 <w:szCs w:val="19"/>
               </w:rPr>
-              <w:t xml:space="preserve">GNU C 4.6, Python 2.7 and 3.2 under Debian</w:t>
+              <w:t xml:space="preserve">GNU C 4.6, Python 2.7 and 3.2, Regina REXX and THE under Debian</w:t>
             </w:r>
           </w:p>
         </w:tc>
@@ -7904,7 +7904,49 @@
         <w:rPr>
           <w:rFonts w:ascii="Times New Roman" w:cs="Times New Roman" w:eastAsia="Times New Roman" w:hAnsi="Times New Roman"/>
         </w:rPr>
-        <w:t xml:space="preserve">). cREXX and the languages of Chapter 6 are in </w:t>
+        <w:t xml:space="preserve">), Regina REXX 3.6 (</w:t>
+      </w:r>
+      <w:r>
+        <w:rPr>
+          <w:rFonts w:ascii="Courier New" w:cs="Courier New" w:eastAsia="Courier New" w:hAnsi="Courier New"/>
+          <w:sz w:val="19"/>
+          <w:szCs w:val="19"/>
+        </w:rPr>
+        <w:t xml:space="preserve">regina</w:t>
+      </w:r>
+      <w:r>
+        <w:rPr>
+          <w:rFonts w:ascii="Times New Roman" w:cs="Times New Roman" w:eastAsia="Times New Roman" w:hAnsi="Times New Roman"/>
+        </w:rPr>
+        <w:t xml:space="preserve"> or </w:t>
+      </w:r>
+      <w:r>
+        <w:rPr>
+          <w:rFonts w:ascii="Courier New" w:cs="Courier New" w:eastAsia="Courier New" w:hAnsi="Courier New"/>
+          <w:sz w:val="19"/>
+          <w:szCs w:val="19"/>
+        </w:rPr>
+        <w:t xml:space="preserve">rexx</w:t>
+      </w:r>
+      <w:r>
+        <w:rPr>
+          <w:rFonts w:ascii="Times New Roman" w:cs="Times New Roman" w:eastAsia="Times New Roman" w:hAnsi="Times New Roman"/>
+        </w:rPr>
+        <w:t xml:space="preserve">, classic REXX as on CMS) and THE 3.3, The Hessling Editor (</w:t>
+      </w:r>
+      <w:r>
+        <w:rPr>
+          <w:rFonts w:ascii="Courier New" w:cs="Courier New" w:eastAsia="Courier New" w:hAnsi="Courier New"/>
+          <w:sz w:val="19"/>
+          <w:szCs w:val="19"/>
+        </w:rPr>
+        <w:t xml:space="preserve">the</w:t>
+      </w:r>
+      <w:r>
+        <w:rPr>
+          <w:rFonts w:ascii="Times New Roman" w:cs="Times New Roman" w:eastAsia="Times New Roman" w:hAnsi="Times New Roman"/>
+        </w:rPr>
+        <w:t xml:space="preserve">, an XEDIT-like editor; use it over SSH, since the 3215 console cannot show a full screen). cREXX and the languages of Chapter 6 are in </w:t>
       </w:r>
       <w:r>
         <w:rPr>

</xml_diff>

<commit_message>
CMS: all cREXX languages and Turbo CREXX verified (Smalltalk needs real storage: MAINSIZE 256); cmsrt heap up to 232 MB with an out-of-storage message; guide updated
Co-Authored-By: Claude Opus 5.5 <noreply@anthropic.com>
Claude-Session: https://claude.ai/code/session_01JBNU8KnKzXkgscse8vw6so
</commit_message>
<xml_diff>
--- a/arch/31bit/manual/VM370PLUS-Guide.docx
+++ b/arch/31bit/manual/VM370PLUS-Guide.docx
@@ -3041,7 +3041,7 @@
                 <w:sz w:val="19"/>
                 <w:szCs w:val="19"/>
               </w:rPr>
-              <w:t xml:space="preserve">Linux complete; CMS: all but Smalltalk</w:t>
+              <w:t xml:space="preserve">complete on both</w:t>
             </w:r>
           </w:p>
         </w:tc>
@@ -10672,6 +10672,59 @@
           <w:rFonts w:ascii="Times New Roman" w:cs="Times New Roman" w:eastAsia="Times New Roman" w:hAnsi="Times New Roman"/>
         </w:rPr>
         <w:t xml:space="preserve">). CMS cuts a command argument to eight characters, so the EXECs pass file names through the program stack: type the names as usual.</w:t>
+      </w:r>
+    </w:p>
+    <w:p>
+      <w:pPr>
+        <w:spacing w:after="120"/>
+      </w:pPr>
+      <w:r>
+        <w:rPr>
+          <w:rFonts w:ascii="Times New Roman" w:cs="Times New Roman" w:eastAsia="Times New Roman" w:hAnsi="Times New Roman"/>
+        </w:rPr>
+        <w:t xml:space="preserve">The languages need an EC-mode CMS with a large virtual machine: </w:t>
+      </w:r>
+      <w:r>
+        <w:rPr>
+          <w:rFonts w:ascii="Courier New" w:cs="Courier New" w:eastAsia="Courier New" w:hAnsi="Courier New"/>
+          <w:sz w:val="19"/>
+          <w:szCs w:val="19"/>
+        </w:rPr>
+        <w:t xml:space="preserve">CP DEFINE STORAGE 256M</w:t>
+      </w:r>
+      <w:r>
+        <w:rPr>
+          <w:rFonts w:ascii="Times New Roman" w:cs="Times New Roman" w:eastAsia="Times New Roman" w:hAnsi="Times New Roman"/>
+        </w:rPr>
+        <w:t xml:space="preserve"> and </w:t>
+      </w:r>
+      <w:r>
+        <w:rPr>
+          <w:rFonts w:ascii="Courier New" w:cs="Courier New" w:eastAsia="Courier New" w:hAnsi="Courier New"/>
+          <w:sz w:val="19"/>
+          <w:szCs w:val="19"/>
+        </w:rPr>
+        <w:t xml:space="preserve">IPL 290</w:t>
+      </w:r>
+      <w:r>
+        <w:rPr>
+          <w:rFonts w:ascii="Times New Roman" w:cs="Times New Roman" w:eastAsia="Times New Roman" w:hAnsi="Times New Roman"/>
+        </w:rPr>
+        <w:t xml:space="preserve">. Their storage comes from above 16 MB through HIGHSTOR; Smalltalk alone uses about 100 MB, so it is practical only when Hercules gives VM/370+ real storage to match (the kit’s </w:t>
+      </w:r>
+      <w:r>
+        <w:rPr>
+          <w:rFonts w:ascii="Courier New" w:cs="Courier New" w:eastAsia="Courier New" w:hAnsi="Courier New"/>
+          <w:sz w:val="19"/>
+          <w:szCs w:val="19"/>
+        </w:rPr>
+        <w:t xml:space="preserve">MAINSIZE 256</w:t>
+      </w:r>
+      <w:r>
+        <w:rPr>
+          <w:rFonts w:ascii="Times New Roman" w:cs="Times New Roman" w:eastAsia="Times New Roman" w:hAnsi="Times New Roman"/>
+        </w:rPr>
+        <w:t xml:space="preserve">); with 16 MB of real storage CP pages it to a crawl. Programs cross-built for CMS run on an 8 MB stack.</w:t>
       </w:r>
     </w:p>
     <w:p>

</xml_diff>

<commit_message>
M7.9: CVTCHN converts channel programs of any length; M7.11: 3390-9 Debian disk; vmzipl -r
CVTCHN kept every converted CCW in a 64-entry list, so a format-1 chain
longer than 64 CCWs was only half converted. What is done is now kept as
segments (first, last CCW), one per TIC target, up to 32. DMKVCS is at
R12's 4 KB edge, so the slot table moved past the ring (AVCSSLOT).
vmzipl -r ROOT makes a disk mounted elsewhere IPLable; real 192 is the
new 3390-9 (7 GB) Debian disk, copied from golden8 (zp19). Guide updated.

Co-Authored-By: Claude Opus 5.5 <noreply@anthropic.com>
Claude-Session: https://claude.ai/code/session_01JBNU8KnKzXkgscse8vw6so
</commit_message>
<xml_diff>
--- a/arch/31bit/manual/VM370PLUS-Guide.docx
+++ b/arch/31bit/manual/VM370PLUS-Guide.docx
@@ -16,7 +16,7 @@
           <w:sz w:val="72"/>
           <w:szCs w:val="72"/>
         </w:rPr>
-        <w:t xml:space="preserve">VM/370+</w:t>
+        <w:t xml:space="preserve">VM/370plus</w:t>
       </w:r>
     </w:p>
     <w:p>
@@ -136,7 +136,7 @@
         <w:rPr>
           <w:rFonts w:ascii="Times New Roman" w:cs="Times New Roman" w:eastAsia="Times New Roman" w:hAnsi="Times New Roman"/>
         </w:rPr>
-        <w:t xml:space="preserve">This edition applies to VM/370+ Release 1 (kit build 5, 9 October 2026), an ESA/390 conversion of the VM/370 Community Edition V1 R1.2, and to all subsequent builds until otherwise indicated in new editions.</w:t>
+        <w:t xml:space="preserve">This edition applies to VM/370plus Release 1 (kit build 5, 9 October 2026), an ESA/390 conversion of the VM/370 Community Edition V1 R1.2, and to all subsequent builds until otherwise indicated in new editions.</w:t>
       </w:r>
     </w:p>
     <w:p>
@@ -147,7 +147,7 @@
         <w:rPr>
           <w:rFonts w:ascii="Times New Roman" w:cs="Times New Roman" w:eastAsia="Times New Roman" w:hAnsi="Times New Roman"/>
         </w:rPr>
-        <w:t xml:space="preserve">VM/370+ is a hobbyist project. It is not a product of, and this manual is not a publication of, International Business Machines Corporation. IBM, System/370, ESA/390, z/Architecture and VM/370 are names of IBM products and architectures, used here only to identify the systems this software runs on and descends from.</w:t>
+        <w:t xml:space="preserve">VM/370plus is a hobbyist project. It is not a product of, and this manual is not a publication of, International Business Machines Corporation. IBM, System/370, ESA/390, z/Architecture and VM/370 are names of IBM products and architectures, used here only to identify the systems this software runs on and descends from.</w:t>
       </w:r>
     </w:p>
     <w:p>
@@ -266,7 +266,7 @@
           <w:sz w:val="20"/>
           <w:szCs w:val="20"/>
         </w:rPr>
-        <w:t xml:space="preserve">How VM/370+ is built</w:t>
+        <w:t xml:space="preserve">How VM/370plus is built</w:t>
       </w:r>
       <w:r>
         <w:rPr>
@@ -469,7 +469,7 @@
           <w:sz w:val="21"/>
           <w:szCs w:val="21"/>
         </w:rPr>
-        <w:t xml:space="preserve">Chapter 3. Installing VM/370+</w:t>
+        <w:t xml:space="preserve">Chapter 3. Installing VM/370plus</w:t>
       </w:r>
       <w:r>
         <w:rPr>
@@ -614,7 +614,7 @@
           <w:sz w:val="21"/>
           <w:szCs w:val="21"/>
         </w:rPr>
-        <w:t xml:space="preserve">Chapter 4. Operating VM/370+</w:t>
+        <w:t xml:space="preserve">Chapter 4. Operating VM/370plus</w:t>
       </w:r>
       <w:r>
         <w:rPr>
@@ -817,7 +817,7 @@
           <w:sz w:val="20"/>
           <w:szCs w:val="20"/>
         </w:rPr>
-        <w:t xml:space="preserve">Starting Linux with the LINUX EXEC</w:t>
+        <w:t xml:space="preserve">Starting Linux from its disk: IPL LINUX</w:t>
       </w:r>
       <w:r>
         <w:rPr>
@@ -846,7 +846,7 @@
           <w:sz w:val="20"/>
           <w:szCs w:val="20"/>
         </w:rPr>
-        <w:t xml:space="preserve">Starting Linux by hand</w:t>
+        <w:t xml:space="preserve">Making a disk IPLable: vmzipl</w:t>
       </w:r>
       <w:r>
         <w:rPr>
@@ -875,7 +875,7 @@
           <w:sz w:val="20"/>
           <w:szCs w:val="20"/>
         </w:rPr>
-        <w:t xml:space="preserve">The Linux system</w:t>
+        <w:t xml:space="preserve">Starting Linux with the LINUX EXEC</w:t>
       </w:r>
       <w:r>
         <w:rPr>
@@ -885,7 +885,7 @@
           <w:sz w:val="20"/>
           <w:szCs w:val="20"/>
         </w:rPr>
-        <w:t xml:space="preserve">	11</w:t>
+        <w:t xml:space="preserve">	10</w:t>
       </w:r>
     </w:p>
     <w:p>
@@ -904,7 +904,7 @@
           <w:sz w:val="20"/>
           <w:szCs w:val="20"/>
         </w:rPr>
-        <w:t xml:space="preserve">Several Linux users</w:t>
+        <w:t xml:space="preserve">Starting Linux by hand</w:t>
       </w:r>
       <w:r>
         <w:rPr>
@@ -933,6 +933,64 @@
           <w:sz w:val="20"/>
           <w:szCs w:val="20"/>
         </w:rPr>
+        <w:t xml:space="preserve">The Linux system</w:t>
+      </w:r>
+      <w:r>
+        <w:rPr>
+          <w:rFonts w:ascii="Times New Roman" w:cs="Times New Roman" w:eastAsia="Times New Roman" w:hAnsi="Times New Roman"/>
+          <w:b w:val="false"/>
+          <w:bCs w:val="false"/>
+          <w:sz w:val="20"/>
+          <w:szCs w:val="20"/>
+        </w:rPr>
+        <w:t xml:space="preserve">	11</w:t>
+      </w:r>
+    </w:p>
+    <w:p>
+      <w:pPr>
+        <w:tabs>
+          <w:tab w:val="right" w:pos="9638" w:leader="dot"/>
+        </w:tabs>
+        <w:spacing w:after="20" w:before="20"/>
+        <w:ind w:left="400"/>
+      </w:pPr>
+      <w:r>
+        <w:rPr>
+          <w:rFonts w:ascii="Times New Roman" w:cs="Times New Roman" w:eastAsia="Times New Roman" w:hAnsi="Times New Roman"/>
+          <w:b w:val="false"/>
+          <w:bCs w:val="false"/>
+          <w:sz w:val="20"/>
+          <w:szCs w:val="20"/>
+        </w:rPr>
+        <w:t xml:space="preserve">Several Linux users</w:t>
+      </w:r>
+      <w:r>
+        <w:rPr>
+          <w:rFonts w:ascii="Times New Roman" w:cs="Times New Roman" w:eastAsia="Times New Roman" w:hAnsi="Times New Roman"/>
+          <w:b w:val="false"/>
+          <w:bCs w:val="false"/>
+          <w:sz w:val="20"/>
+          <w:szCs w:val="20"/>
+        </w:rPr>
+        <w:t xml:space="preserve">	12</w:t>
+      </w:r>
+    </w:p>
+    <w:p>
+      <w:pPr>
+        <w:tabs>
+          <w:tab w:val="right" w:pos="9638" w:leader="dot"/>
+        </w:tabs>
+        <w:spacing w:after="20" w:before="20"/>
+        <w:ind w:left="400"/>
+      </w:pPr>
+      <w:r>
+        <w:rPr>
+          <w:rFonts w:ascii="Times New Roman" w:cs="Times New Roman" w:eastAsia="Times New Roman" w:hAnsi="Times New Roman"/>
+          <w:b w:val="false"/>
+          <w:bCs w:val="false"/>
+          <w:sz w:val="20"/>
+          <w:szCs w:val="20"/>
+        </w:rPr>
         <w:t xml:space="preserve">Linux and CMS side by side</w:t>
       </w:r>
       <w:r>
@@ -962,7 +1020,7 @@
           <w:sz w:val="21"/>
           <w:szCs w:val="21"/>
         </w:rPr>
-        <w:t xml:space="preserve">Chapter 6. cREXX on VM/370+</w:t>
+        <w:t xml:space="preserve">Chapter 6. cREXX on VM/370plus</w:t>
       </w:r>
       <w:r>
         <w:rPr>
@@ -991,7 +1049,7 @@
           <w:sz w:val="20"/>
           <w:szCs w:val="20"/>
         </w:rPr>
-        <w:t xml:space="preserve">The 2022 release, built on VM/370+</w:t>
+        <w:t xml:space="preserve">The 2022 release, built on VM/370plus</w:t>
       </w:r>
       <w:r>
         <w:rPr>
@@ -1379,7 +1437,7 @@
         <w:rPr>
           <w:rFonts w:ascii="Times New Roman" w:cs="Times New Roman" w:eastAsia="Times New Roman" w:hAnsi="Times New Roman"/>
         </w:rPr>
-        <w:t xml:space="preserve">This manual introduces VM/370+, tells you how to install it over a VM/370 Community Edition system running under the Hercules emulator, and describes how to use the two things it adds to VM/370: virtual machines larger than 16 MB with programs that run in 31-bit addressing mode, and virtual machines that run the ESA/390 architecture, in which Linux/390 and a complete Debian system run.</w:t>
+        <w:t xml:space="preserve">This manual introduces VM/370plus, tells you how to install it over a VM/370 Community Edition system running under the Hercules emulator, and describes how to use the two things it adds to VM/370: virtual machines larger than 16 MB with programs that run in 31-bit addressing mode, and virtual machines that run the ESA/390 architecture, in which Linux/390 and a complete Debian system run.</w:t>
       </w:r>
     </w:p>
     <w:p>
@@ -1390,7 +1448,7 @@
         <w:rPr>
           <w:rFonts w:ascii="Times New Roman" w:cs="Times New Roman" w:eastAsia="Times New Roman" w:hAnsi="Times New Roman"/>
         </w:rPr>
-        <w:t xml:space="preserve">It is written for the VM/370 user who already knows CP and CMS: how to log on, how to use the CP commands of the general user (class G) and of the system operator (class A and B), how to edit and run an EXEC. Where VM/370+ behaves as VM/370 does, this manual says nothing; where it differs, it says how and why.</w:t>
+        <w:t xml:space="preserve">It is written for the VM/370 user who already knows CP and CMS: how to log on, how to use the CP commands of the general user (class G) and of the system operator (class A and B), how to edit and run an EXEC. Where VM/370plus behaves as VM/370 does, this manual says nothing; where it differs, it says how and why.</w:t>
       </w:r>
     </w:p>
     <w:p>
@@ -1422,7 +1480,7 @@
         <w:rPr>
           <w:rFonts w:ascii="Times New Roman" w:cs="Times New Roman" w:eastAsia="Times New Roman" w:hAnsi="Times New Roman"/>
         </w:rPr>
-        <w:t xml:space="preserve">, says what VM/370+ is and what it is for.</w:t>
+        <w:t xml:space="preserve">, says what VM/370plus is and what it is for.</w:t>
       </w:r>
     </w:p>
     <w:p>
@@ -1464,13 +1522,13 @@
           <w:b/>
           <w:bCs/>
         </w:rPr>
-        <w:t xml:space="preserve">Chapter 3, Installing VM/370+</w:t>
-      </w:r>
-      <w:r>
-        <w:rPr>
-          <w:rFonts w:ascii="Times New Roman" w:cs="Times New Roman" w:eastAsia="Times New Roman" w:hAnsi="Times New Roman"/>
-        </w:rPr>
-        <w:t xml:space="preserve">, takes you from a fresh Community Edition to a running VM/370+ system.</w:t>
+        <w:t xml:space="preserve">Chapter 3, Installing VM/370plus</w:t>
+      </w:r>
+      <w:r>
+        <w:rPr>
+          <w:rFonts w:ascii="Times New Roman" w:cs="Times New Roman" w:eastAsia="Times New Roman" w:hAnsi="Times New Roman"/>
+        </w:rPr>
+        <w:t xml:space="preserve">, takes you from a fresh Community Edition to a running VM/370plus system.</w:t>
       </w:r>
     </w:p>
     <w:p>
@@ -1488,7 +1546,7 @@
           <w:b/>
           <w:bCs/>
         </w:rPr>
-        <w:t xml:space="preserve">Chapter 4, Operating VM/370+</w:t>
+        <w:t xml:space="preserve">Chapter 4, Operating VM/370plus</w:t>
       </w:r>
       <w:r>
         <w:rPr>
@@ -1536,13 +1594,13 @@
           <w:b/>
           <w:bCs/>
         </w:rPr>
-        <w:t xml:space="preserve">Chapter 6, cREXX on VM/370+</w:t>
-      </w:r>
-      <w:r>
-        <w:rPr>
-          <w:rFonts w:ascii="Times New Roman" w:cs="Times New Roman" w:eastAsia="Times New Roman" w:hAnsi="Times New Roman"/>
-        </w:rPr>
-        <w:t xml:space="preserve">, describes the REXX compiler and virtual machine built for and on VM/370+, the languages written in cREXX that run on CMS and on Linux, and Turbo CREXX.</w:t>
+        <w:t xml:space="preserve">Chapter 6, cREXX on VM/370plus</w:t>
+      </w:r>
+      <w:r>
+        <w:rPr>
+          <w:rFonts w:ascii="Times New Roman" w:cs="Times New Roman" w:eastAsia="Times New Roman" w:hAnsi="Times New Roman"/>
+        </w:rPr>
+        <w:t xml:space="preserve">, describes the REXX compiler and virtual machine built for and on VM/370plus, the languages written in cREXX that run on CMS and on Linux, and Turbo CREXX.</w:t>
       </w:r>
     </w:p>
     <w:p>
@@ -1670,7 +1728,7 @@
         <w:rPr>
           <w:rFonts w:ascii="Times New Roman" w:cs="Times New Roman" w:eastAsia="Times New Roman" w:hAnsi="Times New Roman"/>
         </w:rPr>
-        <w:t xml:space="preserve">This edition is kept up to date as VM/370+ grows; each change is listed here, newest first.</w:t>
+        <w:t xml:space="preserve">This edition is kept up to date as VM/370plus grows; each change is listed here, newest first.</w:t>
       </w:r>
     </w:p>
     <w:p>
@@ -1785,7 +1843,7 @@
         <w:rPr>
           <w:rFonts w:ascii="Times New Roman" w:cs="Times New Roman" w:eastAsia="Times New Roman" w:hAnsi="Times New Roman"/>
         </w:rPr>
-        <w:t xml:space="preserve">VM/370 was written for System/370: 24-bit addresses, 16 MB of storage, S/370 channel I/O. VM/370+ is the VM/370 Community Edition V1 R1.2 with its Control Program (CP) converted to the ESA/390 architecture. It runs on Hercules in </w:t>
+        <w:t xml:space="preserve">VM/370 was written for System/370: 24-bit addresses, 16 MB of storage, S/370 channel I/O. VM/370plus is the VM/370 Community Edition V1 R1.2 with its Control Program (CP) converted to the ESA/390 architecture. It runs on Hercules in </w:t>
       </w:r>
       <w:r>
         <w:rPr>
@@ -1933,7 +1991,7 @@
         <w:rPr>
           <w:rFonts w:ascii="Times New Roman" w:cs="Times New Roman" w:eastAsia="Times New Roman" w:hAnsi="Times New Roman"/>
         </w:rPr>
-        <w:t xml:space="preserve"> The cREXX REXX compiler, assembler and virtual machine run on VM/370+ and are built on it.</w:t>
+        <w:t xml:space="preserve"> The cREXX REXX compiler, assembler and virtual machine run on VM/370plus and are built on it.</w:t>
       </w:r>
     </w:p>
     <w:p>
@@ -1952,7 +2010,7 @@
         <w:pStyle w:val="Heading2"/>
       </w:pPr>
       <w:r>
-        <w:t xml:space="preserve">How VM/370+ is built</w:t>
+        <w:t xml:space="preserve">How VM/370plus is built</w:t>
       </w:r>
     </w:p>
     <w:p>
@@ -1963,7 +2021,7 @@
         <w:rPr>
           <w:rFonts w:ascii="Times New Roman" w:cs="Times New Roman" w:eastAsia="Times New Roman" w:hAnsi="Times New Roman"/>
         </w:rPr>
-        <w:t xml:space="preserve">VM/370+ is a set of UPDATE decks applied to the Community Edition source, assembled on the system itself, and loaded into the CP nucleus with the standard VMFLOAD procedure. The repository of the project holds every deck, the generator that produces them, the build tools, the issue register and the regression runs. Nothing in VM/370+ is a binary patch.</w:t>
+        <w:t xml:space="preserve">VM/370plus is a set of UPDATE decks applied to the Community Edition source, assembled on the system itself, and loaded into the CP nucleus with the standard VMFLOAD procedure. The repository of the project holds every deck, the generator that produces them, the build tools, the issue register and the regression runs. Nothing in VM/370plus is a binary patch.</w:t>
       </w:r>
     </w:p>
     <w:p>
@@ -2813,7 +2871,15 @@
                 <w:sz w:val="19"/>
                 <w:szCs w:val="19"/>
               </w:rPr>
-              <w:t xml:space="preserve">IPL of Linux from its disk (zipl) and a CP name LINUX</w:t>
+              <w:t xml:space="preserve">IPL of Linux from its disk (vmzipl) and </w:t>
+            </w:r>
+            <w:r>
+              <w:rPr>
+                <w:rFonts w:ascii="Courier New" w:cs="Courier New" w:eastAsia="Courier New" w:hAnsi="Courier New"/>
+                <w:sz w:val="19"/>
+                <w:szCs w:val="19"/>
+              </w:rPr>
+              <w:t xml:space="preserve">IPL LINUX</w:t>
             </w:r>
           </w:p>
         </w:tc>
@@ -2834,7 +2900,7 @@
                 <w:sz w:val="19"/>
                 <w:szCs w:val="19"/>
               </w:rPr>
-              <w:t xml:space="preserve">next</w:t>
+              <w:t xml:space="preserve">complete</w:t>
             </w:r>
           </w:p>
         </w:tc>
@@ -2861,7 +2927,7 @@
                 <w:sz w:val="19"/>
                 <w:szCs w:val="19"/>
               </w:rPr>
-              <w:t xml:space="preserve">M8</w:t>
+              <w:t xml:space="preserve">M7.11</w:t>
             </w:r>
           </w:p>
         </w:tc>
@@ -2882,7 +2948,7 @@
                 <w:sz w:val="19"/>
                 <w:szCs w:val="19"/>
               </w:rPr>
-              <w:t xml:space="preserve">cREXX: the 2022 release built natively (M5); the current release cross-built (M8.1)</w:t>
+              <w:t xml:space="preserve">a 3390-9 Debian disk (about 7 GB) as the standard Linux disk</w:t>
             </w:r>
           </w:p>
         </w:tc>
@@ -2903,7 +2969,7 @@
                 <w:sz w:val="19"/>
                 <w:szCs w:val="19"/>
               </w:rPr>
-              <w:t xml:space="preserve">complete</w:t>
+              <w:t xml:space="preserve">in progress</w:t>
             </w:r>
           </w:p>
         </w:tc>
@@ -2930,7 +2996,7 @@
                 <w:sz w:val="19"/>
                 <w:szCs w:val="19"/>
               </w:rPr>
-              <w:t xml:space="preserve">M8.2</w:t>
+              <w:t xml:space="preserve">M8</w:t>
             </w:r>
           </w:p>
         </w:tc>
@@ -2951,7 +3017,7 @@
                 <w:sz w:val="19"/>
                 <w:szCs w:val="19"/>
               </w:rPr>
-              <w:t xml:space="preserve">the current cREXX built natively with GCC380</w:t>
+              <w:t xml:space="preserve">cREXX: the 2022 release built natively (M5); the current release cross-built (M8.1)</w:t>
             </w:r>
           </w:p>
         </w:tc>
@@ -2972,7 +3038,7 @@
                 <w:sz w:val="19"/>
                 <w:szCs w:val="19"/>
               </w:rPr>
-              <w:t xml:space="preserve">compiler, assembler and VM work; the library does not build yet</w:t>
+              <w:t xml:space="preserve">complete</w:t>
             </w:r>
           </w:p>
         </w:tc>
@@ -2999,7 +3065,7 @@
                 <w:sz w:val="19"/>
                 <w:szCs w:val="19"/>
               </w:rPr>
-              <w:t xml:space="preserve">—</w:t>
+              <w:t xml:space="preserve">M8.2</w:t>
             </w:r>
           </w:p>
         </w:tc>
@@ -3020,7 +3086,7 @@
                 <w:sz w:val="19"/>
                 <w:szCs w:val="19"/>
               </w:rPr>
-              <w:t xml:space="preserve">languages in cREXX for CMS and Linux; Turbo CREXX</w:t>
+              <w:t xml:space="preserve">the current cREXX built natively with GCC380</w:t>
             </w:r>
           </w:p>
         </w:tc>
@@ -3041,7 +3107,7 @@
                 <w:sz w:val="19"/>
                 <w:szCs w:val="19"/>
               </w:rPr>
-              <w:t xml:space="preserve">complete on both</w:t>
+              <w:t xml:space="preserve">compiler, assembler and VM work; the library does not build yet</w:t>
             </w:r>
           </w:p>
         </w:tc>
@@ -3089,7 +3155,7 @@
                 <w:sz w:val="19"/>
                 <w:szCs w:val="19"/>
               </w:rPr>
-              <w:t xml:space="preserve">GNU C 4.6, Python 2.7 and 3.2, Regina REXX and THE under Debian</w:t>
+              <w:t xml:space="preserve">languages in cREXX for CMS and Linux; Turbo CREXX</w:t>
             </w:r>
           </w:p>
         </w:tc>
@@ -3110,7 +3176,7 @@
                 <w:sz w:val="19"/>
                 <w:szCs w:val="19"/>
               </w:rPr>
-              <w:t xml:space="preserve">complete</w:t>
+              <w:t xml:space="preserve">complete on both</w:t>
             </w:r>
           </w:p>
         </w:tc>
@@ -3137,6 +3203,75 @@
                 <w:sz w:val="19"/>
                 <w:szCs w:val="19"/>
               </w:rPr>
+              <w:t xml:space="preserve">—</w:t>
+            </w:r>
+          </w:p>
+        </w:tc>
+        <w:tc>
+          <w:tcPr>
+            <w:tcW w:type="dxa" w:w="6038"/>
+            <w:tcMar>
+              <w:top w:type="dxa" w:w="60"/>
+              <w:left w:type="dxa" w:w="100"/>
+              <w:bottom w:type="dxa" w:w="60"/>
+              <w:right w:type="dxa" w:w="100"/>
+            </w:tcMar>
+          </w:tcPr>
+          <w:p>
+            <w:r>
+              <w:rPr>
+                <w:rFonts w:ascii="Times New Roman" w:cs="Times New Roman" w:eastAsia="Times New Roman" w:hAnsi="Times New Roman"/>
+                <w:sz w:val="19"/>
+                <w:szCs w:val="19"/>
+              </w:rPr>
+              <w:t xml:space="preserve">GNU C 4.6, Python 2.7 and 3.2, Regina REXX and THE under Debian</w:t>
+            </w:r>
+          </w:p>
+        </w:tc>
+        <w:tc>
+          <w:tcPr>
+            <w:tcW w:type="dxa" w:w="2200"/>
+            <w:tcMar>
+              <w:top w:type="dxa" w:w="60"/>
+              <w:left w:type="dxa" w:w="100"/>
+              <w:bottom w:type="dxa" w:w="60"/>
+              <w:right w:type="dxa" w:w="100"/>
+            </w:tcMar>
+          </w:tcPr>
+          <w:p>
+            <w:r>
+              <w:rPr>
+                <w:rFonts w:ascii="Times New Roman" w:cs="Times New Roman" w:eastAsia="Times New Roman" w:hAnsi="Times New Roman"/>
+                <w:sz w:val="19"/>
+                <w:szCs w:val="19"/>
+              </w:rPr>
+              <w:t xml:space="preserve">complete</w:t>
+            </w:r>
+          </w:p>
+        </w:tc>
+      </w:tr>
+      <w:tr>
+        <w:trPr>
+          <w:cantSplit/>
+          <w:tblHeader w:val="false"/>
+        </w:trPr>
+        <w:tc>
+          <w:tcPr>
+            <w:tcW w:type="dxa" w:w="1400"/>
+            <w:tcMar>
+              <w:top w:type="dxa" w:w="60"/>
+              <w:left w:type="dxa" w:w="100"/>
+              <w:bottom w:type="dxa" w:w="60"/>
+              <w:right w:type="dxa" w:w="100"/>
+            </w:tcMar>
+          </w:tcPr>
+          <w:p>
+            <w:r>
+              <w:rPr>
+                <w:rFonts w:ascii="Times New Roman" w:cs="Times New Roman" w:eastAsia="Times New Roman" w:hAnsi="Times New Roman"/>
+                <w:sz w:val="19"/>
+                <w:szCs w:val="19"/>
+              </w:rPr>
               <w:t xml:space="preserve">M9</w:t>
             </w:r>
           </w:p>
@@ -3205,7 +3340,7 @@
           <w:sz w:val="18"/>
           <w:szCs w:val="18"/>
         </w:rPr>
-        <w:t xml:space="preserve">VM/370+ milestones</w:t>
+        <w:t xml:space="preserve">VM/370plus milestones</w:t>
       </w:r>
     </w:p>
     <w:p>
@@ -3315,7 +3450,7 @@
                 <w:sz w:val="18"/>
                 <w:szCs w:val="18"/>
               </w:rPr>
-              <w:t xml:space="preserve">VM/370+</w:t>
+              <w:t xml:space="preserve">VM/370plus</w:t>
             </w:r>
           </w:p>
         </w:tc>
@@ -4248,7 +4383,7 @@
                 <w:sz w:val="19"/>
                 <w:szCs w:val="19"/>
               </w:rPr>
-              <w:t xml:space="preserve">IPL name</w:t>
+              <w:t xml:space="preserve">IPL LINUX</w:t>
             </w:r>
           </w:p>
         </w:tc>
@@ -4269,7 +4404,7 @@
                 <w:sz w:val="19"/>
                 <w:szCs w:val="19"/>
               </w:rPr>
-              <w:t xml:space="preserve">Always IPLs a System/370 machine; a pending </w:t>
+              <w:t xml:space="preserve">New. IPLs the Debian disk at virtual address 250 as an ESA/390 machine: </w:t>
             </w:r>
             <w:r>
               <w:rPr>
@@ -4285,7 +4420,23 @@
                 <w:sz w:val="19"/>
                 <w:szCs w:val="19"/>
               </w:rPr>
-              <w:t xml:space="preserve"> waits for the next IPL of a device.</w:t>
+              <w:t xml:space="preserve"> and </w:t>
+            </w:r>
+            <w:r>
+              <w:rPr>
+                <w:rFonts w:ascii="Courier New" w:cs="Courier New" w:eastAsia="Courier New" w:hAnsi="Courier New"/>
+                <w:sz w:val="19"/>
+                <w:szCs w:val="19"/>
+              </w:rPr>
+              <w:t xml:space="preserve">IPL 250</w:t>
+            </w:r>
+            <w:r>
+              <w:rPr>
+                <w:rFonts w:ascii="Times New Roman" w:cs="Times New Roman" w:eastAsia="Times New Roman" w:hAnsi="Times New Roman"/>
+                <w:sz w:val="19"/>
+                <w:szCs w:val="19"/>
+              </w:rPr>
+              <w:t xml:space="preserve"> in one command. Works from a directory IPL statement too.</w:t>
             </w:r>
           </w:p>
         </w:tc>
@@ -4312,7 +4463,7 @@
                 <w:sz w:val="19"/>
                 <w:szCs w:val="19"/>
               </w:rPr>
-              <w:t xml:space="preserve">DEFINE STORAGE</w:t>
+              <w:t xml:space="preserve">IPL name</w:t>
             </w:r>
           </w:p>
         </w:tc>
@@ -4333,7 +4484,23 @@
                 <w:sz w:val="19"/>
                 <w:szCs w:val="19"/>
               </w:rPr>
-              <w:t xml:space="preserve">Up to 256 MB. Leaves the named system the user was running.</w:t>
+              <w:t xml:space="preserve">Any other name always IPLs a System/370 machine; a pending </w:t>
+            </w:r>
+            <w:r>
+              <w:rPr>
+                <w:rFonts w:ascii="Courier New" w:cs="Courier New" w:eastAsia="Courier New" w:hAnsi="Courier New"/>
+                <w:sz w:val="19"/>
+                <w:szCs w:val="19"/>
+              </w:rPr>
+              <w:t xml:space="preserve">SET ESA ON</w:t>
+            </w:r>
+            <w:r>
+              <w:rPr>
+                <w:rFonts w:ascii="Times New Roman" w:cs="Times New Roman" w:eastAsia="Times New Roman" w:hAnsi="Times New Roman"/>
+                <w:sz w:val="19"/>
+                <w:szCs w:val="19"/>
+              </w:rPr>
+              <w:t xml:space="preserve"> waits for the next IPL of a device.</w:t>
             </w:r>
           </w:p>
         </w:tc>
@@ -4360,23 +4527,7 @@
                 <w:sz w:val="19"/>
                 <w:szCs w:val="19"/>
               </w:rPr>
-              <w:t xml:space="preserve">DISPLAY</w:t>
-            </w:r>
-            <w:r>
-              <w:rPr>
-                <w:rFonts w:ascii="Times New Roman" w:cs="Times New Roman" w:eastAsia="Times New Roman" w:hAnsi="Times New Roman"/>
-                <w:sz w:val="19"/>
-                <w:szCs w:val="19"/>
-              </w:rPr>
-              <w:t xml:space="preserve">, </w:t>
-            </w:r>
-            <w:r>
-              <w:rPr>
-                <w:rFonts w:ascii="Courier New" w:cs="Courier New" w:eastAsia="Courier New" w:hAnsi="Courier New"/>
-                <w:sz w:val="19"/>
-                <w:szCs w:val="19"/>
-              </w:rPr>
-              <w:t xml:space="preserve">STORE</w:t>
+              <w:t xml:space="preserve">DEFINE STORAGE</w:t>
             </w:r>
           </w:p>
         </w:tc>
@@ -4397,7 +4548,7 @@
                 <w:sz w:val="19"/>
                 <w:szCs w:val="19"/>
               </w:rPr>
-              <w:t xml:space="preserve">Address storage above 16 MB.</w:t>
+              <w:t xml:space="preserve">Up to 256 MB. Leaves the named system the user was running.</w:t>
             </w:r>
           </w:p>
         </w:tc>
@@ -4424,6 +4575,70 @@
                 <w:sz w:val="19"/>
                 <w:szCs w:val="19"/>
               </w:rPr>
+              <w:t xml:space="preserve">DISPLAY</w:t>
+            </w:r>
+            <w:r>
+              <w:rPr>
+                <w:rFonts w:ascii="Times New Roman" w:cs="Times New Roman" w:eastAsia="Times New Roman" w:hAnsi="Times New Roman"/>
+                <w:sz w:val="19"/>
+                <w:szCs w:val="19"/>
+              </w:rPr>
+              <w:t xml:space="preserve">, </w:t>
+            </w:r>
+            <w:r>
+              <w:rPr>
+                <w:rFonts w:ascii="Courier New" w:cs="Courier New" w:eastAsia="Courier New" w:hAnsi="Courier New"/>
+                <w:sz w:val="19"/>
+                <w:szCs w:val="19"/>
+              </w:rPr>
+              <w:t xml:space="preserve">STORE</w:t>
+            </w:r>
+          </w:p>
+        </w:tc>
+        <w:tc>
+          <w:tcPr>
+            <w:tcW w:type="dxa" w:w="6638"/>
+            <w:tcMar>
+              <w:top w:type="dxa" w:w="60"/>
+              <w:left w:type="dxa" w:w="100"/>
+              <w:bottom w:type="dxa" w:w="60"/>
+              <w:right w:type="dxa" w:w="100"/>
+            </w:tcMar>
+          </w:tcPr>
+          <w:p>
+            <w:r>
+              <w:rPr>
+                <w:rFonts w:ascii="Times New Roman" w:cs="Times New Roman" w:eastAsia="Times New Roman" w:hAnsi="Times New Roman"/>
+                <w:sz w:val="19"/>
+                <w:szCs w:val="19"/>
+              </w:rPr>
+              <w:t xml:space="preserve">Address storage above 16 MB.</w:t>
+            </w:r>
+          </w:p>
+        </w:tc>
+      </w:tr>
+      <w:tr>
+        <w:trPr>
+          <w:cantSplit/>
+          <w:tblHeader w:val="false"/>
+        </w:trPr>
+        <w:tc>
+          <w:tcPr>
+            <w:tcW w:type="dxa" w:w="3000"/>
+            <w:tcMar>
+              <w:top w:type="dxa" w:w="60"/>
+              <w:left w:type="dxa" w:w="100"/>
+              <w:bottom w:type="dxa" w:w="60"/>
+              <w:right w:type="dxa" w:w="100"/>
+            </w:tcMar>
+          </w:tcPr>
+          <w:p>
+            <w:r>
+              <w:rPr>
+                <w:rFonts w:ascii="Courier New" w:cs="Courier New" w:eastAsia="Courier New" w:hAnsi="Courier New"/>
+                <w:sz w:val="19"/>
+                <w:szCs w:val="19"/>
+              </w:rPr>
               <w:t xml:space="preserve">QUERY VIRTUAL STORAGE</w:t>
             </w:r>
           </w:p>
@@ -4610,7 +4825,7 @@
         <w:pageBreakBefore/>
       </w:pPr>
       <w:r>
-        <w:t xml:space="preserve">Chapter 3. Installing VM/370+</w:t>
+        <w:t xml:space="preserve">Chapter 3. Installing VM/370plus</w:t>
       </w:r>
     </w:p>
     <w:p>
@@ -4648,7 +4863,7 @@
         <w:rPr>
           <w:rFonts w:ascii="Times New Roman" w:cs="Times New Roman" w:eastAsia="Times New Roman" w:hAnsi="Times New Roman"/>
         </w:rPr>
-        <w:t xml:space="preserve">. Do not install VM/370+ over a system you care about.</w:t>
+        <w:t xml:space="preserve">. Do not install VM/370plus over a system you care about.</w:t>
       </w:r>
     </w:p>
     <w:p>
@@ -4712,7 +4927,7 @@
         <w:rPr>
           <w:rFonts w:ascii="Times New Roman" w:cs="Times New Roman" w:eastAsia="Times New Roman" w:hAnsi="Times New Roman"/>
         </w:rPr>
-        <w:t xml:space="preserve">The VM/370+ kit: seven zip files, each under 30 MB.</w:t>
+        <w:t xml:space="preserve">The VM/370plus kit: seven zip files, each under 30 MB.</w:t>
       </w:r>
     </w:p>
     <w:tbl>
@@ -5510,7 +5725,7 @@
                 <w:sz w:val="17"/>
                 <w:szCs w:val="17"/>
               </w:rPr>
-              <w:t xml:space="preserve">VM/370+ Online</w:t>
+              <w:t xml:space="preserve">VM/370plus Online</w:t>
             </w:r>
           </w:p>
           <w:p>
@@ -5588,7 +5803,7 @@
           <w:sz w:val="18"/>
           <w:szCs w:val="18"/>
         </w:rPr>
-        <w:t xml:space="preserve">The first IPL of VM/370+</w:t>
+        <w:t xml:space="preserve">The first IPL of VM/370plus</w:t>
       </w:r>
     </w:p>
     <w:p>
@@ -5720,7 +5935,7 @@
         <w:pageBreakBefore/>
       </w:pPr>
       <w:r>
-        <w:t xml:space="preserve">Chapter 4. Operating VM/370+</w:t>
+        <w:t xml:space="preserve">Chapter 4. Operating VM/370plus</w:t>
       </w:r>
     </w:p>
     <w:p>
@@ -6702,7 +6917,7 @@
         <w:pStyle w:val="Heading2"/>
       </w:pPr>
       <w:r>
-        <w:t xml:space="preserve">Starting Linux with the LINUX EXEC</w:t>
+        <w:t xml:space="preserve">Starting Linux from its disk: IPL LINUX</w:t>
       </w:r>
     </w:p>
     <w:p>
@@ -6713,35 +6928,7 @@
         <w:rPr>
           <w:rFonts w:ascii="Times New Roman" w:cs="Times New Roman" w:eastAsia="Times New Roman" w:hAnsi="Times New Roman"/>
         </w:rPr>
-        <w:t xml:space="preserve">The Linux kernel, the IPL parameter files and the </w:t>
-      </w:r>
-      <w:r>
-        <w:rPr>
-          <w:rFonts w:ascii="Courier New" w:cs="Courier New" w:eastAsia="Courier New" w:hAnsi="Courier New"/>
-          <w:sz w:val="19"/>
-          <w:szCs w:val="19"/>
-        </w:rPr>
-        <w:t xml:space="preserve">LINUX EXEC</w:t>
-      </w:r>
-      <w:r>
-        <w:rPr>
-          <w:rFonts w:ascii="Times New Roman" w:cs="Times New Roman" w:eastAsia="Times New Roman" w:hAnsi="Times New Roman"/>
-        </w:rPr>
-        <w:t xml:space="preserve"> are on MAINT’s 19D disk, which every CMS user accesses as the U disk. From CMS, with 64 MB of storage and the devices attached, type </w:t>
-      </w:r>
-      <w:r>
-        <w:rPr>
-          <w:rFonts w:ascii="Courier New" w:cs="Courier New" w:eastAsia="Courier New" w:hAnsi="Courier New"/>
-          <w:sz w:val="19"/>
-          <w:szCs w:val="19"/>
-        </w:rPr>
-        <w:t xml:space="preserve">LINUX</w:t>
-      </w:r>
-      <w:r>
-        <w:rPr>
-          <w:rFonts w:ascii="Times New Roman" w:cs="Times New Roman" w:eastAsia="Times New Roman" w:hAnsi="Times New Roman"/>
-        </w:rPr>
-        <w:t xml:space="preserve">:</w:t>
+        <w:t xml:space="preserve">The Debian disk carries its own kernel and IPL records, so Linux IPLs straight from it. With 64 MB of storage and the devices attached (the disk at 250), one CP command is enough, from CMS or from CP:</w:t>
       </w:r>
     </w:p>
     <w:tbl>
@@ -6810,7 +6997,7 @@
                 <w:sz w:val="17"/>
                 <w:szCs w:val="17"/>
               </w:rPr>
-              <w:t xml:space="preserve">ipl cms</w:t>
+              <w:t xml:space="preserve">cp ipl linux</w:t>
             </w:r>
           </w:p>
           <w:p>
@@ -6823,124 +7010,7 @@
                 <w:sz w:val="17"/>
                 <w:szCs w:val="17"/>
               </w:rPr>
-              <w:t xml:space="preserve">Ready;</w:t>
-            </w:r>
-          </w:p>
-          <w:p>
-            <w:pPr>
-              <w:spacing w:after="0" w:line="228"/>
-            </w:pPr>
-            <w:r>
-              <w:rPr>
-                <w:rFonts w:ascii="Courier New" w:cs="Courier New" w:eastAsia="Courier New" w:hAnsi="Courier New"/>
-                <w:sz w:val="17"/>
-                <w:szCs w:val="17"/>
-              </w:rPr>
-              <w:t xml:space="preserve">linux</w:t>
-            </w:r>
-          </w:p>
-          <w:p>
-            <w:pPr>
-              <w:spacing w:after="0" w:line="228"/>
-            </w:pPr>
-            <w:r>
-              <w:rPr>
-                <w:rFonts w:ascii="Courier New" w:cs="Courier New" w:eastAsia="Courier New" w:hAnsi="Courier New"/>
-                <w:sz w:val="17"/>
-                <w:szCs w:val="17"/>
-              </w:rPr>
-              <w:t xml:space="preserve">LINUX: punching the kernel and CMSUSER LXPARM to your reader ...</w:t>
-            </w:r>
-          </w:p>
-          <w:p>
-            <w:pPr>
-              <w:spacing w:after="0" w:line="228"/>
-            </w:pPr>
-            <w:r>
-              <w:rPr>
-                <w:rFonts w:ascii="Courier New" w:cs="Courier New" w:eastAsia="Courier New" w:hAnsi="Courier New"/>
-                <w:sz w:val="17"/>
-                <w:szCs w:val="17"/>
-              </w:rPr>
-              <w:t xml:space="preserve">PUN FILE 0002  TO  CMSUSER  COPY 01 NOHOLD</w:t>
-            </w:r>
-          </w:p>
-          <w:p>
-            <w:pPr>
-              <w:spacing w:after="0" w:line="228"/>
-            </w:pPr>
-            <w:r>
-              <w:rPr>
-                <w:rFonts w:ascii="Courier New" w:cs="Courier New" w:eastAsia="Courier New" w:hAnsi="Courier New"/>
-                <w:sz w:val="17"/>
-                <w:szCs w:val="17"/>
-              </w:rPr>
-              <w:t xml:space="preserve">PUN FILE 0003  TO  CMSUSER  COPY 01 NOHOLD</w:t>
-            </w:r>
-          </w:p>
-          <w:p>
-            <w:pPr>
-              <w:spacing w:after="0" w:line="228"/>
-            </w:pPr>
-            <w:r>
-              <w:rPr>
-                <w:rFonts w:ascii="Courier New" w:cs="Courier New" w:eastAsia="Courier New" w:hAnsi="Courier New"/>
-                <w:sz w:val="17"/>
-                <w:szCs w:val="17"/>
-              </w:rPr>
-              <w:t xml:space="preserve">LINUX: IPL 00C as an ESA/390 machine</w:t>
-            </w:r>
-          </w:p>
-          <w:p>
-            <w:pPr>
-              <w:spacing w:after="0" w:line="228"/>
-            </w:pPr>
-            <w:r>
-              <w:rPr>
-                <w:rFonts w:ascii="Courier New" w:cs="Courier New" w:eastAsia="Courier New" w:hAnsi="Courier New"/>
-                <w:sz w:val="17"/>
-                <w:szCs w:val="17"/>
-              </w:rPr>
               <w:t xml:space="preserve">Linux version 4.0.0+ ...</w:t>
-            </w:r>
-          </w:p>
-          <w:p>
-            <w:pPr>
-              <w:spacing w:after="0" w:line="228"/>
-            </w:pPr>
-            <w:r>
-              <w:rPr>
-                <w:rFonts w:ascii="Courier New" w:cs="Courier New" w:eastAsia="Courier New" w:hAnsi="Courier New"/>
-                <w:sz w:val="17"/>
-                <w:szCs w:val="17"/>
-              </w:rPr>
-              <w:t xml:space="preserve">...</w:t>
-            </w:r>
-          </w:p>
-          <w:p>
-            <w:pPr>
-              <w:spacing w:after="0" w:line="228"/>
-            </w:pPr>
-            <w:r>
-              <w:rPr>
-                <w:rFonts w:ascii="Courier New" w:cs="Courier New" w:eastAsia="Courier New" w:hAnsi="Courier New"/>
-                <w:sz w:val="17"/>
-                <w:szCs w:val="17"/>
-              </w:rPr>
-              <w:t xml:space="preserve">root: the system on /dev/dasda1 -- switch_root</w:t>
-            </w:r>
-          </w:p>
-          <w:p>
-            <w:pPr>
-              <w:spacing w:after="0" w:line="228"/>
-            </w:pPr>
-            <w:r>
-              <w:rPr>
-                <w:rFonts w:ascii="Courier New" w:cs="Courier New" w:eastAsia="Courier New" w:hAnsi="Courier New"/>
-                <w:sz w:val="17"/>
-                <w:szCs w:val="17"/>
-              </w:rPr>
-              <w:t xml:space="preserve">INIT: version 2.88 booting</w:t>
             </w:r>
           </w:p>
           <w:p>
@@ -6998,6 +7068,956 @@
           <w:szCs w:val="18"/>
         </w:rPr>
         <w:t xml:space="preserve">Figure 9. </w:t>
+      </w:r>
+      <w:r>
+        <w:rPr>
+          <w:rFonts w:ascii="Arial" w:cs="Arial" w:eastAsia="Arial" w:hAnsi="Arial"/>
+          <w:sz w:val="18"/>
+          <w:szCs w:val="18"/>
+        </w:rPr>
+        <w:t xml:space="preserve">Starting Linux from its disk</w:t>
+      </w:r>
+    </w:p>
+    <w:p>
+      <w:pPr>
+        <w:spacing w:after="120"/>
+      </w:pPr>
+      <w:r>
+        <w:rPr>
+          <w:rFonts w:ascii="Courier New" w:cs="Courier New" w:eastAsia="Courier New" w:hAnsi="Courier New"/>
+          <w:sz w:val="19"/>
+          <w:szCs w:val="19"/>
+        </w:rPr>
+        <w:t xml:space="preserve">IPL LINUX</w:t>
+      </w:r>
+      <w:r>
+        <w:rPr>
+          <w:rFonts w:ascii="Times New Roman" w:cs="Times New Roman" w:eastAsia="Times New Roman" w:hAnsi="Times New Roman"/>
+        </w:rPr>
+        <w:t xml:space="preserve"> is </w:t>
+      </w:r>
+      <w:r>
+        <w:rPr>
+          <w:rFonts w:ascii="Courier New" w:cs="Courier New" w:eastAsia="Courier New" w:hAnsi="Courier New"/>
+          <w:sz w:val="19"/>
+          <w:szCs w:val="19"/>
+        </w:rPr>
+        <w:t xml:space="preserve">SET ESA ON</w:t>
+      </w:r>
+      <w:r>
+        <w:rPr>
+          <w:rFonts w:ascii="Times New Roman" w:cs="Times New Roman" w:eastAsia="Times New Roman" w:hAnsi="Times New Roman"/>
+        </w:rPr>
+        <w:t xml:space="preserve"> followed by </w:t>
+      </w:r>
+      <w:r>
+        <w:rPr>
+          <w:rFonts w:ascii="Courier New" w:cs="Courier New" w:eastAsia="Courier New" w:hAnsi="Courier New"/>
+          <w:sz w:val="19"/>
+          <w:szCs w:val="19"/>
+        </w:rPr>
+        <w:t xml:space="preserve">IPL 250</w:t>
+      </w:r>
+      <w:r>
+        <w:rPr>
+          <w:rFonts w:ascii="Times New Roman" w:cs="Times New Roman" w:eastAsia="Times New Roman" w:hAnsi="Times New Roman"/>
+        </w:rPr>
+        <w:t xml:space="preserve">. Options of the device IPL may follow (</w:t>
+      </w:r>
+      <w:r>
+        <w:rPr>
+          <w:rFonts w:ascii="Courier New" w:cs="Courier New" w:eastAsia="Courier New" w:hAnsi="Courier New"/>
+          <w:sz w:val="19"/>
+          <w:szCs w:val="19"/>
+        </w:rPr>
+        <w:t xml:space="preserve">IPL LINUX CLEAR</w:t>
+      </w:r>
+      <w:r>
+        <w:rPr>
+          <w:rFonts w:ascii="Times New Roman" w:cs="Times New Roman" w:eastAsia="Times New Roman" w:hAnsi="Times New Roman"/>
+        </w:rPr>
+        <w:t xml:space="preserve">). The kernel parameters, including the IP address, were written to the disk with the kernel by </w:t>
+      </w:r>
+      <w:r>
+        <w:rPr>
+          <w:rFonts w:ascii="Courier New" w:cs="Courier New" w:eastAsia="Courier New" w:hAnsi="Courier New"/>
+          <w:sz w:val="19"/>
+          <w:szCs w:val="19"/>
+        </w:rPr>
+        <w:t xml:space="preserve">vmzipl</w:t>
+      </w:r>
+      <w:r>
+        <w:rPr>
+          <w:rFonts w:ascii="Times New Roman" w:cs="Times New Roman" w:eastAsia="Times New Roman" w:hAnsi="Times New Roman"/>
+        </w:rPr>
+        <w:t xml:space="preserve"> (below); the reader route that follows remains for a different kernel or other parameters.</w:t>
+      </w:r>
+    </w:p>
+    <w:p>
+      <w:pPr>
+        <w:pStyle w:val="Heading2"/>
+      </w:pPr>
+      <w:r>
+        <w:t xml:space="preserve">Making a disk IPLable: vmzipl</w:t>
+      </w:r>
+    </w:p>
+    <w:p>
+      <w:pPr>
+        <w:spacing w:after="120"/>
+      </w:pPr>
+      <w:r>
+        <w:rPr>
+          <w:rFonts w:ascii="Courier New" w:cs="Courier New" w:eastAsia="Courier New" w:hAnsi="Courier New"/>
+          <w:sz w:val="19"/>
+          <w:szCs w:val="19"/>
+        </w:rPr>
+        <w:t xml:space="preserve">vmzipl</w:t>
+      </w:r>
+      <w:r>
+        <w:rPr>
+          <w:rFonts w:ascii="Times New Roman" w:cs="Times New Roman" w:eastAsia="Times New Roman" w:hAnsi="Times New Roman"/>
+        </w:rPr>
+        <w:t xml:space="preserve"> is the VM/370plus counterpart of </w:t>
+      </w:r>
+      <w:r>
+        <w:rPr>
+          <w:rFonts w:ascii="Courier New" w:cs="Courier New" w:eastAsia="Courier New" w:hAnsi="Courier New"/>
+          <w:sz w:val="19"/>
+          <w:szCs w:val="19"/>
+        </w:rPr>
+        <w:t xml:space="preserve">zipl</w:t>
+      </w:r>
+      <w:r>
+        <w:rPr>
+          <w:rFonts w:ascii="Times New Roman" w:cs="Times New Roman" w:eastAsia="Times New Roman" w:hAnsi="Times New Roman"/>
+        </w:rPr>
+        <w:t xml:space="preserve">, for the 31-bit Linux 4.0 kernel. It is installed on the Debian disk as </w:t>
+      </w:r>
+      <w:r>
+        <w:rPr>
+          <w:rFonts w:ascii="Courier New" w:cs="Courier New" w:eastAsia="Courier New" w:hAnsi="Courier New"/>
+          <w:sz w:val="19"/>
+          <w:szCs w:val="19"/>
+        </w:rPr>
+        <w:t xml:space="preserve">/usr/local/sbin/vmzipl</w:t>
+      </w:r>
+      <w:r>
+        <w:rPr>
+          <w:rFonts w:ascii="Times New Roman" w:cs="Times New Roman" w:eastAsia="Times New Roman" w:hAnsi="Times New Roman"/>
+        </w:rPr>
+        <w:t xml:space="preserve">. Run it as root after changing the kernel or its parameters:</w:t>
+      </w:r>
+    </w:p>
+    <w:tbl>
+      <w:tblPr>
+        <w:tblW w:type="dxa" w:w="9638"/>
+        <w:tblBorders>
+          <w:top w:val="single" w:color="auto" w:sz="4"/>
+          <w:left w:val="single" w:color="auto" w:sz="4"/>
+          <w:bottom w:val="single" w:color="auto" w:sz="4"/>
+          <w:right w:val="single" w:color="auto" w:sz="4"/>
+          <w:insideH w:val="single" w:color="auto" w:sz="4"/>
+          <w:insideV w:val="single" w:color="auto" w:sz="4"/>
+        </w:tblBorders>
+      </w:tblPr>
+      <w:tblGrid>
+        <w:gridCol w:w="9638"/>
+      </w:tblGrid>
+      <w:tr>
+        <w:trPr>
+          <w:cantSplit/>
+        </w:trPr>
+        <w:tc>
+          <w:tcPr>
+            <w:tcW w:type="dxa" w:w="9638"/>
+            <w:shd w:fill="F2F2F2" w:color="auto" w:val="clear"/>
+            <w:tcMar>
+              <w:top w:type="dxa" w:w="100"/>
+              <w:left w:type="dxa" w:w="140"/>
+              <w:bottom w:type="dxa" w:w="100"/>
+              <w:right w:type="dxa" w:w="140"/>
+            </w:tcMar>
+          </w:tcPr>
+          <w:p>
+            <w:pPr>
+              <w:spacing w:after="0" w:line="228"/>
+            </w:pPr>
+            <w:r>
+              <w:rPr>
+                <w:rFonts w:ascii="Courier New" w:cs="Courier New" w:eastAsia="Courier New" w:hAnsi="Courier New"/>
+                <w:sz w:val="17"/>
+                <w:szCs w:val="17"/>
+              </w:rPr>
+              <w:t xml:space="preserve">vmzipl</w:t>
+            </w:r>
+          </w:p>
+          <w:p>
+            <w:pPr>
+              <w:spacing w:after="0" w:line="228"/>
+            </w:pPr>
+            <w:r>
+              <w:rPr>
+                <w:rFonts w:ascii="Courier New" w:cs="Courier New" w:eastAsia="Courier New" w:hAnsi="Courier New"/>
+                <w:sz w:val="17"/>
+                <w:szCs w:val="17"/>
+              </w:rPr>
+              <w:t xml:space="preserve">vmzipl: /dev/dasda: kernel 1775 blocks in 151 runs, channel program 2560 CCWs in 5 blocks</w:t>
+            </w:r>
+          </w:p>
+          <w:p>
+            <w:pPr>
+              <w:spacing w:after="0" w:line="228"/>
+            </w:pPr>
+            <w:r>
+              <w:rPr>
+                <w:rFonts w:ascii="Courier New" w:cs="Courier New" w:eastAsia="Courier New" w:hAnsi="Courier New"/>
+                <w:sz w:val="17"/>
+                <w:szCs w:val="17"/>
+              </w:rPr>
+              <w:t xml:space="preserve">vmzipl: parameters: no_removal_warning conmode=3215 condev=0x0009 vmip=10.1.1.2 vmpeer=10.1.1.1</w:t>
+            </w:r>
+          </w:p>
+          <w:p>
+            <w:pPr>
+              <w:spacing w:after="0" w:line="228"/>
+            </w:pPr>
+            <w:r>
+              <w:rPr>
+                <w:rFonts w:ascii="Courier New" w:cs="Courier New" w:eastAsia="Courier New" w:hAnsi="Courier New"/>
+                <w:sz w:val="17"/>
+                <w:szCs w:val="17"/>
+              </w:rPr>
+              <w:t xml:space="preserve">vmzipl: IPL with  CP SET ESA ON  and  CP IPL &lt;address of this disk&gt;</w:t>
+            </w:r>
+          </w:p>
+        </w:tc>
+      </w:tr>
+    </w:tbl>
+    <w:p>
+      <w:pPr>
+        <w:spacing w:after="200" w:before="80"/>
+      </w:pPr>
+      <w:r>
+        <w:rPr>
+          <w:rFonts w:ascii="Arial" w:cs="Arial" w:eastAsia="Arial" w:hAnsi="Arial"/>
+          <w:b/>
+          <w:bCs/>
+          <w:sz w:val="18"/>
+          <w:szCs w:val="18"/>
+        </w:rPr>
+        <w:t xml:space="preserve">Figure 10. </w:t>
+      </w:r>
+      <w:r>
+        <w:rPr>
+          <w:rFonts w:ascii="Arial" w:cs="Arial" w:eastAsia="Arial" w:hAnsi="Arial"/>
+          <w:sz w:val="18"/>
+          <w:szCs w:val="18"/>
+        </w:rPr>
+        <w:t xml:space="preserve">Running vmzipl</w:t>
+      </w:r>
+    </w:p>
+    <w:tbl>
+      <w:tblPr>
+        <w:tblW w:type="dxa" w:w="9638"/>
+        <w:tblBorders>
+          <w:top w:val="single" w:color="808080" w:sz="4"/>
+          <w:left w:val="single" w:color="808080" w:sz="4"/>
+          <w:bottom w:val="single" w:color="808080" w:sz="4"/>
+          <w:right w:val="single" w:color="808080" w:sz="4"/>
+          <w:insideH w:val="single" w:color="808080" w:sz="4"/>
+          <w:insideV w:val="single" w:color="808080" w:sz="4"/>
+        </w:tblBorders>
+      </w:tblPr>
+      <w:tblGrid>
+        <w:gridCol w:w="2400"/>
+        <w:gridCol w:w="7238"/>
+      </w:tblGrid>
+      <w:tr>
+        <w:trPr>
+          <w:cantSplit/>
+          <w:tblHeader/>
+        </w:trPr>
+        <w:tc>
+          <w:tcPr>
+            <w:tcW w:type="dxa" w:w="2400"/>
+            <w:shd w:fill="D9D9D9" w:color="auto" w:val="clear"/>
+            <w:tcMar>
+              <w:top w:type="dxa" w:w="60"/>
+              <w:left w:type="dxa" w:w="100"/>
+              <w:bottom w:type="dxa" w:w="60"/>
+              <w:right w:type="dxa" w:w="100"/>
+            </w:tcMar>
+          </w:tcPr>
+          <w:p>
+            <w:r>
+              <w:rPr>
+                <w:rFonts w:ascii="Arial" w:cs="Arial" w:eastAsia="Arial" w:hAnsi="Arial"/>
+                <w:b/>
+                <w:bCs/>
+                <w:sz w:val="18"/>
+                <w:szCs w:val="18"/>
+              </w:rPr>
+              <w:t xml:space="preserve">Option</w:t>
+            </w:r>
+          </w:p>
+        </w:tc>
+        <w:tc>
+          <w:tcPr>
+            <w:tcW w:type="dxa" w:w="7238"/>
+            <w:shd w:fill="D9D9D9" w:color="auto" w:val="clear"/>
+            <w:tcMar>
+              <w:top w:type="dxa" w:w="60"/>
+              <w:left w:type="dxa" w:w="100"/>
+              <w:bottom w:type="dxa" w:w="60"/>
+              <w:right w:type="dxa" w:w="100"/>
+            </w:tcMar>
+          </w:tcPr>
+          <w:p>
+            <w:r>
+              <w:rPr>
+                <w:rFonts w:ascii="Arial" w:cs="Arial" w:eastAsia="Arial" w:hAnsi="Arial"/>
+                <w:b/>
+                <w:bCs/>
+                <w:sz w:val="18"/>
+                <w:szCs w:val="18"/>
+              </w:rPr>
+              <w:t xml:space="preserve">Meaning</w:t>
+            </w:r>
+          </w:p>
+        </w:tc>
+      </w:tr>
+      <w:tr>
+        <w:trPr>
+          <w:cantSplit/>
+          <w:tblHeader w:val="false"/>
+        </w:trPr>
+        <w:tc>
+          <w:tcPr>
+            <w:tcW w:type="dxa" w:w="2400"/>
+            <w:tcMar>
+              <w:top w:type="dxa" w:w="60"/>
+              <w:left w:type="dxa" w:w="100"/>
+              <w:bottom w:type="dxa" w:w="60"/>
+              <w:right w:type="dxa" w:w="100"/>
+            </w:tcMar>
+          </w:tcPr>
+          <w:p>
+            <w:r>
+              <w:rPr>
+                <w:rFonts w:ascii="Courier New" w:cs="Courier New" w:eastAsia="Courier New" w:hAnsi="Courier New"/>
+                <w:sz w:val="19"/>
+                <w:szCs w:val="19"/>
+              </w:rPr>
+              <w:t xml:space="preserve">-k file</w:t>
+            </w:r>
+          </w:p>
+        </w:tc>
+        <w:tc>
+          <w:tcPr>
+            <w:tcW w:type="dxa" w:w="7238"/>
+            <w:tcMar>
+              <w:top w:type="dxa" w:w="60"/>
+              <w:left w:type="dxa" w:w="100"/>
+              <w:bottom w:type="dxa" w:w="60"/>
+              <w:right w:type="dxa" w:w="100"/>
+            </w:tcMar>
+          </w:tcPr>
+          <w:p>
+            <w:r>
+              <w:rPr>
+                <w:rFonts w:ascii="Times New Roman" w:cs="Times New Roman" w:eastAsia="Times New Roman" w:hAnsi="Times New Roman"/>
+                <w:sz w:val="19"/>
+                <w:szCs w:val="19"/>
+              </w:rPr>
+              <w:t xml:space="preserve">the kernel image (default </w:t>
+            </w:r>
+            <w:r>
+              <w:rPr>
+                <w:rFonts w:ascii="Courier New" w:cs="Courier New" w:eastAsia="Courier New" w:hAnsi="Courier New"/>
+                <w:sz w:val="19"/>
+                <w:szCs w:val="19"/>
+              </w:rPr>
+              <w:t xml:space="preserve">/boot/linux48.image</w:t>
+            </w:r>
+            <w:r>
+              <w:rPr>
+                <w:rFonts w:ascii="Times New Roman" w:cs="Times New Roman" w:eastAsia="Times New Roman" w:hAnsi="Times New Roman"/>
+                <w:sz w:val="19"/>
+                <w:szCs w:val="19"/>
+              </w:rPr>
+              <w:t xml:space="preserve">)</w:t>
+            </w:r>
+          </w:p>
+        </w:tc>
+      </w:tr>
+      <w:tr>
+        <w:trPr>
+          <w:cantSplit/>
+          <w:tblHeader w:val="false"/>
+        </w:trPr>
+        <w:tc>
+          <w:tcPr>
+            <w:tcW w:type="dxa" w:w="2400"/>
+            <w:tcMar>
+              <w:top w:type="dxa" w:w="60"/>
+              <w:left w:type="dxa" w:w="100"/>
+              <w:bottom w:type="dxa" w:w="60"/>
+              <w:right w:type="dxa" w:w="100"/>
+            </w:tcMar>
+          </w:tcPr>
+          <w:p>
+            <w:r>
+              <w:rPr>
+                <w:rFonts w:ascii="Courier New" w:cs="Courier New" w:eastAsia="Courier New" w:hAnsi="Courier New"/>
+                <w:sz w:val="19"/>
+                <w:szCs w:val="19"/>
+              </w:rPr>
+              <w:t xml:space="preserve">-p "parameters"</w:t>
+            </w:r>
+          </w:p>
+        </w:tc>
+        <w:tc>
+          <w:tcPr>
+            <w:tcW w:type="dxa" w:w="7238"/>
+            <w:tcMar>
+              <w:top w:type="dxa" w:w="60"/>
+              <w:left w:type="dxa" w:w="100"/>
+              <w:bottom w:type="dxa" w:w="60"/>
+              <w:right w:type="dxa" w:w="100"/>
+            </w:tcMar>
+          </w:tcPr>
+          <w:p>
+            <w:r>
+              <w:rPr>
+                <w:rFonts w:ascii="Times New Roman" w:cs="Times New Roman" w:eastAsia="Times New Roman" w:hAnsi="Times New Roman"/>
+                <w:sz w:val="19"/>
+                <w:szCs w:val="19"/>
+              </w:rPr>
+              <w:t xml:space="preserve">the kernel parameter line (default: the running system’s </w:t>
+            </w:r>
+            <w:r>
+              <w:rPr>
+                <w:rFonts w:ascii="Courier New" w:cs="Courier New" w:eastAsia="Courier New" w:hAnsi="Courier New"/>
+                <w:sz w:val="19"/>
+                <w:szCs w:val="19"/>
+              </w:rPr>
+              <w:t xml:space="preserve">/proc/cmdline</w:t>
+            </w:r>
+            <w:r>
+              <w:rPr>
+                <w:rFonts w:ascii="Times New Roman" w:cs="Times New Roman" w:eastAsia="Times New Roman" w:hAnsi="Times New Roman"/>
+                <w:sz w:val="19"/>
+                <w:szCs w:val="19"/>
+              </w:rPr>
+              <w:t xml:space="preserve">)</w:t>
+            </w:r>
+          </w:p>
+        </w:tc>
+      </w:tr>
+      <w:tr>
+        <w:trPr>
+          <w:cantSplit/>
+          <w:tblHeader w:val="false"/>
+        </w:trPr>
+        <w:tc>
+          <w:tcPr>
+            <w:tcW w:type="dxa" w:w="2400"/>
+            <w:tcMar>
+              <w:top w:type="dxa" w:w="60"/>
+              <w:left w:type="dxa" w:w="100"/>
+              <w:bottom w:type="dxa" w:w="60"/>
+              <w:right w:type="dxa" w:w="100"/>
+            </w:tcMar>
+          </w:tcPr>
+          <w:p>
+            <w:r>
+              <w:rPr>
+                <w:rFonts w:ascii="Courier New" w:cs="Courier New" w:eastAsia="Courier New" w:hAnsi="Courier New"/>
+                <w:sz w:val="19"/>
+                <w:szCs w:val="19"/>
+              </w:rPr>
+              <w:t xml:space="preserve">-d device</w:t>
+            </w:r>
+          </w:p>
+        </w:tc>
+        <w:tc>
+          <w:tcPr>
+            <w:tcW w:type="dxa" w:w="7238"/>
+            <w:tcMar>
+              <w:top w:type="dxa" w:w="60"/>
+              <w:left w:type="dxa" w:w="100"/>
+              <w:bottom w:type="dxa" w:w="60"/>
+              <w:right w:type="dxa" w:w="100"/>
+            </w:tcMar>
+          </w:tcPr>
+          <w:p>
+            <w:r>
+              <w:rPr>
+                <w:rFonts w:ascii="Times New Roman" w:cs="Times New Roman" w:eastAsia="Times New Roman" w:hAnsi="Times New Roman"/>
+                <w:sz w:val="19"/>
+                <w:szCs w:val="19"/>
+              </w:rPr>
+              <w:t xml:space="preserve">the disk to make IPLable (default </w:t>
+            </w:r>
+            <w:r>
+              <w:rPr>
+                <w:rFonts w:ascii="Courier New" w:cs="Courier New" w:eastAsia="Courier New" w:hAnsi="Courier New"/>
+                <w:sz w:val="19"/>
+                <w:szCs w:val="19"/>
+              </w:rPr>
+              <w:t xml:space="preserve">/dev/dasda</w:t>
+            </w:r>
+            <w:r>
+              <w:rPr>
+                <w:rFonts w:ascii="Times New Roman" w:cs="Times New Roman" w:eastAsia="Times New Roman" w:hAnsi="Times New Roman"/>
+                <w:sz w:val="19"/>
+                <w:szCs w:val="19"/>
+              </w:rPr>
+              <w:t xml:space="preserve">)</w:t>
+            </w:r>
+          </w:p>
+        </w:tc>
+      </w:tr>
+      <w:tr>
+        <w:trPr>
+          <w:cantSplit/>
+          <w:tblHeader w:val="false"/>
+        </w:trPr>
+        <w:tc>
+          <w:tcPr>
+            <w:tcW w:type="dxa" w:w="2400"/>
+            <w:tcMar>
+              <w:top w:type="dxa" w:w="60"/>
+              <w:left w:type="dxa" w:w="100"/>
+              <w:bottom w:type="dxa" w:w="60"/>
+              <w:right w:type="dxa" w:w="100"/>
+            </w:tcMar>
+          </w:tcPr>
+          <w:p>
+            <w:r>
+              <w:rPr>
+                <w:rFonts w:ascii="Courier New" w:cs="Courier New" w:eastAsia="Courier New" w:hAnsi="Courier New"/>
+                <w:sz w:val="19"/>
+                <w:szCs w:val="19"/>
+              </w:rPr>
+              <w:t xml:space="preserve">-r directory</w:t>
+            </w:r>
+          </w:p>
+        </w:tc>
+        <w:tc>
+          <w:tcPr>
+            <w:tcW w:type="dxa" w:w="7238"/>
+            <w:tcMar>
+              <w:top w:type="dxa" w:w="60"/>
+              <w:left w:type="dxa" w:w="100"/>
+              <w:bottom w:type="dxa" w:w="60"/>
+              <w:right w:type="dxa" w:w="100"/>
+            </w:tcMar>
+          </w:tcPr>
+          <w:p>
+            <w:r>
+              <w:rPr>
+                <w:rFonts w:ascii="Times New Roman" w:cs="Times New Roman" w:eastAsia="Times New Roman" w:hAnsi="Times New Roman"/>
+                <w:sz w:val="19"/>
+                <w:szCs w:val="19"/>
+              </w:rPr>
+              <w:t xml:space="preserve">where that disk’s file system is mounted, when it is not the root</w:t>
+            </w:r>
+          </w:p>
+        </w:tc>
+      </w:tr>
+    </w:tbl>
+    <w:p>
+      <w:pPr>
+        <w:spacing w:after="200" w:before="80"/>
+      </w:pPr>
+      <w:r>
+        <w:rPr>
+          <w:rFonts w:ascii="Arial" w:cs="Arial" w:eastAsia="Arial" w:hAnsi="Arial"/>
+          <w:b/>
+          <w:bCs/>
+          <w:sz w:val="18"/>
+          <w:szCs w:val="18"/>
+        </w:rPr>
+        <w:t xml:space="preserve">Figure 11. </w:t>
+      </w:r>
+      <w:r>
+        <w:rPr>
+          <w:rFonts w:ascii="Arial" w:cs="Arial" w:eastAsia="Arial" w:hAnsi="Arial"/>
+          <w:sz w:val="18"/>
+          <w:szCs w:val="18"/>
+        </w:rPr>
+        <w:t xml:space="preserve">vmzipl options</w:t>
+      </w:r>
+    </w:p>
+    <w:p>
+      <w:pPr>
+        <w:spacing w:after="120"/>
+      </w:pPr>
+      <w:r>
+        <w:rPr>
+          <w:rFonts w:ascii="Times New Roman" w:cs="Times New Roman" w:eastAsia="Times New Roman" w:hAnsi="Times New Roman"/>
+        </w:rPr>
+        <w:t xml:space="preserve">It writes </w:t>
+      </w:r>
+      <w:r>
+        <w:rPr>
+          <w:rFonts w:ascii="Courier New" w:cs="Courier New" w:eastAsia="Courier New" w:hAnsi="Courier New"/>
+          <w:sz w:val="19"/>
+          <w:szCs w:val="19"/>
+        </w:rPr>
+        <w:t xml:space="preserve">/boot/vmipl.bin</w:t>
+      </w:r>
+      <w:r>
+        <w:rPr>
+          <w:rFonts w:ascii="Times New Roman" w:cs="Times New Roman" w:eastAsia="Times New Roman" w:hAnsi="Times New Roman"/>
+        </w:rPr>
+        <w:t xml:space="preserve"> (the kernel with the parameters) and </w:t>
+      </w:r>
+      <w:r>
+        <w:rPr>
+          <w:rFonts w:ascii="Courier New" w:cs="Courier New" w:eastAsia="Courier New" w:hAnsi="Courier New"/>
+          <w:sz w:val="19"/>
+          <w:szCs w:val="19"/>
+        </w:rPr>
+        <w:t xml:space="preserve">/boot/vmipl.ccw</w:t>
+      </w:r>
+      <w:r>
+        <w:rPr>
+          <w:rFonts w:ascii="Times New Roman" w:cs="Times New Roman" w:eastAsia="Times New Roman" w:hAnsi="Times New Roman"/>
+        </w:rPr>
+        <w:t xml:space="preserve"> (the channel program that reads it), then records 1 and 2 of track 0 (IPL1 and IPL2) of the disk.</w:t>
+      </w:r>
+    </w:p>
+    <w:p>
+      <w:pPr>
+        <w:pStyle w:val="Heading2"/>
+      </w:pPr>
+      <w:r>
+        <w:t xml:space="preserve">Starting Linux with the LINUX EXEC</w:t>
+      </w:r>
+    </w:p>
+    <w:p>
+      <w:pPr>
+        <w:spacing w:after="120"/>
+      </w:pPr>
+      <w:r>
+        <w:rPr>
+          <w:rFonts w:ascii="Times New Roman" w:cs="Times New Roman" w:eastAsia="Times New Roman" w:hAnsi="Times New Roman"/>
+        </w:rPr>
+        <w:t xml:space="preserve">The </w:t>
+      </w:r>
+      <w:r>
+        <w:rPr>
+          <w:rFonts w:ascii="Courier New" w:cs="Courier New" w:eastAsia="Courier New" w:hAnsi="Courier New"/>
+          <w:sz w:val="19"/>
+          <w:szCs w:val="19"/>
+        </w:rPr>
+        <w:t xml:space="preserve">LINUX EXEC</w:t>
+      </w:r>
+      <w:r>
+        <w:rPr>
+          <w:rFonts w:ascii="Times New Roman" w:cs="Times New Roman" w:eastAsia="Times New Roman" w:hAnsi="Times New Roman"/>
+        </w:rPr>
+        <w:t xml:space="preserve"> is on MAINT’s 19D disk, which every CMS user accesses as the U disk. </w:t>
+      </w:r>
+      <w:r>
+        <w:rPr>
+          <w:rFonts w:ascii="Courier New" w:cs="Courier New" w:eastAsia="Courier New" w:hAnsi="Courier New"/>
+          <w:sz w:val="19"/>
+          <w:szCs w:val="19"/>
+        </w:rPr>
+        <w:t xml:space="preserve">LINUX</w:t>
+      </w:r>
+      <w:r>
+        <w:rPr>
+          <w:rFonts w:ascii="Times New Roman" w:cs="Times New Roman" w:eastAsia="Times New Roman" w:hAnsi="Times New Roman"/>
+        </w:rPr>
+        <w:t xml:space="preserve"> alone issues </w:t>
+      </w:r>
+      <w:r>
+        <w:rPr>
+          <w:rFonts w:ascii="Courier New" w:cs="Courier New" w:eastAsia="Courier New" w:hAnsi="Courier New"/>
+          <w:sz w:val="19"/>
+          <w:szCs w:val="19"/>
+        </w:rPr>
+        <w:t xml:space="preserve">CP IPL LINUX</w:t>
+      </w:r>
+      <w:r>
+        <w:rPr>
+          <w:rFonts w:ascii="Times New Roman" w:cs="Times New Roman" w:eastAsia="Times New Roman" w:hAnsi="Times New Roman"/>
+        </w:rPr>
+        <w:t xml:space="preserve">. </w:t>
+      </w:r>
+      <w:r>
+        <w:rPr>
+          <w:rFonts w:ascii="Courier New" w:cs="Courier New" w:eastAsia="Courier New" w:hAnsi="Courier New"/>
+          <w:sz w:val="19"/>
+          <w:szCs w:val="19"/>
+        </w:rPr>
+        <w:t xml:space="preserve">LINUX READER</w:t>
+      </w:r>
+      <w:r>
+        <w:rPr>
+          <w:rFonts w:ascii="Times New Roman" w:cs="Times New Roman" w:eastAsia="Times New Roman" w:hAnsi="Times New Roman"/>
+        </w:rPr>
+        <w:t xml:space="preserve"> takes the older route: the kernel and the IPL parameter files on 19D go through your reader. From CMS, with 64 MB of storage and the devices attached:</w:t>
+      </w:r>
+    </w:p>
+    <w:tbl>
+      <w:tblPr>
+        <w:tblW w:type="dxa" w:w="9638"/>
+        <w:tblBorders>
+          <w:top w:val="single" w:color="auto" w:sz="4"/>
+          <w:left w:val="single" w:color="auto" w:sz="4"/>
+          <w:bottom w:val="single" w:color="auto" w:sz="4"/>
+          <w:right w:val="single" w:color="auto" w:sz="4"/>
+          <w:insideH w:val="single" w:color="auto" w:sz="4"/>
+          <w:insideV w:val="single" w:color="auto" w:sz="4"/>
+        </w:tblBorders>
+      </w:tblPr>
+      <w:tblGrid>
+        <w:gridCol w:w="9638"/>
+      </w:tblGrid>
+      <w:tr>
+        <w:trPr>
+          <w:cantSplit/>
+        </w:trPr>
+        <w:tc>
+          <w:tcPr>
+            <w:tcW w:type="dxa" w:w="9638"/>
+            <w:shd w:fill="F2F2F2" w:color="auto" w:val="clear"/>
+            <w:tcMar>
+              <w:top w:type="dxa" w:w="100"/>
+              <w:left w:type="dxa" w:w="140"/>
+              <w:bottom w:type="dxa" w:w="100"/>
+              <w:right w:type="dxa" w:w="140"/>
+            </w:tcMar>
+          </w:tcPr>
+          <w:p>
+            <w:pPr>
+              <w:spacing w:after="0" w:line="228"/>
+            </w:pPr>
+            <w:r>
+              <w:rPr>
+                <w:rFonts w:ascii="Courier New" w:cs="Courier New" w:eastAsia="Courier New" w:hAnsi="Courier New"/>
+                <w:sz w:val="17"/>
+                <w:szCs w:val="17"/>
+              </w:rPr>
+              <w:t xml:space="preserve">logon cmsuser</w:t>
+            </w:r>
+          </w:p>
+          <w:p>
+            <w:pPr>
+              <w:spacing w:after="0" w:line="228"/>
+            </w:pPr>
+            <w:r>
+              <w:rPr>
+                <w:rFonts w:ascii="Courier New" w:cs="Courier New" w:eastAsia="Courier New" w:hAnsi="Courier New"/>
+                <w:sz w:val="17"/>
+                <w:szCs w:val="17"/>
+              </w:rPr>
+              <w:t xml:space="preserve">cp define storage 64m</w:t>
+            </w:r>
+          </w:p>
+          <w:p>
+            <w:pPr>
+              <w:spacing w:after="0" w:line="228"/>
+            </w:pPr>
+            <w:r>
+              <w:rPr>
+                <w:rFonts w:ascii="Courier New" w:cs="Courier New" w:eastAsia="Courier New" w:hAnsi="Courier New"/>
+                <w:sz w:val="17"/>
+                <w:szCs w:val="17"/>
+              </w:rPr>
+              <w:t xml:space="preserve">ipl cms</w:t>
+            </w:r>
+          </w:p>
+          <w:p>
+            <w:pPr>
+              <w:spacing w:after="0" w:line="228"/>
+            </w:pPr>
+            <w:r>
+              <w:rPr>
+                <w:rFonts w:ascii="Courier New" w:cs="Courier New" w:eastAsia="Courier New" w:hAnsi="Courier New"/>
+                <w:sz w:val="17"/>
+                <w:szCs w:val="17"/>
+              </w:rPr>
+              <w:t xml:space="preserve">Ready;</w:t>
+            </w:r>
+          </w:p>
+          <w:p>
+            <w:pPr>
+              <w:spacing w:after="0" w:line="228"/>
+            </w:pPr>
+            <w:r>
+              <w:rPr>
+                <w:rFonts w:ascii="Courier New" w:cs="Courier New" w:eastAsia="Courier New" w:hAnsi="Courier New"/>
+                <w:sz w:val="17"/>
+                <w:szCs w:val="17"/>
+              </w:rPr>
+              <w:t xml:space="preserve">linux reader</w:t>
+            </w:r>
+          </w:p>
+          <w:p>
+            <w:pPr>
+              <w:spacing w:after="0" w:line="228"/>
+            </w:pPr>
+            <w:r>
+              <w:rPr>
+                <w:rFonts w:ascii="Courier New" w:cs="Courier New" w:eastAsia="Courier New" w:hAnsi="Courier New"/>
+                <w:sz w:val="17"/>
+                <w:szCs w:val="17"/>
+              </w:rPr>
+              <w:t xml:space="preserve">LINUX: punching the kernel and CMSUSER LXPARM to your reader ...</w:t>
+            </w:r>
+          </w:p>
+          <w:p>
+            <w:pPr>
+              <w:spacing w:after="0" w:line="228"/>
+            </w:pPr>
+            <w:r>
+              <w:rPr>
+                <w:rFonts w:ascii="Courier New" w:cs="Courier New" w:eastAsia="Courier New" w:hAnsi="Courier New"/>
+                <w:sz w:val="17"/>
+                <w:szCs w:val="17"/>
+              </w:rPr>
+              <w:t xml:space="preserve">PUN FILE 0002  TO  CMSUSER  COPY 01 NOHOLD</w:t>
+            </w:r>
+          </w:p>
+          <w:p>
+            <w:pPr>
+              <w:spacing w:after="0" w:line="228"/>
+            </w:pPr>
+            <w:r>
+              <w:rPr>
+                <w:rFonts w:ascii="Courier New" w:cs="Courier New" w:eastAsia="Courier New" w:hAnsi="Courier New"/>
+                <w:sz w:val="17"/>
+                <w:szCs w:val="17"/>
+              </w:rPr>
+              <w:t xml:space="preserve">PUN FILE 0003  TO  CMSUSER  COPY 01 NOHOLD</w:t>
+            </w:r>
+          </w:p>
+          <w:p>
+            <w:pPr>
+              <w:spacing w:after="0" w:line="228"/>
+            </w:pPr>
+            <w:r>
+              <w:rPr>
+                <w:rFonts w:ascii="Courier New" w:cs="Courier New" w:eastAsia="Courier New" w:hAnsi="Courier New"/>
+                <w:sz w:val="17"/>
+                <w:szCs w:val="17"/>
+              </w:rPr>
+              <w:t xml:space="preserve">LINUX: IPL 00C as an ESA/390 machine</w:t>
+            </w:r>
+          </w:p>
+          <w:p>
+            <w:pPr>
+              <w:spacing w:after="0" w:line="228"/>
+            </w:pPr>
+            <w:r>
+              <w:rPr>
+                <w:rFonts w:ascii="Courier New" w:cs="Courier New" w:eastAsia="Courier New" w:hAnsi="Courier New"/>
+                <w:sz w:val="17"/>
+                <w:szCs w:val="17"/>
+              </w:rPr>
+              <w:t xml:space="preserve">Linux version 4.0.0+ ...</w:t>
+            </w:r>
+          </w:p>
+          <w:p>
+            <w:pPr>
+              <w:spacing w:after="0" w:line="228"/>
+            </w:pPr>
+            <w:r>
+              <w:rPr>
+                <w:rFonts w:ascii="Courier New" w:cs="Courier New" w:eastAsia="Courier New" w:hAnsi="Courier New"/>
+                <w:sz w:val="17"/>
+                <w:szCs w:val="17"/>
+              </w:rPr>
+              <w:t xml:space="preserve">...</w:t>
+            </w:r>
+          </w:p>
+          <w:p>
+            <w:pPr>
+              <w:spacing w:after="0" w:line="228"/>
+            </w:pPr>
+            <w:r>
+              <w:rPr>
+                <w:rFonts w:ascii="Courier New" w:cs="Courier New" w:eastAsia="Courier New" w:hAnsi="Courier New"/>
+                <w:sz w:val="17"/>
+                <w:szCs w:val="17"/>
+              </w:rPr>
+              <w:t xml:space="preserve">root: the system on /dev/dasda1 -- switch_root</w:t>
+            </w:r>
+          </w:p>
+          <w:p>
+            <w:pPr>
+              <w:spacing w:after="0" w:line="228"/>
+            </w:pPr>
+            <w:r>
+              <w:rPr>
+                <w:rFonts w:ascii="Courier New" w:cs="Courier New" w:eastAsia="Courier New" w:hAnsi="Courier New"/>
+                <w:sz w:val="17"/>
+                <w:szCs w:val="17"/>
+              </w:rPr>
+              <w:t xml:space="preserve">INIT: version 2.88 booting</w:t>
+            </w:r>
+          </w:p>
+          <w:p>
+            <w:pPr>
+              <w:spacing w:after="0" w:line="228"/>
+            </w:pPr>
+            <w:r>
+              <w:rPr>
+                <w:rFonts w:ascii="Courier New" w:cs="Courier New" w:eastAsia="Courier New" w:hAnsi="Courier New"/>
+                <w:sz w:val="17"/>
+                <w:szCs w:val="17"/>
+              </w:rPr>
+              <w:t xml:space="preserve">...</w:t>
+            </w:r>
+          </w:p>
+          <w:p>
+            <w:pPr>
+              <w:spacing w:after="0" w:line="228"/>
+            </w:pPr>
+            <w:r>
+              <w:rPr>
+                <w:rFonts w:ascii="Courier New" w:cs="Courier New" w:eastAsia="Courier New" w:hAnsi="Courier New"/>
+                <w:sz w:val="17"/>
+                <w:szCs w:val="17"/>
+              </w:rPr>
+              <w:t xml:space="preserve">Debian GNU/Linux 7 vm370plus ttyS0</w:t>
+            </w:r>
+          </w:p>
+          <w:p>
+            <w:pPr>
+              <w:spacing w:after="0" w:line="228"/>
+            </w:pPr>
+            <w:r>
+              <w:rPr>
+                <w:rFonts w:ascii="Courier New" w:cs="Courier New" w:eastAsia="Courier New" w:hAnsi="Courier New"/>
+                <w:sz w:val="17"/>
+                <w:szCs w:val="17"/>
+              </w:rPr>
+              <w:t xml:space="preserve">vm370plus login:</w:t>
+            </w:r>
+          </w:p>
+        </w:tc>
+      </w:tr>
+    </w:tbl>
+    <w:p>
+      <w:pPr>
+        <w:spacing w:after="200" w:before="80"/>
+      </w:pPr>
+      <w:r>
+        <w:rPr>
+          <w:rFonts w:ascii="Arial" w:cs="Arial" w:eastAsia="Arial" w:hAnsi="Arial"/>
+          <w:b/>
+          <w:bCs/>
+          <w:sz w:val="18"/>
+          <w:szCs w:val="18"/>
+        </w:rPr>
+        <w:t xml:space="preserve">Figure 12. </w:t>
       </w:r>
       <w:r>
         <w:rPr>
@@ -7398,7 +8418,7 @@
           <w:sz w:val="18"/>
           <w:szCs w:val="18"/>
         </w:rPr>
-        <w:t xml:space="preserve">Figure 10. </w:t>
+        <w:t xml:space="preserve">Figure 13. </w:t>
       </w:r>
       <w:r>
         <w:rPr>
@@ -7552,7 +8572,7 @@
           <w:sz w:val="18"/>
           <w:szCs w:val="18"/>
         </w:rPr>
-        <w:t xml:space="preserve">Figure 11. </w:t>
+        <w:t xml:space="preserve">Figure 14. </w:t>
       </w:r>
       <w:r>
         <w:rPr>
@@ -7660,7 +8680,7 @@
           <w:sz w:val="18"/>
           <w:szCs w:val="18"/>
         </w:rPr>
-        <w:t xml:space="preserve">Figure 12. </w:t>
+        <w:t xml:space="preserve">Figure 15. </w:t>
       </w:r>
       <w:r>
         <w:rPr>
@@ -8112,7 +9132,7 @@
           <w:sz w:val="18"/>
           <w:szCs w:val="18"/>
         </w:rPr>
-        <w:t xml:space="preserve">Figure 13. </w:t>
+        <w:t xml:space="preserve">Figure 16. </w:t>
       </w:r>
       <w:r>
         <w:rPr>
@@ -8120,7 +9140,7 @@
           <w:sz w:val="18"/>
           <w:szCs w:val="18"/>
         </w:rPr>
-        <w:t xml:space="preserve">Debian on VM/370+</w:t>
+        <w:t xml:space="preserve">Debian on VM/370plus</w:t>
       </w:r>
     </w:p>
     <w:p>
@@ -8472,7 +9492,7 @@
           <w:sz w:val="18"/>
           <w:szCs w:val="18"/>
         </w:rPr>
-        <w:t xml:space="preserve">Figure 14. </w:t>
+        <w:t xml:space="preserve">Figure 17. </w:t>
       </w:r>
       <w:r>
         <w:rPr>
@@ -8626,7 +9646,7 @@
         <w:pageBreakBefore/>
       </w:pPr>
       <w:r>
-        <w:t xml:space="preserve">Chapter 6. cREXX on VM/370+</w:t>
+        <w:t xml:space="preserve">Chapter 6. cREXX on VM/370plus</w:t>
       </w:r>
     </w:p>
     <w:p>
@@ -8637,7 +9657,7 @@
         <w:rPr>
           <w:rFonts w:ascii="Times New Roman" w:cs="Times New Roman" w:eastAsia="Times New Roman" w:hAnsi="Times New Roman"/>
         </w:rPr>
-        <w:t xml:space="preserve">cREXX is a REXX implementation built as a compiler (RXC), an assembler (RXAS), a disassembler (RXDAS) and a virtual machine (RXBVM, RXVM). It needs more than 16 MB to compile larger programs, which is where VM/370+ came from.</w:t>
+        <w:t xml:space="preserve">cREXX is a REXX implementation built as a compiler (RXC), an assembler (RXAS), a disassembler (RXDAS) and a virtual machine (RXBVM, RXVM). It needs more than 16 MB to compile larger programs, which is where VM/370plus came from.</w:t>
       </w:r>
     </w:p>
     <w:p>
@@ -8645,7 +9665,7 @@
         <w:pStyle w:val="Heading2"/>
       </w:pPr>
       <w:r>
-        <w:t xml:space="preserve">The 2022 release, built on VM/370+</w:t>
+        <w:t xml:space="preserve">The 2022 release, built on VM/370plus</w:t>
       </w:r>
     </w:p>
     <w:p>
@@ -8847,7 +9867,7 @@
           <w:sz w:val="18"/>
           <w:szCs w:val="18"/>
         </w:rPr>
-        <w:t xml:space="preserve">Figure 15. </w:t>
+        <w:t xml:space="preserve">Figure 18. </w:t>
       </w:r>
       <w:r>
         <w:rPr>
@@ -8855,7 +9875,7 @@
           <w:sz w:val="18"/>
           <w:szCs w:val="18"/>
         </w:rPr>
-        <w:t xml:space="preserve">Building and running cREXX on VM/370+</w:t>
+        <w:t xml:space="preserve">Building and running cREXX on VM/370plus</w:t>
       </w:r>
     </w:p>
     <w:p>
@@ -9257,7 +10277,7 @@
           <w:sz w:val="18"/>
           <w:szCs w:val="18"/>
         </w:rPr>
-        <w:t xml:space="preserve">Figure 16. </w:t>
+        <w:t xml:space="preserve">Figure 19. </w:t>
       </w:r>
       <w:r>
         <w:rPr>
@@ -9284,7 +10304,7 @@
         <w:rPr>
           <w:rFonts w:ascii="Times New Roman" w:cs="Times New Roman" w:eastAsia="Times New Roman" w:hAnsi="Times New Roman"/>
         </w:rPr>
-        <w:t xml:space="preserve">The current release (1.0.0-beta.3) needs a C99 compiler; GCC380 is GCC 3.2.3. It runs on VM/370+ cross-compiled with GCC 13 (</w:t>
+        <w:t xml:space="preserve">The current release (1.0.0-beta.3) needs a C99 compiler; GCC380 is GCC 3.2.3. It runs on VM/370plus cross-compiled with GCC 13 (</w:t>
       </w:r>
       <w:r>
         <w:rPr>
@@ -9478,7 +10498,7 @@
                 <w:sz w:val="17"/>
                 <w:szCs w:val="17"/>
               </w:rPr>
-              <w:t xml:space="preserve">Hello from current cREXX on VM/370+</w:t>
+              <w:t xml:space="preserve">Hello from current cREXX on VM/370plus</w:t>
             </w:r>
           </w:p>
           <w:p>
@@ -9522,7 +10542,7 @@
           <w:sz w:val="18"/>
           <w:szCs w:val="18"/>
         </w:rPr>
-        <w:t xml:space="preserve">Figure 17. </w:t>
+        <w:t xml:space="preserve">Figure 20. </w:t>
       </w:r>
       <w:r>
         <w:rPr>
@@ -10596,7 +11616,7 @@
           <w:sz w:val="18"/>
           <w:szCs w:val="18"/>
         </w:rPr>
-        <w:t xml:space="preserve">Figure 18. </w:t>
+        <w:t xml:space="preserve">Figure 21. </w:t>
       </w:r>
       <w:r>
         <w:rPr>
@@ -10710,7 +11730,7 @@
         <w:rPr>
           <w:rFonts w:ascii="Times New Roman" w:cs="Times New Roman" w:eastAsia="Times New Roman" w:hAnsi="Times New Roman"/>
         </w:rPr>
-        <w:t xml:space="preserve">. Their storage comes from above 16 MB through HIGHSTOR; Smalltalk alone uses about 100 MB, so it is practical only when Hercules gives VM/370+ real storage to match (the kit’s </w:t>
+        <w:t xml:space="preserve">. Their storage comes from above 16 MB through HIGHSTOR; Smalltalk alone uses about 100 MB, so it is practical only when Hercules gives VM/370plus real storage to match (the kit’s </w:t>
       </w:r>
       <w:r>
         <w:rPr>
@@ -11226,7 +12246,7 @@
           <w:sz w:val="18"/>
           <w:szCs w:val="18"/>
         </w:rPr>
-        <w:t xml:space="preserve">Figure 19. </w:t>
+        <w:t xml:space="preserve">Figure 22. </w:t>
       </w:r>
       <w:r>
         <w:rPr>
@@ -11367,7 +12387,7 @@
         <w:rPr>
           <w:rFonts w:ascii="Times New Roman" w:cs="Times New Roman" w:eastAsia="Times New Roman" w:hAnsi="Times New Roman"/>
         </w:rPr>
-        <w:t xml:space="preserve"> only compiles): a small driver of VM/370+ for </w:t>
+        <w:t xml:space="preserve"> only compiles): a small driver of VM/370plus for </w:t>
       </w:r>
       <w:r>
         <w:rPr>
@@ -11666,7 +12686,7 @@
                 <w:sz w:val="17"/>
                 <w:szCs w:val="17"/>
               </w:rPr>
-              <w:t xml:space="preserve">  T U R B O   C R E X X   ---   VM/370+ CMS</w:t>
+              <w:t xml:space="preserve">  T U R B O   C R E X X   ---   VM/370plus CMS</w:t>
             </w:r>
           </w:p>
           <w:p>
@@ -11736,7 +12756,7 @@
           <w:sz w:val="18"/>
           <w:szCs w:val="18"/>
         </w:rPr>
-        <w:t xml:space="preserve">Figure 20. </w:t>
+        <w:t xml:space="preserve">Figure 23. </w:t>
       </w:r>
       <w:r>
         <w:rPr>
@@ -12399,7 +13419,7 @@
           <w:sz w:val="18"/>
           <w:szCs w:val="18"/>
         </w:rPr>
-        <w:t xml:space="preserve">Figure 21. </w:t>
+        <w:t xml:space="preserve">Figure 24. </w:t>
       </w:r>
       <w:r>
         <w:rPr>
@@ -12498,7 +13518,7 @@
           <w:sz w:val="18"/>
           <w:szCs w:val="18"/>
         </w:rPr>
-        <w:t xml:space="preserve">Figure 22. </w:t>
+        <w:t xml:space="preserve">Figure 25. </w:t>
       </w:r>
       <w:r>
         <w:rPr>
@@ -12578,7 +13598,21 @@
         <w:rPr>
           <w:rFonts w:ascii="Times New Roman" w:cs="Times New Roman" w:eastAsia="Times New Roman" w:hAnsi="Times New Roman"/>
         </w:rPr>
-        <w:t xml:space="preserve">As in VM/370, with two changes: an IPL by name always gives a System/370 machine; an IPL of a device by a user who runs a shared named system is done with CLEAR.</w:t>
+        <w:t xml:space="preserve">As in VM/370, with three changes: </w:t>
+      </w:r>
+      <w:r>
+        <w:rPr>
+          <w:rFonts w:ascii="Courier New" w:cs="Courier New" w:eastAsia="Courier New" w:hAnsi="Courier New"/>
+          <w:sz w:val="19"/>
+          <w:szCs w:val="19"/>
+        </w:rPr>
+        <w:t xml:space="preserve">IPL LINUX</w:t>
+      </w:r>
+      <w:r>
+        <w:rPr>
+          <w:rFonts w:ascii="Times New Roman" w:cs="Times New Roman" w:eastAsia="Times New Roman" w:hAnsi="Times New Roman"/>
+        </w:rPr>
+        <w:t xml:space="preserve"> IPLs the disk at 250 as an ESA/390 machine; any other IPL by name gives a System/370 machine; an IPL of a device by a user who runs a shared named system is done with CLEAR.</w:t>
       </w:r>
     </w:p>
     <w:p>
@@ -12629,7 +13663,7 @@
                 <w:sz w:val="17"/>
                 <w:szCs w:val="17"/>
               </w:rPr>
-              <w:t xml:space="preserve">LINUX</w:t>
+              <w:t xml:space="preserve">LINUX [DISK|READER]</w:t>
             </w:r>
           </w:p>
         </w:tc>
@@ -12647,7 +13681,7 @@
           <w:sz w:val="18"/>
           <w:szCs w:val="18"/>
         </w:rPr>
-        <w:t xml:space="preserve">Figure 23. </w:t>
+        <w:t xml:space="preserve">Figure 26. </w:t>
       </w:r>
       <w:r>
         <w:rPr>
@@ -12666,7 +13700,49 @@
         <w:rPr>
           <w:rFonts w:ascii="Times New Roman" w:cs="Times New Roman" w:eastAsia="Times New Roman" w:hAnsi="Times New Roman"/>
         </w:rPr>
-        <w:t xml:space="preserve">On MAINT 19D. Punches </w:t>
+        <w:t xml:space="preserve">On MAINT 19D. </w:t>
+      </w:r>
+      <w:r>
+        <w:rPr>
+          <w:rFonts w:ascii="Times New Roman" w:cs="Times New Roman" w:eastAsia="Times New Roman" w:hAnsi="Times New Roman"/>
+          <w:b/>
+          <w:bCs/>
+        </w:rPr>
+        <w:t xml:space="preserve">DISK</w:t>
+      </w:r>
+      <w:r>
+        <w:rPr>
+          <w:rFonts w:ascii="Times New Roman" w:cs="Times New Roman" w:eastAsia="Times New Roman" w:hAnsi="Times New Roman"/>
+        </w:rPr>
+        <w:t xml:space="preserve"> (the default) issues </w:t>
+      </w:r>
+      <w:r>
+        <w:rPr>
+          <w:rFonts w:ascii="Courier New" w:cs="Courier New" w:eastAsia="Courier New" w:hAnsi="Courier New"/>
+          <w:sz w:val="19"/>
+          <w:szCs w:val="19"/>
+        </w:rPr>
+        <w:t xml:space="preserve">CP IPL LINUX</w:t>
+      </w:r>
+      <w:r>
+        <w:rPr>
+          <w:rFonts w:ascii="Times New Roman" w:cs="Times New Roman" w:eastAsia="Times New Roman" w:hAnsi="Times New Roman"/>
+        </w:rPr>
+        <w:t xml:space="preserve">. </w:t>
+      </w:r>
+      <w:r>
+        <w:rPr>
+          <w:rFonts w:ascii="Times New Roman" w:cs="Times New Roman" w:eastAsia="Times New Roman" w:hAnsi="Times New Roman"/>
+          <w:b/>
+          <w:bCs/>
+        </w:rPr>
+        <w:t xml:space="preserve">READER</w:t>
+      </w:r>
+      <w:r>
+        <w:rPr>
+          <w:rFonts w:ascii="Times New Roman" w:cs="Times New Roman" w:eastAsia="Times New Roman" w:hAnsi="Times New Roman"/>
+        </w:rPr>
+        <w:t xml:space="preserve"> punches </w:t>
       </w:r>
       <w:r>
         <w:rPr>
@@ -12895,7 +13971,7 @@
                 <w:sz w:val="19"/>
                 <w:szCs w:val="19"/>
               </w:rPr>
-              <w:t xml:space="preserve">the VM/370+ system: CP nucleus, CMS, directory, user disks</w:t>
+              <w:t xml:space="preserve">the VM/370plus system: CP nucleus, CMS, directory, user disks</w:t>
             </w:r>
           </w:p>
         </w:tc>
@@ -13217,7 +14293,7 @@
           <w:sz w:val="18"/>
           <w:szCs w:val="18"/>
         </w:rPr>
-        <w:t xml:space="preserve">Figure 24. </w:t>
+        <w:t xml:space="preserve">Figure 27. </w:t>
       </w:r>
       <w:r>
         <w:rPr>
@@ -13478,7 +14554,7 @@
         <w:sz w:val="16"/>
         <w:szCs w:val="16"/>
       </w:rPr>
-      <w:t xml:space="preserve">VM/370+ Introduction, Installation and User’s Guide</w:t>
+      <w:t xml:space="preserve">VM/370plus Introduction, Installation and User’s Guide</w:t>
     </w:r>
   </w:p>
 </w:hdr>

</xml_diff>

<commit_message>
Kit build 6: 12 parts under 30 MB, Debian 3390-9 with join scripts, CHATBOT; verified on a fresh CE (kt15)
Co-Authored-By: Claude Opus 5.5 <noreply@anthropic.com>
Claude-Session: https://claude.ai/code/session_01JBNU8KnKzXkgscse8vw6so
</commit_message>
<xml_diff>
--- a/arch/31bit/manual/VM370PLUS-Guide.docx
+++ b/arch/31bit/manual/VM370PLUS-Guide.docx
@@ -5356,7 +5356,7 @@
         <w:rPr>
           <w:rFonts w:ascii="Times New Roman" w:cs="Times New Roman" w:eastAsia="Times New Roman" w:hAnsi="Times New Roman"/>
         </w:rPr>
-        <w:t xml:space="preserve">The VM/370plus kit: seven zip files, each under 30 MB.</w:t>
+        <w:t xml:space="preserve">The VM/370plus kit: twelve zip files, each under 30 MB.</w:t>
       </w:r>
     </w:p>
     <w:tbl>
@@ -5667,7 +5667,7 @@
                 <w:sz w:val="19"/>
                 <w:szCs w:val="19"/>
               </w:rPr>
-              <w:t xml:space="preserve">5–7</w:t>
+              <w:t xml:space="preserve">5</w:t>
             </w:r>
           </w:p>
         </w:tc>
@@ -5688,6 +5688,54 @@
                 <w:sz w:val="19"/>
                 <w:szCs w:val="19"/>
               </w:rPr>
+              <w:t xml:space="preserve">the shadow file of VM50-3 (spool and paging)</w:t>
+            </w:r>
+          </w:p>
+        </w:tc>
+      </w:tr>
+      <w:tr>
+        <w:trPr>
+          <w:cantSplit/>
+          <w:tblHeader w:val="false"/>
+        </w:trPr>
+        <w:tc>
+          <w:tcPr>
+            <w:tcW w:type="dxa" w:w="1000"/>
+            <w:tcMar>
+              <w:top w:type="dxa" w:w="60"/>
+              <w:left w:type="dxa" w:w="100"/>
+              <w:bottom w:type="dxa" w:w="60"/>
+              <w:right w:type="dxa" w:w="100"/>
+            </w:tcMar>
+          </w:tcPr>
+          <w:p>
+            <w:r>
+              <w:rPr>
+                <w:rFonts w:ascii="Times New Roman" w:cs="Times New Roman" w:eastAsia="Times New Roman" w:hAnsi="Times New Roman"/>
+                <w:sz w:val="19"/>
+                <w:szCs w:val="19"/>
+              </w:rPr>
+              <w:t xml:space="preserve">6–12</w:t>
+            </w:r>
+          </w:p>
+        </w:tc>
+        <w:tc>
+          <w:tcPr>
+            <w:tcW w:type="dxa" w:w="8638"/>
+            <w:tcMar>
+              <w:top w:type="dxa" w:w="60"/>
+              <w:left w:type="dxa" w:w="100"/>
+              <w:bottom w:type="dxa" w:w="60"/>
+              <w:right w:type="dxa" w:w="100"/>
+            </w:tcMar>
+          </w:tcPr>
+          <w:p>
+            <w:r>
+              <w:rPr>
+                <w:rFonts w:ascii="Times New Roman" w:cs="Times New Roman" w:eastAsia="Times New Roman" w:hAnsi="Times New Roman"/>
+                <w:sz w:val="19"/>
+                <w:szCs w:val="19"/>
+              </w:rPr>
               <w:t xml:space="preserve">the Debian disk, </w:t>
             </w:r>
             <w:r>
@@ -5704,7 +5752,39 @@
                 <w:sz w:val="19"/>
                 <w:szCs w:val="19"/>
               </w:rPr>
-              <w:t xml:space="preserve">, in three pieces</w:t>
+              <w:t xml:space="preserve"> (a 3390-9), in seven pieces, with </w:t>
+            </w:r>
+            <w:r>
+              <w:rPr>
+                <w:rFonts w:ascii="Courier New" w:cs="Courier New" w:eastAsia="Courier New" w:hAnsi="Courier New"/>
+                <w:sz w:val="19"/>
+                <w:szCs w:val="19"/>
+              </w:rPr>
+              <w:t xml:space="preserve">JOINDEB.CMD</w:t>
+            </w:r>
+            <w:r>
+              <w:rPr>
+                <w:rFonts w:ascii="Times New Roman" w:cs="Times New Roman" w:eastAsia="Times New Roman" w:hAnsi="Times New Roman"/>
+                <w:sz w:val="19"/>
+                <w:szCs w:val="19"/>
+              </w:rPr>
+              <w:t xml:space="preserve"> and </w:t>
+            </w:r>
+            <w:r>
+              <w:rPr>
+                <w:rFonts w:ascii="Courier New" w:cs="Courier New" w:eastAsia="Courier New" w:hAnsi="Courier New"/>
+                <w:sz w:val="19"/>
+                <w:szCs w:val="19"/>
+              </w:rPr>
+              <w:t xml:space="preserve">joindeb.sh</w:t>
+            </w:r>
+            <w:r>
+              <w:rPr>
+                <w:rFonts w:ascii="Times New Roman" w:cs="Times New Roman" w:eastAsia="Times New Roman" w:hAnsi="Times New Roman"/>
+                <w:sz w:val="19"/>
+                <w:szCs w:val="19"/>
+              </w:rPr>
+              <w:t xml:space="preserve"> to join them</w:t>
             </w:r>
           </w:p>
         </w:tc>
@@ -5784,7 +5864,7 @@
         <w:rPr>
           <w:rFonts w:ascii="Times New Roman" w:cs="Times New Roman" w:eastAsia="Times New Roman" w:hAnsi="Times New Roman"/>
         </w:rPr>
-        <w:t xml:space="preserve">Unzip kit parts 1 to 7 over it, replacing files when asked.</w:t>
+        <w:t xml:space="preserve">Unzip kit parts 1 to 12 over it, replacing files when asked.</w:t>
       </w:r>
     </w:p>
     <w:p>
@@ -5843,7 +5923,7 @@
                 <w:sz w:val="17"/>
                 <w:szCs w:val="17"/>
               </w:rPr>
-              <w:t xml:space="preserve">copy /b disks\lnx190.cckd.001+disks\lnx190.cckd.002+disks\lnx190.cckd.003 disks\lnx190.cckd</w:t>
+              <w:t xml:space="preserve">JOINDEB.CMD</w:t>
             </w:r>
           </w:p>
           <w:p>
@@ -5856,7 +5936,7 @@
                 <w:sz w:val="17"/>
                 <w:szCs w:val="17"/>
               </w:rPr>
-              <w:t xml:space="preserve">del disks\lnx190.cckd.00?</w:t>
+              <w:t xml:space="preserve">Debian disk joined: disks\lnx190.cckd</w:t>
             </w:r>
           </w:p>
         </w:tc>
@@ -5901,13 +5981,13 @@
           <w:sz w:val="19"/>
           <w:szCs w:val="19"/>
         </w:rPr>
-        <w:t xml:space="preserve">cat disks/lnx190.cckd.00? &gt; disks/lnx190.cckd</w:t>
-      </w:r>
-      <w:r>
-        <w:rPr>
-          <w:rFonts w:ascii="Times New Roman" w:cs="Times New Roman" w:eastAsia="Times New Roman" w:hAnsi="Times New Roman"/>
-        </w:rPr>
-        <w:t xml:space="preserve">. The file </w:t>
+        <w:t xml:space="preserve">sh joindeb.sh</w:t>
+      </w:r>
+      <w:r>
+        <w:rPr>
+          <w:rFonts w:ascii="Times New Roman" w:cs="Times New Roman" w:eastAsia="Times New Roman" w:hAnsi="Times New Roman"/>
+        </w:rPr>
+        <w:t xml:space="preserve">, which also checks the result. The file </w:t>
       </w:r>
       <w:r>
         <w:rPr>
@@ -16780,7 +16860,7 @@
                 <w:sz w:val="19"/>
                 <w:szCs w:val="19"/>
               </w:rPr>
-              <w:t xml:space="preserve">ESA/390 configuration, MAINSIZE 64, the CTC and 3390 lines for Linux</w:t>
+              <w:t xml:space="preserve">ESA/390 configuration, MAINSIZE 256, the CTC and 3390 lines for Linux</w:t>
             </w:r>
           </w:p>
         </w:tc>
@@ -16924,7 +17004,7 @@
                 <w:sz w:val="19"/>
                 <w:szCs w:val="19"/>
               </w:rPr>
-              <w:t xml:space="preserve">the Debian disk, a 3390-9 (after joining parts 5–7)</w:t>
+              <w:t xml:space="preserve">the Debian disk, a 3390-9 (after joining parts 6–12)</w:t>
             </w:r>
           </w:p>
         </w:tc>

</xml_diff>

<commit_message>
WAKEUP for CMS: wait for a reader file (RDR) or an interval; CHATBOT answers in 1-2 s
VM/370 CMS had no WAKEUP. New module (MAINT 19D): CMS OS simulation --
STIMER REAL with an exit and WAIT on one ECB, a HNDINT ASAP routine on
00C posts it when CP's SETPEND device end arrives. RC 2 time, 3 reader.
CHAT and CHATBOT EXECs use it again (cbpatch keeps the CP SLEEP fallback).

Co-Authored-By: Claude Opus 5.5 <noreply@anthropic.com>
Claude-Session: https://claude.ai/code/session_01JBNU8KnKzXkgscse8vw6so
</commit_message>
<xml_diff>
--- a/arch/31bit/manual/VM370PLUS-Guide.docx
+++ b/arch/31bit/manual/VM370PLUS-Guide.docx
@@ -1513,7 +1513,7 @@
           <w:sz w:val="20"/>
           <w:szCs w:val="20"/>
         </w:rPr>
-        <w:t xml:space="preserve">LINUX EXEC</w:t>
+        <w:t xml:space="preserve">WAKEUP</w:t>
       </w:r>
       <w:r>
         <w:rPr>
@@ -1524,6 +1524,35 @@
           <w:szCs w:val="20"/>
         </w:rPr>
         <w:t xml:space="preserve">	20</w:t>
+      </w:r>
+    </w:p>
+    <w:p>
+      <w:pPr>
+        <w:tabs>
+          <w:tab w:val="right" w:pos="9638" w:leader="dot"/>
+        </w:tabs>
+        <w:spacing w:after="20" w:before="20"/>
+        <w:ind w:left="400"/>
+      </w:pPr>
+      <w:r>
+        <w:rPr>
+          <w:rFonts w:ascii="Times New Roman" w:cs="Times New Roman" w:eastAsia="Times New Roman" w:hAnsi="Times New Roman"/>
+          <w:b w:val="false"/>
+          <w:bCs w:val="false"/>
+          <w:sz w:val="20"/>
+          <w:szCs w:val="20"/>
+        </w:rPr>
+        <w:t xml:space="preserve">LINUX EXEC</w:t>
+      </w:r>
+      <w:r>
+        <w:rPr>
+          <w:rFonts w:ascii="Times New Roman" w:cs="Times New Roman" w:eastAsia="Times New Roman" w:hAnsi="Times New Roman"/>
+          <w:b w:val="false"/>
+          <w:bCs w:val="false"/>
+          <w:sz w:val="20"/>
+          <w:szCs w:val="20"/>
+        </w:rPr>
+        <w:t xml:space="preserve">	21</w:t>
       </w:r>
     </w:p>
     <w:p>
@@ -1552,7 +1581,7 @@
           <w:sz w:val="21"/>
           <w:szCs w:val="21"/>
         </w:rPr>
-        <w:t xml:space="preserve">	21</w:t>
+        <w:t xml:space="preserve">	22</w:t>
       </w:r>
     </w:p>
     <w:p>
@@ -1581,7 +1610,7 @@
           <w:sz w:val="21"/>
           <w:szCs w:val="21"/>
         </w:rPr>
-        <w:t xml:space="preserve">	22</w:t>
+        <w:t xml:space="preserve">	23</w:t>
       </w:r>
     </w:p>
     <w:p>
@@ -10705,7 +10734,21 @@
         <w:rPr>
           <w:rFonts w:ascii="Times New Roman" w:cs="Times New Roman" w:eastAsia="Times New Roman" w:hAnsi="Times New Roman"/>
         </w:rPr>
-        <w:t xml:space="preserve">An answer takes up to half a minute: CHATBOT looks at its reader every 30 seconds (INTERVAL in CHATBOT CONFIG). </w:t>
+        <w:t xml:space="preserve">An answer takes a second or two: CHATBOT waits with </w:t>
+      </w:r>
+      <w:r>
+        <w:rPr>
+          <w:rFonts w:ascii="Courier New" w:cs="Courier New" w:eastAsia="Courier New" w:hAnsi="Courier New"/>
+          <w:sz w:val="19"/>
+          <w:szCs w:val="19"/>
+        </w:rPr>
+        <w:t xml:space="preserve">WAKEUP (RDR</w:t>
+      </w:r>
+      <w:r>
+        <w:rPr>
+          <w:rFonts w:ascii="Times New Roman" w:cs="Times New Roman" w:eastAsia="Times New Roman" w:hAnsi="Times New Roman"/>
+        </w:rPr>
+        <w:t xml:space="preserve">, which returns as soon as a file arrives in its reader, and looks for a stop request every 30 seconds (INTERVAL in CHATBOT CONFIG). </w:t>
       </w:r>
       <w:r>
         <w:rPr>
@@ -16557,7 +16600,7 @@
         <w:pStyle w:val="Heading2"/>
       </w:pPr>
       <w:r>
-        <w:t xml:space="preserve">LINUX EXEC</w:t>
+        <w:t xml:space="preserve">WAKEUP</w:t>
       </w:r>
     </w:p>
     <w:tbl>
@@ -16600,7 +16643,7 @@
                 <w:sz w:val="17"/>
                 <w:szCs w:val="17"/>
               </w:rPr>
-              <w:t xml:space="preserve">LINUX [DISK|READER]</w:t>
+              <w:t xml:space="preserve">WAKEUP [+hhmmss|+mmss|+ss] [(RDR QUIET]</w:t>
             </w:r>
           </w:p>
         </w:tc>
@@ -16619,6 +16662,257 @@
           <w:szCs w:val="18"/>
         </w:rPr>
         <w:t xml:space="preserve">Figure 34. </w:t>
+      </w:r>
+      <w:r>
+        <w:rPr>
+          <w:rFonts w:ascii="Arial" w:cs="Arial" w:eastAsia="Arial" w:hAnsi="Arial"/>
+          <w:sz w:val="18"/>
+          <w:szCs w:val="18"/>
+        </w:rPr>
+        <w:t xml:space="preserve">WAKEUP</w:t>
+      </w:r>
+    </w:p>
+    <w:p>
+      <w:pPr>
+        <w:spacing w:after="120"/>
+      </w:pPr>
+      <w:r>
+        <w:rPr>
+          <w:rFonts w:ascii="Times New Roman" w:cs="Times New Roman" w:eastAsia="Times New Roman" w:hAnsi="Times New Roman"/>
+        </w:rPr>
+        <w:t xml:space="preserve">On MAINT 19D (new; VM/370 had none). Waits until the interval has passed (return code 2) or, with </w:t>
+      </w:r>
+      <w:r>
+        <w:rPr>
+          <w:rFonts w:ascii="Times New Roman" w:cs="Times New Roman" w:eastAsia="Times New Roman" w:hAnsi="Times New Roman"/>
+          <w:b/>
+          <w:bCs/>
+        </w:rPr>
+        <w:t xml:space="preserve">RDR</w:t>
+      </w:r>
+      <w:r>
+        <w:rPr>
+          <w:rFonts w:ascii="Times New Roman" w:cs="Times New Roman" w:eastAsia="Times New Roman" w:hAnsi="Times New Roman"/>
+        </w:rPr>
+        <w:t xml:space="preserve">, until a file arrives in the virtual reader (return code 3); 24 means an invalid operand. A file already in the reader does not end the wait, so look at the reader first (</w:t>
+      </w:r>
+      <w:r>
+        <w:rPr>
+          <w:rFonts w:ascii="Courier New" w:cs="Courier New" w:eastAsia="Courier New" w:hAnsi="Courier New"/>
+          <w:sz w:val="19"/>
+          <w:szCs w:val="19"/>
+        </w:rPr>
+        <w:t xml:space="preserve">QUERY READER</w:t>
+      </w:r>
+      <w:r>
+        <w:rPr>
+          <w:rFonts w:ascii="Times New Roman" w:cs="Times New Roman" w:eastAsia="Times New Roman" w:hAnsi="Times New Roman"/>
+        </w:rPr>
+        <w:t xml:space="preserve">). WAKEUP sets </w:t>
+      </w:r>
+      <w:r>
+        <w:rPr>
+          <w:rFonts w:ascii="Courier New" w:cs="Courier New" w:eastAsia="Courier New" w:hAnsi="Courier New"/>
+          <w:sz w:val="19"/>
+          <w:szCs w:val="19"/>
+        </w:rPr>
+        <w:t xml:space="preserve">CP SET TIMER REAL</w:t>
+      </w:r>
+      <w:r>
+        <w:rPr>
+          <w:rFonts w:ascii="Times New Roman" w:cs="Times New Roman" w:eastAsia="Times New Roman" w:hAnsi="Times New Roman"/>
+        </w:rPr>
+        <w:t xml:space="preserve"> so that the interval timer runs while the machine waits. Service machines use it instead of polling.</w:t>
+      </w:r>
+    </w:p>
+    <w:tbl>
+      <w:tblPr>
+        <w:tblW w:type="dxa" w:w="9638"/>
+        <w:tblBorders>
+          <w:top w:val="single" w:color="auto" w:sz="4"/>
+          <w:left w:val="single" w:color="auto" w:sz="4"/>
+          <w:bottom w:val="single" w:color="auto" w:sz="4"/>
+          <w:right w:val="single" w:color="auto" w:sz="4"/>
+          <w:insideH w:val="single" w:color="auto" w:sz="4"/>
+          <w:insideV w:val="single" w:color="auto" w:sz="4"/>
+        </w:tblBorders>
+      </w:tblPr>
+      <w:tblGrid>
+        <w:gridCol w:w="9638"/>
+      </w:tblGrid>
+      <w:tr>
+        <w:trPr>
+          <w:cantSplit/>
+        </w:trPr>
+        <w:tc>
+          <w:tcPr>
+            <w:tcW w:type="dxa" w:w="9638"/>
+            <w:shd w:fill="F2F2F2" w:color="auto" w:val="clear"/>
+            <w:tcMar>
+              <w:top w:type="dxa" w:w="100"/>
+              <w:left w:type="dxa" w:w="140"/>
+              <w:bottom w:type="dxa" w:w="100"/>
+              <w:right w:type="dxa" w:w="140"/>
+            </w:tcMar>
+          </w:tcPr>
+          <w:p>
+            <w:pPr>
+              <w:spacing w:after="0" w:line="228"/>
+            </w:pPr>
+            <w:r>
+              <w:rPr>
+                <w:rFonts w:ascii="Courier New" w:cs="Courier New" w:eastAsia="Courier New" w:hAnsi="Courier New"/>
+                <w:sz w:val="17"/>
+                <w:szCs w:val="17"/>
+              </w:rPr>
+              <w:t xml:space="preserve">wakeup +000005</w:t>
+            </w:r>
+          </w:p>
+          <w:p>
+            <w:pPr>
+              <w:spacing w:after="0" w:line="228"/>
+            </w:pPr>
+            <w:r>
+              <w:rPr>
+                <w:rFonts w:ascii="Courier New" w:cs="Courier New" w:eastAsia="Courier New" w:hAnsi="Courier New"/>
+                <w:sz w:val="17"/>
+                <w:szCs w:val="17"/>
+              </w:rPr>
+              <w:t xml:space="preserve">Ready(00002);</w:t>
+            </w:r>
+          </w:p>
+          <w:p>
+            <w:pPr>
+              <w:spacing w:after="0" w:line="228"/>
+            </w:pPr>
+            <w:r>
+              <w:rPr>
+                <w:rFonts w:ascii="Courier New" w:cs="Courier New" w:eastAsia="Courier New" w:hAnsi="Courier New"/>
+                <w:sz w:val="17"/>
+                <w:szCs w:val="17"/>
+              </w:rPr>
+              <w:t xml:space="preserve">wakeup +000500 (rdr</w:t>
+            </w:r>
+          </w:p>
+          <w:p>
+            <w:pPr>
+              <w:spacing w:after="0" w:line="228"/>
+            </w:pPr>
+            <w:r>
+              <w:rPr>
+                <w:rFonts w:ascii="Courier New" w:cs="Courier New" w:eastAsia="Courier New" w:hAnsi="Courier New"/>
+                <w:sz w:val="17"/>
+                <w:szCs w:val="17"/>
+              </w:rPr>
+              <w:t xml:space="preserve">PUN FILE 0002 FROM CMSUSER  COPY 01 NOHOLD</w:t>
+            </w:r>
+          </w:p>
+          <w:p>
+            <w:pPr>
+              <w:spacing w:after="0" w:line="228"/>
+            </w:pPr>
+            <w:r>
+              <w:rPr>
+                <w:rFonts w:ascii="Courier New" w:cs="Courier New" w:eastAsia="Courier New" w:hAnsi="Courier New"/>
+                <w:sz w:val="17"/>
+                <w:szCs w:val="17"/>
+              </w:rPr>
+              <w:t xml:space="preserve">Ready(00003);</w:t>
+            </w:r>
+          </w:p>
+        </w:tc>
+      </w:tr>
+    </w:tbl>
+    <w:p>
+      <w:pPr>
+        <w:spacing w:after="200" w:before="80"/>
+      </w:pPr>
+      <w:r>
+        <w:rPr>
+          <w:rFonts w:ascii="Arial" w:cs="Arial" w:eastAsia="Arial" w:hAnsi="Arial"/>
+          <w:b/>
+          <w:bCs/>
+          <w:sz w:val="18"/>
+          <w:szCs w:val="18"/>
+        </w:rPr>
+        <w:t xml:space="preserve">Figure 35. </w:t>
+      </w:r>
+      <w:r>
+        <w:rPr>
+          <w:rFonts w:ascii="Arial" w:cs="Arial" w:eastAsia="Arial" w:hAnsi="Arial"/>
+          <w:sz w:val="18"/>
+          <w:szCs w:val="18"/>
+        </w:rPr>
+        <w:t xml:space="preserve">WAKEUP</w:t>
+      </w:r>
+    </w:p>
+    <w:p>
+      <w:pPr>
+        <w:pStyle w:val="Heading2"/>
+      </w:pPr>
+      <w:r>
+        <w:t xml:space="preserve">LINUX EXEC</w:t>
+      </w:r>
+    </w:p>
+    <w:tbl>
+      <w:tblPr>
+        <w:tblW w:type="dxa" w:w="9638"/>
+        <w:tblBorders>
+          <w:top w:val="single" w:color="auto" w:sz="4"/>
+          <w:left w:val="single" w:color="auto" w:sz="4"/>
+          <w:bottom w:val="single" w:color="auto" w:sz="4"/>
+          <w:right w:val="single" w:color="auto" w:sz="4"/>
+          <w:insideH w:val="single" w:color="auto" w:sz="4"/>
+          <w:insideV w:val="single" w:color="auto" w:sz="4"/>
+        </w:tblBorders>
+      </w:tblPr>
+      <w:tblGrid>
+        <w:gridCol w:w="9638"/>
+      </w:tblGrid>
+      <w:tr>
+        <w:trPr>
+          <w:cantSplit/>
+        </w:trPr>
+        <w:tc>
+          <w:tcPr>
+            <w:tcW w:type="dxa" w:w="9638"/>
+            <w:shd w:fill="F2F2F2" w:color="auto" w:val="clear"/>
+            <w:tcMar>
+              <w:top w:type="dxa" w:w="100"/>
+              <w:left w:type="dxa" w:w="140"/>
+              <w:bottom w:type="dxa" w:w="100"/>
+              <w:right w:type="dxa" w:w="140"/>
+            </w:tcMar>
+          </w:tcPr>
+          <w:p>
+            <w:pPr>
+              <w:spacing w:after="0" w:line="228"/>
+            </w:pPr>
+            <w:r>
+              <w:rPr>
+                <w:rFonts w:ascii="Courier New" w:cs="Courier New" w:eastAsia="Courier New" w:hAnsi="Courier New"/>
+                <w:sz w:val="17"/>
+                <w:szCs w:val="17"/>
+              </w:rPr>
+              <w:t xml:space="preserve">LINUX [DISK|READER]</w:t>
+            </w:r>
+          </w:p>
+        </w:tc>
+      </w:tr>
+    </w:tbl>
+    <w:p>
+      <w:pPr>
+        <w:spacing w:after="200" w:before="80"/>
+      </w:pPr>
+      <w:r>
+        <w:rPr>
+          <w:rFonts w:ascii="Arial" w:cs="Arial" w:eastAsia="Arial" w:hAnsi="Arial"/>
+          <w:b/>
+          <w:bCs/>
+          <w:sz w:val="18"/>
+          <w:szCs w:val="18"/>
+        </w:rPr>
+        <w:t xml:space="preserve">Figure 36. </w:t>
       </w:r>
       <w:r>
         <w:rPr>
@@ -17278,7 +17572,7 @@
           <w:sz w:val="18"/>
           <w:szCs w:val="18"/>
         </w:rPr>
-        <w:t xml:space="preserve">Figure 35. </w:t>
+        <w:t xml:space="preserve">Figure 37. </w:t>
       </w:r>
       <w:r>
         <w:rPr>

</xml_diff>

<commit_message>
GLOBALV: global variables as in z/VM CMS (a nucleus extension loaded at IPL), SESSION/LASTING GLOBALV files, EXECCOMM GET/PUT; FULIST takes its editor from GLOBALV
Installed: GLOBALV TEXT and SYSPROFX EXEC on 19E (mode 2), FULIST EXEC on 19D.
Verified gv1/gv5 (IPL CMS: SET, GET, PUTS, SETL kept across IPL, STACK, LIST,
PURGE, GRPLIST, rc 24) and under IPL 290 from the 3270 (mixed-case values).

Co-Authored-By: Claude Opus 5.5 <noreply@anthropic.com>
Claude-Session: https://claude.ai/code/session_01JBNU8KnKzXkgscse8vw6so
</commit_message>
<xml_diff>
--- a/arch/31bit/manual/VM370PLUS-Guide.docx
+++ b/arch/31bit/manual/VM370PLUS-Guide.docx
@@ -1571,7 +1571,7 @@
           <w:sz w:val="20"/>
           <w:szCs w:val="20"/>
         </w:rPr>
-        <w:t xml:space="preserve">LINUX EXEC</w:t>
+        <w:t xml:space="preserve">GLOBALV</w:t>
       </w:r>
       <w:r>
         <w:rPr>
@@ -1581,7 +1581,36 @@
           <w:sz w:val="20"/>
           <w:szCs w:val="20"/>
         </w:rPr>
-        <w:t xml:space="preserve">	21</w:t>
+        <w:t xml:space="preserve">	22</w:t>
+      </w:r>
+    </w:p>
+    <w:p>
+      <w:pPr>
+        <w:tabs>
+          <w:tab w:val="right" w:pos="9638" w:leader="dot"/>
+        </w:tabs>
+        <w:spacing w:after="20" w:before="20"/>
+        <w:ind w:left="400"/>
+      </w:pPr>
+      <w:r>
+        <w:rPr>
+          <w:rFonts w:ascii="Times New Roman" w:cs="Times New Roman" w:eastAsia="Times New Roman" w:hAnsi="Times New Roman"/>
+          <w:b w:val="false"/>
+          <w:bCs w:val="false"/>
+          <w:sz w:val="20"/>
+          <w:szCs w:val="20"/>
+        </w:rPr>
+        <w:t xml:space="preserve">LINUX EXEC</w:t>
+      </w:r>
+      <w:r>
+        <w:rPr>
+          <w:rFonts w:ascii="Times New Roman" w:cs="Times New Roman" w:eastAsia="Times New Roman" w:hAnsi="Times New Roman"/>
+          <w:b w:val="false"/>
+          <w:bCs w:val="false"/>
+          <w:sz w:val="20"/>
+          <w:szCs w:val="20"/>
+        </w:rPr>
+        <w:t xml:space="preserve">	22</w:t>
       </w:r>
     </w:p>
     <w:p>
@@ -2086,6 +2115,30 @@
           <w:rFonts w:ascii="Times New Roman" w:cs="Times New Roman" w:eastAsia="Times New Roman" w:hAnsi="Times New Roman"/>
         </w:rPr>
         <w:t xml:space="preserve">This edition is kept up to date as VM/370plus grows; each change is listed here, newest first.</w:t>
+      </w:r>
+    </w:p>
+    <w:p>
+      <w:pPr>
+        <w:pStyle w:val="ListParagraph"/>
+        <w:numPr>
+          <w:ilvl w:val="0"/>
+          <w:numId w:val="2"/>
+        </w:numPr>
+        <w:spacing w:after="60"/>
+      </w:pPr>
+      <w:r>
+        <w:rPr>
+          <w:rFonts w:ascii="Times New Roman" w:cs="Times New Roman" w:eastAsia="Times New Roman" w:hAnsi="Times New Roman"/>
+          <w:b/>
+          <w:bCs/>
+        </w:rPr>
+        <w:t xml:space="preserve">11 October 2026.</w:t>
+      </w:r>
+      <w:r>
+        <w:rPr>
+          <w:rFonts w:ascii="Times New Roman" w:cs="Times New Roman" w:eastAsia="Times New Roman" w:hAnsi="Times New Roman"/>
+        </w:rPr>
+        <w:t xml:space="preserve"> GLOBALV.</w:t>
       </w:r>
     </w:p>
     <w:p>
@@ -5590,7 +5643,21 @@
         <w:rPr>
           <w:rFonts w:ascii="Times New Roman" w:cs="Times New Roman" w:eastAsia="Times New Roman" w:hAnsi="Times New Roman"/>
         </w:rPr>
-        <w:t xml:space="preserve">. Appendix A; Appendix D lists all CP and CMS commands.</w:t>
+        <w:t xml:space="preserve">. </w:t>
+      </w:r>
+      <w:r>
+        <w:rPr>
+          <w:rFonts w:ascii="Courier New" w:cs="Courier New" w:eastAsia="Courier New" w:hAnsi="Courier New"/>
+          <w:sz w:val="19"/>
+          <w:szCs w:val="19"/>
+        </w:rPr>
+        <w:t xml:space="preserve">GLOBALV</w:t>
+      </w:r>
+      <w:r>
+        <w:rPr>
+          <w:rFonts w:ascii="Times New Roman" w:cs="Times New Roman" w:eastAsia="Times New Roman" w:hAnsi="Times New Roman"/>
+        </w:rPr>
+        <w:t xml:space="preserve">, global variables as in z/VM, is loaded at IPL. Appendix A; Appendix D lists all CP and CMS commands.</w:t>
       </w:r>
     </w:p>
     <w:p>
@@ -18437,7 +18504,7 @@
         <w:pStyle w:val="Heading2"/>
       </w:pPr>
       <w:r>
-        <w:t xml:space="preserve">LINUX EXEC</w:t>
+        <w:t xml:space="preserve">GLOBALV</w:t>
       </w:r>
     </w:p>
     <w:tbl>
@@ -18480,7 +18547,59 @@
                 <w:sz w:val="17"/>
                 <w:szCs w:val="17"/>
               </w:rPr>
-              <w:t xml:space="preserve">LINUX [DISK|READER]</w:t>
+              <w:t xml:space="preserve">GLOBALV [SELECT group] SET|SETS|SETL|SETP name value</w:t>
+            </w:r>
+          </w:p>
+          <w:p>
+            <w:pPr>
+              <w:spacing w:after="0" w:line="228"/>
+            </w:pPr>
+            <w:r>
+              <w:rPr>
+                <w:rFonts w:ascii="Courier New" w:cs="Courier New" w:eastAsia="Courier New" w:hAnsi="Courier New"/>
+                <w:sz w:val="17"/>
+                <w:szCs w:val="17"/>
+              </w:rPr>
+              <w:t xml:space="preserve">GLOBALV [SELECT group] PUT|PUTS|PUTL|PUTP name ...</w:t>
+            </w:r>
+          </w:p>
+          <w:p>
+            <w:pPr>
+              <w:spacing w:after="0" w:line="228"/>
+            </w:pPr>
+            <w:r>
+              <w:rPr>
+                <w:rFonts w:ascii="Courier New" w:cs="Courier New" w:eastAsia="Courier New" w:hAnsi="Courier New"/>
+                <w:sz w:val="17"/>
+                <w:szCs w:val="17"/>
+              </w:rPr>
+              <w:t xml:space="preserve">GLOBALV [SELECT group] GET|STACK name ...</w:t>
+            </w:r>
+          </w:p>
+          <w:p>
+            <w:pPr>
+              <w:spacing w:after="0" w:line="228"/>
+            </w:pPr>
+            <w:r>
+              <w:rPr>
+                <w:rFonts w:ascii="Courier New" w:cs="Courier New" w:eastAsia="Courier New" w:hAnsi="Courier New"/>
+                <w:sz w:val="17"/>
+                <w:szCs w:val="17"/>
+              </w:rPr>
+              <w:t xml:space="preserve">GLOBALV [SELECT group] LIST [name ...]|PURGE</w:t>
+            </w:r>
+          </w:p>
+          <w:p>
+            <w:pPr>
+              <w:spacing w:after="0" w:line="228"/>
+            </w:pPr>
+            <w:r>
+              <w:rPr>
+                <w:rFonts w:ascii="Courier New" w:cs="Courier New" w:eastAsia="Courier New" w:hAnsi="Courier New"/>
+                <w:sz w:val="17"/>
+                <w:szCs w:val="17"/>
+              </w:rPr>
+              <w:t xml:space="preserve">GLOBALV GRPLIST</w:t>
             </w:r>
           </w:p>
         </w:tc>
@@ -18499,6 +18618,354 @@
           <w:szCs w:val="18"/>
         </w:rPr>
         <w:t xml:space="preserve">Figure 40. </w:t>
+      </w:r>
+      <w:r>
+        <w:rPr>
+          <w:rFonts w:ascii="Arial" w:cs="Arial" w:eastAsia="Arial" w:hAnsi="Arial"/>
+          <w:sz w:val="18"/>
+          <w:szCs w:val="18"/>
+        </w:rPr>
+        <w:t xml:space="preserve">GLOBALV</w:t>
+      </w:r>
+    </w:p>
+    <w:p>
+      <w:pPr>
+        <w:spacing w:after="120"/>
+      </w:pPr>
+      <w:r>
+        <w:rPr>
+          <w:rFonts w:ascii="Times New Roman" w:cs="Times New Roman" w:eastAsia="Times New Roman" w:hAnsi="Times New Roman"/>
+        </w:rPr>
+        <w:t xml:space="preserve">New; a subset of z/VM’s GLOBALV. Variables live in groups (UNNAMED unless SELECT names one). </w:t>
+      </w:r>
+      <w:r>
+        <w:rPr>
+          <w:rFonts w:ascii="Times New Roman" w:cs="Times New Roman" w:eastAsia="Times New Roman" w:hAnsi="Times New Roman"/>
+          <w:b/>
+          <w:bCs/>
+        </w:rPr>
+        <w:t xml:space="preserve">SET</w:t>
+      </w:r>
+      <w:r>
+        <w:rPr>
+          <w:rFonts w:ascii="Times New Roman" w:cs="Times New Roman" w:eastAsia="Times New Roman" w:hAnsi="Times New Roman"/>
+        </w:rPr>
+        <w:t xml:space="preserve"> keeps a value until the next IPL of CMS, </w:t>
+      </w:r>
+      <w:r>
+        <w:rPr>
+          <w:rFonts w:ascii="Times New Roman" w:cs="Times New Roman" w:eastAsia="Times New Roman" w:hAnsi="Times New Roman"/>
+          <w:b/>
+          <w:bCs/>
+        </w:rPr>
+        <w:t xml:space="preserve">SETS</w:t>
+      </w:r>
+      <w:r>
+        <w:rPr>
+          <w:rFonts w:ascii="Times New Roman" w:cs="Times New Roman" w:eastAsia="Times New Roman" w:hAnsi="Times New Roman"/>
+        </w:rPr>
+        <w:t xml:space="preserve"> also in </w:t>
+      </w:r>
+      <w:r>
+        <w:rPr>
+          <w:rFonts w:ascii="Courier New" w:cs="Courier New" w:eastAsia="Courier New" w:hAnsi="Courier New"/>
+          <w:sz w:val="19"/>
+          <w:szCs w:val="19"/>
+        </w:rPr>
+        <w:t xml:space="preserve">SESSION GLOBALV A</w:t>
+      </w:r>
+      <w:r>
+        <w:rPr>
+          <w:rFonts w:ascii="Times New Roman" w:cs="Times New Roman" w:eastAsia="Times New Roman" w:hAnsi="Times New Roman"/>
+        </w:rPr>
+        <w:t xml:space="preserve"> (erased at the next IPL), </w:t>
+      </w:r>
+      <w:r>
+        <w:rPr>
+          <w:rFonts w:ascii="Times New Roman" w:cs="Times New Roman" w:eastAsia="Times New Roman" w:hAnsi="Times New Roman"/>
+          <w:b/>
+          <w:bCs/>
+        </w:rPr>
+        <w:t xml:space="preserve">SETL</w:t>
+      </w:r>
+      <w:r>
+        <w:rPr>
+          <w:rFonts w:ascii="Times New Roman" w:cs="Times New Roman" w:eastAsia="Times New Roman" w:hAnsi="Times New Roman"/>
+        </w:rPr>
+        <w:t xml:space="preserve"> in </w:t>
+      </w:r>
+      <w:r>
+        <w:rPr>
+          <w:rFonts w:ascii="Courier New" w:cs="Courier New" w:eastAsia="Courier New" w:hAnsi="Courier New"/>
+          <w:sz w:val="19"/>
+          <w:szCs w:val="19"/>
+        </w:rPr>
+        <w:t xml:space="preserve">LASTING GLOBALV A</w:t>
+      </w:r>
+      <w:r>
+        <w:rPr>
+          <w:rFonts w:ascii="Times New Roman" w:cs="Times New Roman" w:eastAsia="Times New Roman" w:hAnsi="Times New Roman"/>
+        </w:rPr>
+        <w:t xml:space="preserve"> (read again at every IPL), </w:t>
+      </w:r>
+      <w:r>
+        <w:rPr>
+          <w:rFonts w:ascii="Times New Roman" w:cs="Times New Roman" w:eastAsia="Times New Roman" w:hAnsi="Times New Roman"/>
+          <w:b/>
+          <w:bCs/>
+        </w:rPr>
+        <w:t xml:space="preserve">SETP</w:t>
+      </w:r>
+      <w:r>
+        <w:rPr>
+          <w:rFonts w:ascii="Times New Roman" w:cs="Times New Roman" w:eastAsia="Times New Roman" w:hAnsi="Times New Roman"/>
+        </w:rPr>
+        <w:t xml:space="preserve"> both. </w:t>
+      </w:r>
+      <w:r>
+        <w:rPr>
+          <w:rFonts w:ascii="Times New Roman" w:cs="Times New Roman" w:eastAsia="Times New Roman" w:hAnsi="Times New Roman"/>
+          <w:b/>
+          <w:bCs/>
+        </w:rPr>
+        <w:t xml:space="preserve">PUT</w:t>
+      </w:r>
+      <w:r>
+        <w:rPr>
+          <w:rFonts w:ascii="Times New Roman" w:cs="Times New Roman" w:eastAsia="Times New Roman" w:hAnsi="Times New Roman"/>
+        </w:rPr>
+        <w:t xml:space="preserve"> takes the values of the calling EXEC’s REXX variables, </w:t>
+      </w:r>
+      <w:r>
+        <w:rPr>
+          <w:rFonts w:ascii="Times New Roman" w:cs="Times New Roman" w:eastAsia="Times New Roman" w:hAnsi="Times New Roman"/>
+          <w:b/>
+          <w:bCs/>
+        </w:rPr>
+        <w:t xml:space="preserve">GET</w:t>
+      </w:r>
+      <w:r>
+        <w:rPr>
+          <w:rFonts w:ascii="Times New Roman" w:cs="Times New Roman" w:eastAsia="Times New Roman" w:hAnsi="Times New Roman"/>
+        </w:rPr>
+        <w:t xml:space="preserve"> sets them, </w:t>
+      </w:r>
+      <w:r>
+        <w:rPr>
+          <w:rFonts w:ascii="Times New Roman" w:cs="Times New Roman" w:eastAsia="Times New Roman" w:hAnsi="Times New Roman"/>
+          <w:b/>
+          <w:bCs/>
+        </w:rPr>
+        <w:t xml:space="preserve">STACK</w:t>
+      </w:r>
+      <w:r>
+        <w:rPr>
+          <w:rFonts w:ascii="Times New Roman" w:cs="Times New Roman" w:eastAsia="Times New Roman" w:hAnsi="Times New Roman"/>
+        </w:rPr>
+        <w:t xml:space="preserve"> puts values on the console stack. A null value drops a variable. Names up to 32 characters, values up to 255, 128 variables. GLOBALV is a nucleus extension, loaded at IPL by the system profile.</w:t>
+      </w:r>
+    </w:p>
+    <w:tbl>
+      <w:tblPr>
+        <w:tblW w:type="dxa" w:w="9638"/>
+        <w:tblBorders>
+          <w:top w:val="single" w:color="auto" w:sz="4"/>
+          <w:left w:val="single" w:color="auto" w:sz="4"/>
+          <w:bottom w:val="single" w:color="auto" w:sz="4"/>
+          <w:right w:val="single" w:color="auto" w:sz="4"/>
+          <w:insideH w:val="single" w:color="auto" w:sz="4"/>
+          <w:insideV w:val="single" w:color="auto" w:sz="4"/>
+        </w:tblBorders>
+      </w:tblPr>
+      <w:tblGrid>
+        <w:gridCol w:w="9638"/>
+      </w:tblGrid>
+      <w:tr>
+        <w:trPr>
+          <w:cantSplit/>
+        </w:trPr>
+        <w:tc>
+          <w:tcPr>
+            <w:tcW w:type="dxa" w:w="9638"/>
+            <w:shd w:fill="F2F2F2" w:color="auto" w:val="clear"/>
+            <w:tcMar>
+              <w:top w:type="dxa" w:w="100"/>
+              <w:left w:type="dxa" w:w="140"/>
+              <w:bottom w:type="dxa" w:w="100"/>
+              <w:right w:type="dxa" w:w="140"/>
+            </w:tcMar>
+          </w:tcPr>
+          <w:p>
+            <w:pPr>
+              <w:spacing w:after="0" w:line="228"/>
+            </w:pPr>
+            <w:r>
+              <w:rPr>
+                <w:rFonts w:ascii="Courier New" w:cs="Courier New" w:eastAsia="Courier New" w:hAnsi="Courier New"/>
+                <w:sz w:val="17"/>
+                <w:szCs w:val="17"/>
+              </w:rPr>
+              <w:t xml:space="preserve">globalv select fulist setl editor EE</w:t>
+            </w:r>
+          </w:p>
+          <w:p>
+            <w:pPr>
+              <w:spacing w:after="0" w:line="228"/>
+            </w:pPr>
+            <w:r>
+              <w:rPr>
+                <w:rFonts w:ascii="Courier New" w:cs="Courier New" w:eastAsia="Courier New" w:hAnsi="Courier New"/>
+                <w:sz w:val="17"/>
+                <w:szCs w:val="17"/>
+              </w:rPr>
+              <w:t xml:space="preserve">globalv select fulist list</w:t>
+            </w:r>
+          </w:p>
+          <w:p>
+            <w:pPr>
+              <w:spacing w:after="0" w:line="228"/>
+            </w:pPr>
+            <w:r>
+              <w:rPr>
+                <w:rFonts w:ascii="Courier New" w:cs="Courier New" w:eastAsia="Courier New" w:hAnsi="Courier New"/>
+                <w:sz w:val="17"/>
+                <w:szCs w:val="17"/>
+              </w:rPr>
+              <w:t xml:space="preserve">FULIST   EDITOR = EE</w:t>
+            </w:r>
+          </w:p>
+        </w:tc>
+      </w:tr>
+    </w:tbl>
+    <w:p>
+      <w:pPr>
+        <w:spacing w:after="200" w:before="80"/>
+      </w:pPr>
+      <w:r>
+        <w:rPr>
+          <w:rFonts w:ascii="Arial" w:cs="Arial" w:eastAsia="Arial" w:hAnsi="Arial"/>
+          <w:b/>
+          <w:bCs/>
+          <w:sz w:val="18"/>
+          <w:szCs w:val="18"/>
+        </w:rPr>
+        <w:t xml:space="preserve">Figure 41. </w:t>
+      </w:r>
+      <w:r>
+        <w:rPr>
+          <w:rFonts w:ascii="Arial" w:cs="Arial" w:eastAsia="Arial" w:hAnsi="Arial"/>
+          <w:sz w:val="18"/>
+          <w:szCs w:val="18"/>
+        </w:rPr>
+        <w:t xml:space="preserve">GLOBALV</w:t>
+      </w:r>
+    </w:p>
+    <w:p>
+      <w:pPr>
+        <w:spacing w:after="120"/>
+      </w:pPr>
+      <w:r>
+        <w:rPr>
+          <w:rFonts w:ascii="Times New Roman" w:cs="Times New Roman" w:eastAsia="Times New Roman" w:hAnsi="Times New Roman"/>
+        </w:rPr>
+        <w:t xml:space="preserve">FULIST takes its editor and browser from the group FULIST (</w:t>
+      </w:r>
+      <w:r>
+        <w:rPr>
+          <w:rFonts w:ascii="Courier New" w:cs="Courier New" w:eastAsia="Courier New" w:hAnsi="Courier New"/>
+          <w:sz w:val="19"/>
+          <w:szCs w:val="19"/>
+        </w:rPr>
+        <w:t xml:space="preserve">EDITOR</w:t>
+      </w:r>
+      <w:r>
+        <w:rPr>
+          <w:rFonts w:ascii="Times New Roman" w:cs="Times New Roman" w:eastAsia="Times New Roman" w:hAnsi="Times New Roman"/>
+        </w:rPr>
+        <w:t xml:space="preserve">, </w:t>
+      </w:r>
+      <w:r>
+        <w:rPr>
+          <w:rFonts w:ascii="Courier New" w:cs="Courier New" w:eastAsia="Courier New" w:hAnsi="Courier New"/>
+          <w:sz w:val="19"/>
+          <w:szCs w:val="19"/>
+        </w:rPr>
+        <w:t xml:space="preserve">BROWSER</w:t>
+      </w:r>
+      <w:r>
+        <w:rPr>
+          <w:rFonts w:ascii="Times New Roman" w:cs="Times New Roman" w:eastAsia="Times New Roman" w:hAnsi="Times New Roman"/>
+        </w:rPr>
+        <w:t xml:space="preserve">) when they are set.</w:t>
+      </w:r>
+    </w:p>
+    <w:p>
+      <w:pPr>
+        <w:pStyle w:val="Heading2"/>
+      </w:pPr>
+      <w:r>
+        <w:t xml:space="preserve">LINUX EXEC</w:t>
+      </w:r>
+    </w:p>
+    <w:tbl>
+      <w:tblPr>
+        <w:tblW w:type="dxa" w:w="9638"/>
+        <w:tblBorders>
+          <w:top w:val="single" w:color="auto" w:sz="4"/>
+          <w:left w:val="single" w:color="auto" w:sz="4"/>
+          <w:bottom w:val="single" w:color="auto" w:sz="4"/>
+          <w:right w:val="single" w:color="auto" w:sz="4"/>
+          <w:insideH w:val="single" w:color="auto" w:sz="4"/>
+          <w:insideV w:val="single" w:color="auto" w:sz="4"/>
+        </w:tblBorders>
+      </w:tblPr>
+      <w:tblGrid>
+        <w:gridCol w:w="9638"/>
+      </w:tblGrid>
+      <w:tr>
+        <w:trPr>
+          <w:cantSplit/>
+        </w:trPr>
+        <w:tc>
+          <w:tcPr>
+            <w:tcW w:type="dxa" w:w="9638"/>
+            <w:shd w:fill="F2F2F2" w:color="auto" w:val="clear"/>
+            <w:tcMar>
+              <w:top w:type="dxa" w:w="100"/>
+              <w:left w:type="dxa" w:w="140"/>
+              <w:bottom w:type="dxa" w:w="100"/>
+              <w:right w:type="dxa" w:w="140"/>
+            </w:tcMar>
+          </w:tcPr>
+          <w:p>
+            <w:pPr>
+              <w:spacing w:after="0" w:line="228"/>
+            </w:pPr>
+            <w:r>
+              <w:rPr>
+                <w:rFonts w:ascii="Courier New" w:cs="Courier New" w:eastAsia="Courier New" w:hAnsi="Courier New"/>
+                <w:sz w:val="17"/>
+                <w:szCs w:val="17"/>
+              </w:rPr>
+              <w:t xml:space="preserve">LINUX [DISK|READER]</w:t>
+            </w:r>
+          </w:p>
+        </w:tc>
+      </w:tr>
+    </w:tbl>
+    <w:p>
+      <w:pPr>
+        <w:spacing w:after="200" w:before="80"/>
+      </w:pPr>
+      <w:r>
+        <w:rPr>
+          <w:rFonts w:ascii="Arial" w:cs="Arial" w:eastAsia="Arial" w:hAnsi="Arial"/>
+          <w:b/>
+          <w:bCs/>
+          <w:sz w:val="18"/>
+          <w:szCs w:val="18"/>
+        </w:rPr>
+        <w:t xml:space="preserve">Figure 42. </w:t>
       </w:r>
       <w:r>
         <w:rPr>
@@ -19158,7 +19625,7 @@
           <w:sz w:val="18"/>
           <w:szCs w:val="18"/>
         </w:rPr>
-        <w:t xml:space="preserve">Figure 41. </w:t>
+        <w:t xml:space="preserve">Figure 43. </w:t>
       </w:r>
       <w:r>
         <w:rPr>
@@ -44706,13 +45173,272 @@
     </w:p>
     <w:p>
       <w:pPr>
+        <w:pStyle w:val="Heading3"/>
+      </w:pPr>
+      <w:r>
+        <w:t xml:space="preserve">Nucleus extensions loaded at IPL</w:t>
+      </w:r>
+    </w:p>
+    <w:p>
+      <w:pPr>
         <w:spacing w:after="120"/>
       </w:pPr>
       <w:r>
         <w:rPr>
           <w:rFonts w:ascii="Times New Roman" w:cs="Times New Roman" w:eastAsia="Times New Roman" w:hAnsi="Times New Roman"/>
         </w:rPr>
-        <w:t xml:space="preserve">CP: DEFINE CPU / NIC / LAN / VSWITCH / MDISK, QUERY FRAMES, QUERY NSS, IUCV. CMS: XEDIT (THE), FILELIST (FULIST), RDRLIST, NOTE / TELL, GLOBALV, PIPE, NUCXLOAD.</w:t>
+        <w:t xml:space="preserve">Loaded by the system profile (SYSPROFX EXEC on 19E) from TEXT files, so they are commands like the nucleus functions, resident until the next IPL of CMS.</w:t>
+      </w:r>
+    </w:p>
+    <w:tbl>
+      <w:tblPr>
+        <w:tblW w:type="dxa" w:w="9638"/>
+        <w:tblBorders>
+          <w:top w:val="single" w:color="808080" w:sz="4"/>
+          <w:left w:val="single" w:color="808080" w:sz="4"/>
+          <w:bottom w:val="single" w:color="808080" w:sz="4"/>
+          <w:right w:val="single" w:color="808080" w:sz="4"/>
+          <w:insideH w:val="single" w:color="808080" w:sz="4"/>
+          <w:insideV w:val="single" w:color="808080" w:sz="4"/>
+        </w:tblBorders>
+      </w:tblPr>
+      <w:tblGrid>
+        <w:gridCol w:w="1900"/>
+        <w:gridCol w:w="7738"/>
+      </w:tblGrid>
+      <w:tr>
+        <w:trPr>
+          <w:cantSplit/>
+          <w:tblHeader/>
+        </w:trPr>
+        <w:tc>
+          <w:tcPr>
+            <w:tcW w:type="dxa" w:w="1900"/>
+            <w:shd w:fill="D9D9D9" w:color="auto" w:val="clear"/>
+            <w:tcMar>
+              <w:top w:type="dxa" w:w="60"/>
+              <w:left w:type="dxa" w:w="100"/>
+              <w:bottom w:type="dxa" w:w="60"/>
+              <w:right w:type="dxa" w:w="100"/>
+            </w:tcMar>
+          </w:tcPr>
+          <w:p>
+            <w:r>
+              <w:rPr>
+                <w:rFonts w:ascii="Arial" w:cs="Arial" w:eastAsia="Arial" w:hAnsi="Arial"/>
+                <w:b/>
+                <w:bCs/>
+                <w:sz w:val="18"/>
+                <w:szCs w:val="18"/>
+              </w:rPr>
+              <w:t xml:space="preserve">Command</w:t>
+            </w:r>
+          </w:p>
+        </w:tc>
+        <w:tc>
+          <w:tcPr>
+            <w:tcW w:type="dxa" w:w="7738"/>
+            <w:shd w:fill="D9D9D9" w:color="auto" w:val="clear"/>
+            <w:tcMar>
+              <w:top w:type="dxa" w:w="60"/>
+              <w:left w:type="dxa" w:w="100"/>
+              <w:bottom w:type="dxa" w:w="60"/>
+              <w:right w:type="dxa" w:w="100"/>
+            </w:tcMar>
+          </w:tcPr>
+          <w:p>
+            <w:r>
+              <w:rPr>
+                <w:rFonts w:ascii="Arial" w:cs="Arial" w:eastAsia="Arial" w:hAnsi="Arial"/>
+                <w:b/>
+                <w:bCs/>
+                <w:sz w:val="18"/>
+                <w:szCs w:val="18"/>
+              </w:rPr>
+              <w:t xml:space="preserve">Function</w:t>
+            </w:r>
+          </w:p>
+        </w:tc>
+      </w:tr>
+      <w:tr>
+        <w:trPr>
+          <w:cantSplit/>
+          <w:tblHeader w:val="false"/>
+        </w:trPr>
+        <w:tc>
+          <w:tcPr>
+            <w:tcW w:type="dxa" w:w="1900"/>
+            <w:tcMar>
+              <w:top w:type="dxa" w:w="60"/>
+              <w:left w:type="dxa" w:w="100"/>
+              <w:bottom w:type="dxa" w:w="60"/>
+              <w:right w:type="dxa" w:w="100"/>
+            </w:tcMar>
+          </w:tcPr>
+          <w:p>
+            <w:r>
+              <w:rPr>
+                <w:rFonts w:ascii="Times New Roman" w:cs="Times New Roman" w:eastAsia="Times New Roman" w:hAnsi="Times New Roman"/>
+                <w:sz w:val="19"/>
+                <w:szCs w:val="19"/>
+              </w:rPr>
+              <w:t xml:space="preserve">GLOBALV</w:t>
+            </w:r>
+          </w:p>
+        </w:tc>
+        <w:tc>
+          <w:tcPr>
+            <w:tcW w:type="dxa" w:w="7738"/>
+            <w:tcMar>
+              <w:top w:type="dxa" w:w="60"/>
+              <w:left w:type="dxa" w:w="100"/>
+              <w:bottom w:type="dxa" w:w="60"/>
+              <w:right w:type="dxa" w:w="100"/>
+            </w:tcMar>
+          </w:tcPr>
+          <w:p>
+            <w:r>
+              <w:rPr>
+                <w:rFonts w:ascii="Times New Roman" w:cs="Times New Roman" w:eastAsia="Times New Roman" w:hAnsi="Times New Roman"/>
+                <w:b/>
+                <w:bCs/>
+                <w:sz w:val="19"/>
+                <w:szCs w:val="19"/>
+              </w:rPr>
+              <w:t xml:space="preserve">+</w:t>
+            </w:r>
+            <w:r>
+              <w:rPr>
+                <w:rFonts w:ascii="Times New Roman" w:cs="Times New Roman" w:eastAsia="Times New Roman" w:hAnsi="Times New Roman"/>
+                <w:sz w:val="19"/>
+                <w:szCs w:val="19"/>
+              </w:rPr>
+              <w:t xml:space="preserve"> global variables, in the manner of z/VM GLOBALV (SET/SETS/SETL/SETP, PUT*, GET, STACK, LIST, PURGE, GRPLIST)</w:t>
+            </w:r>
+          </w:p>
+        </w:tc>
+      </w:tr>
+      <w:tr>
+        <w:trPr>
+          <w:cantSplit/>
+          <w:tblHeader w:val="false"/>
+        </w:trPr>
+        <w:tc>
+          <w:tcPr>
+            <w:tcW w:type="dxa" w:w="1900"/>
+            <w:tcMar>
+              <w:top w:type="dxa" w:w="60"/>
+              <w:left w:type="dxa" w:w="100"/>
+              <w:bottom w:type="dxa" w:w="60"/>
+              <w:right w:type="dxa" w:w="100"/>
+            </w:tcMar>
+          </w:tcPr>
+          <w:p>
+            <w:r>
+              <w:rPr>
+                <w:rFonts w:ascii="Times New Roman" w:cs="Times New Roman" w:eastAsia="Times New Roman" w:hAnsi="Times New Roman"/>
+                <w:sz w:val="19"/>
+                <w:szCs w:val="19"/>
+              </w:rPr>
+              <w:t xml:space="preserve">HIGHSTOR</w:t>
+            </w:r>
+          </w:p>
+        </w:tc>
+        <w:tc>
+          <w:tcPr>
+            <w:tcW w:type="dxa" w:w="7738"/>
+            <w:tcMar>
+              <w:top w:type="dxa" w:w="60"/>
+              <w:left w:type="dxa" w:w="100"/>
+              <w:bottom w:type="dxa" w:w="60"/>
+              <w:right w:type="dxa" w:w="100"/>
+            </w:tcMar>
+          </w:tcPr>
+          <w:p>
+            <w:r>
+              <w:rPr>
+                <w:rFonts w:ascii="Times New Roman" w:cs="Times New Roman" w:eastAsia="Times New Roman" w:hAnsi="Times New Roman"/>
+                <w:b/>
+                <w:bCs/>
+                <w:sz w:val="19"/>
+                <w:szCs w:val="19"/>
+              </w:rPr>
+              <w:t xml:space="preserve">+</w:t>
+            </w:r>
+            <w:r>
+              <w:rPr>
+                <w:rFonts w:ascii="Times New Roman" w:cs="Times New Roman" w:eastAsia="Times New Roman" w:hAnsi="Times New Roman"/>
+                <w:sz w:val="19"/>
+                <w:szCs w:val="19"/>
+              </w:rPr>
+              <w:t xml:space="preserve"> storage above 16 MB for the EC-mode CMS</w:t>
+            </w:r>
+          </w:p>
+        </w:tc>
+      </w:tr>
+      <w:tr>
+        <w:trPr>
+          <w:cantSplit/>
+          <w:tblHeader w:val="false"/>
+        </w:trPr>
+        <w:tc>
+          <w:tcPr>
+            <w:tcW w:type="dxa" w:w="1900"/>
+            <w:tcMar>
+              <w:top w:type="dxa" w:w="60"/>
+              <w:left w:type="dxa" w:w="100"/>
+              <w:bottom w:type="dxa" w:w="60"/>
+              <w:right w:type="dxa" w:w="100"/>
+            </w:tcMar>
+          </w:tcPr>
+          <w:p>
+            <w:r>
+              <w:rPr>
+                <w:rFonts w:ascii="Times New Roman" w:cs="Times New Roman" w:eastAsia="Times New Roman" w:hAnsi="Times New Roman"/>
+                <w:sz w:val="19"/>
+                <w:szCs w:val="19"/>
+              </w:rPr>
+              <w:t xml:space="preserve">GCCLIB</w:t>
+            </w:r>
+          </w:p>
+        </w:tc>
+        <w:tc>
+          <w:tcPr>
+            <w:tcW w:type="dxa" w:w="7738"/>
+            <w:tcMar>
+              <w:top w:type="dxa" w:w="60"/>
+              <w:left w:type="dxa" w:w="100"/>
+              <w:bottom w:type="dxa" w:w="60"/>
+              <w:right w:type="dxa" w:w="100"/>
+            </w:tcMar>
+          </w:tcPr>
+          <w:p>
+            <w:r>
+              <w:rPr>
+                <w:rFonts w:ascii="Times New Roman" w:cs="Times New Roman" w:eastAsia="Times New Roman" w:hAnsi="Times New Roman"/>
+                <w:sz w:val="19"/>
+                <w:szCs w:val="19"/>
+              </w:rPr>
+              <w:t xml:space="preserve">the GCC run-time library (CE)</w:t>
+            </w:r>
+          </w:p>
+        </w:tc>
+      </w:tr>
+    </w:tbl>
+    <w:p>
+      <w:pPr>
+        <w:spacing w:after="120"/>
+      </w:pPr>
+    </w:p>
+    <w:p>
+      <w:pPr>
+        <w:spacing w:after="120"/>
+      </w:pPr>
+      <w:r>
+        <w:rPr>
+          <w:rFonts w:ascii="Times New Roman" w:cs="Times New Roman" w:eastAsia="Times New Roman" w:hAnsi="Times New Roman"/>
+        </w:rPr>
+        <w:t xml:space="preserve">CP: DEFINE CPU / NIC / LAN / VSWITCH / MDISK, QUERY FRAMES, QUERY NSS, IUCV. CMS: XEDIT (THE), RDRLIST, NOTE / TELL, PIPE, NUCXLOAD.</w:t>
       </w:r>
     </w:p>
     <w:sectPr>

</xml_diff>